<commit_message>
remove income based, time base correlation from eda
</commit_message>
<xml_diff>
--- a/reports/FPR/FPR_23015862_NazmulHossain.docx
+++ b/reports/FPR/FPR_23015862_NazmulHossain.docx
@@ -5200,1505 +5200,6 @@
     </w:p>
     <w:p>
       <w:pPr>
-        <w:rPr>
-          <w:rFonts w:ascii="Calibri" w:hAnsi="Calibri" w:eastAsia="Calibri" w:cs="Calibri" w:asciiTheme="minorAscii" w:hAnsiTheme="minorAscii" w:eastAsiaTheme="minorAscii" w:cstheme="minorAscii"/>
-        </w:rPr>
-      </w:pPr>
-    </w:p>
-    <w:p>
-      <w:pPr>
-        <w:pStyle w:val="Heading3"/>
-        <w:spacing w:before="281" w:beforeAutospacing="off" w:after="281" w:afterAutospacing="off"/>
-        <w:rPr>
-          <w:rFonts w:ascii="Calibri" w:hAnsi="Calibri" w:eastAsia="Calibri" w:cs="Calibri" w:asciiTheme="minorAscii" w:hAnsiTheme="minorAscii" w:eastAsiaTheme="minorAscii" w:cstheme="minorAscii"/>
-          <w:b w:val="1"/>
-          <w:bCs w:val="1"/>
-          <w:noProof w:val="0"/>
-          <w:color w:val="auto"/>
-          <w:sz w:val="28"/>
-          <w:szCs w:val="28"/>
-          <w:lang w:val="en-GB"/>
-        </w:rPr>
-      </w:pPr>
-      <w:r>
-        <w:rPr>
-          <w:rFonts w:ascii="Calibri" w:hAnsi="Calibri" w:eastAsia="Calibri" w:cs="Calibri" w:asciiTheme="minorAscii" w:hAnsiTheme="minorAscii" w:eastAsiaTheme="minorAscii" w:cstheme="minorAscii"/>
-          <w:b w:val="1"/>
-          <w:bCs w:val="1"/>
-          <w:noProof w:val="0"/>
-          <w:color w:val="auto"/>
-          <w:sz w:val="28"/>
-          <w:szCs w:val="28"/>
-          <w:lang w:val="en-GB"/>
-        </w:rPr>
-        <w:t>Visualizing Country Distribution by Income Levels</w:t>
-      </w:r>
-    </w:p>
-    <w:p>
-      <w:pPr>
-        <w:spacing w:before="240" w:beforeAutospacing="off" w:after="240" w:afterAutospacing="off"/>
-        <w:rPr>
-          <w:rFonts w:ascii="Calibri" w:hAnsi="Calibri" w:eastAsia="Calibri" w:cs="Calibri" w:asciiTheme="minorAscii" w:hAnsiTheme="minorAscii" w:eastAsiaTheme="minorAscii" w:cstheme="minorAscii"/>
-          <w:noProof w:val="0"/>
-          <w:sz w:val="24"/>
-          <w:szCs w:val="24"/>
-          <w:lang w:val="en-GB"/>
-        </w:rPr>
-      </w:pPr>
-      <w:r>
-        <w:rPr>
-          <w:rFonts w:ascii="Calibri" w:hAnsi="Calibri" w:eastAsia="Calibri" w:cs="Calibri" w:asciiTheme="minorAscii" w:hAnsiTheme="minorAscii" w:eastAsiaTheme="minorAscii" w:cstheme="minorAscii"/>
-          <w:noProof w:val="0"/>
-          <w:sz w:val="24"/>
-          <w:szCs w:val="24"/>
-          <w:lang w:val="en-GB"/>
-        </w:rPr>
-        <w:t xml:space="preserve">To begin with, I performed a categorical breakdown of countries by income level using a </w:t>
-      </w:r>
-      <w:r>
-        <w:rPr>
-          <w:rFonts w:ascii="Calibri" w:hAnsi="Calibri" w:eastAsia="Calibri" w:cs="Calibri" w:asciiTheme="minorAscii" w:hAnsiTheme="minorAscii" w:eastAsiaTheme="minorAscii" w:cstheme="minorAscii"/>
-          <w:b w:val="1"/>
-          <w:bCs w:val="1"/>
-          <w:noProof w:val="0"/>
-          <w:sz w:val="24"/>
-          <w:szCs w:val="24"/>
-          <w:lang w:val="en-GB"/>
-        </w:rPr>
-        <w:t>pie chart</w:t>
-      </w:r>
-      <w:r>
-        <w:rPr>
-          <w:rFonts w:ascii="Calibri" w:hAnsi="Calibri" w:eastAsia="Calibri" w:cs="Calibri" w:asciiTheme="minorAscii" w:hAnsiTheme="minorAscii" w:eastAsiaTheme="minorAscii" w:cstheme="minorAscii"/>
-          <w:noProof w:val="0"/>
-          <w:sz w:val="24"/>
-          <w:szCs w:val="24"/>
-          <w:lang w:val="en-GB"/>
-        </w:rPr>
-        <w:t xml:space="preserve">. I created a new </w:t>
-      </w:r>
-      <w:r>
-        <w:rPr>
-          <w:rFonts w:ascii="Calibri" w:hAnsi="Calibri" w:eastAsia="Calibri" w:cs="Calibri" w:asciiTheme="minorAscii" w:hAnsiTheme="minorAscii" w:eastAsiaTheme="minorAscii" w:cstheme="minorAscii"/>
-          <w:noProof w:val="0"/>
-          <w:sz w:val="24"/>
-          <w:szCs w:val="24"/>
-          <w:lang w:val="en-GB"/>
-        </w:rPr>
-        <w:t>dataframe</w:t>
-      </w:r>
-      <w:r>
-        <w:rPr>
-          <w:rFonts w:ascii="Calibri" w:hAnsi="Calibri" w:eastAsia="Calibri" w:cs="Calibri" w:asciiTheme="minorAscii" w:hAnsiTheme="minorAscii" w:eastAsiaTheme="minorAscii" w:cstheme="minorAscii"/>
-          <w:noProof w:val="0"/>
-          <w:sz w:val="24"/>
-          <w:szCs w:val="24"/>
-          <w:lang w:val="en-GB"/>
-        </w:rPr>
-        <w:t xml:space="preserve"> (</w:t>
-      </w:r>
-      <w:r>
-        <w:rPr>
-          <w:rFonts w:ascii="Calibri" w:hAnsi="Calibri" w:eastAsia="Calibri" w:cs="Calibri" w:asciiTheme="minorAscii" w:hAnsiTheme="minorAscii" w:eastAsiaTheme="minorAscii" w:cstheme="minorAscii"/>
-          <w:noProof w:val="0"/>
-          <w:sz w:val="24"/>
-          <w:szCs w:val="24"/>
-          <w:lang w:val="en-GB"/>
-        </w:rPr>
-        <w:t>unique_countries_df</w:t>
-      </w:r>
-      <w:r>
-        <w:rPr>
-          <w:rFonts w:ascii="Calibri" w:hAnsi="Calibri" w:eastAsia="Calibri" w:cs="Calibri" w:asciiTheme="minorAscii" w:hAnsiTheme="minorAscii" w:eastAsiaTheme="minorAscii" w:cstheme="minorAscii"/>
-          <w:noProof w:val="0"/>
-          <w:sz w:val="24"/>
-          <w:szCs w:val="24"/>
-          <w:lang w:val="en-GB"/>
-        </w:rPr>
-        <w:t xml:space="preserve">) by dropping duplicate country names, ensuring each country was represented only once. This allowed me to visualize the </w:t>
-      </w:r>
-      <w:r>
-        <w:rPr>
-          <w:rFonts w:ascii="Calibri" w:hAnsi="Calibri" w:eastAsia="Calibri" w:cs="Calibri" w:asciiTheme="minorAscii" w:hAnsiTheme="minorAscii" w:eastAsiaTheme="minorAscii" w:cstheme="minorAscii"/>
-          <w:b w:val="1"/>
-          <w:bCs w:val="1"/>
-          <w:noProof w:val="0"/>
-          <w:sz w:val="24"/>
-          <w:szCs w:val="24"/>
-          <w:lang w:val="en-GB"/>
-        </w:rPr>
-        <w:t>proportion of countries</w:t>
-      </w:r>
-      <w:r>
-        <w:rPr>
-          <w:rFonts w:ascii="Calibri" w:hAnsi="Calibri" w:eastAsia="Calibri" w:cs="Calibri" w:asciiTheme="minorAscii" w:hAnsiTheme="minorAscii" w:eastAsiaTheme="minorAscii" w:cstheme="minorAscii"/>
-          <w:noProof w:val="0"/>
-          <w:sz w:val="24"/>
-          <w:szCs w:val="24"/>
-          <w:lang w:val="en-GB"/>
-        </w:rPr>
-        <w:t xml:space="preserve"> across the three target income levels — Low, Lower-middle, and Upper-middle — using </w:t>
-      </w:r>
-      <w:r>
-        <w:rPr>
-          <w:rFonts w:ascii="Calibri" w:hAnsi="Calibri" w:eastAsia="Calibri" w:cs="Calibri" w:asciiTheme="minorAscii" w:hAnsiTheme="minorAscii" w:eastAsiaTheme="minorAscii" w:cstheme="minorAscii"/>
-          <w:noProof w:val="0"/>
-          <w:sz w:val="24"/>
-          <w:szCs w:val="24"/>
-          <w:lang w:val="en-GB"/>
-        </w:rPr>
-        <w:t>value_counts</w:t>
-      </w:r>
-      <w:r>
-        <w:rPr>
-          <w:rFonts w:ascii="Calibri" w:hAnsi="Calibri" w:eastAsia="Calibri" w:cs="Calibri" w:asciiTheme="minorAscii" w:hAnsiTheme="minorAscii" w:eastAsiaTheme="minorAscii" w:cstheme="minorAscii"/>
-          <w:noProof w:val="0"/>
-          <w:sz w:val="24"/>
-          <w:szCs w:val="24"/>
-          <w:lang w:val="en-GB"/>
-        </w:rPr>
-        <w:t>()</w:t>
-      </w:r>
-      <w:r>
-        <w:rPr>
-          <w:rFonts w:ascii="Calibri" w:hAnsi="Calibri" w:eastAsia="Calibri" w:cs="Calibri" w:asciiTheme="minorAscii" w:hAnsiTheme="minorAscii" w:eastAsiaTheme="minorAscii" w:cstheme="minorAscii"/>
-          <w:noProof w:val="0"/>
-          <w:sz w:val="24"/>
-          <w:szCs w:val="24"/>
-          <w:lang w:val="en-GB"/>
-        </w:rPr>
-        <w:t xml:space="preserve"> </w:t>
-      </w:r>
-      <w:r>
-        <w:rPr>
-          <w:rFonts w:ascii="Calibri" w:hAnsi="Calibri" w:eastAsia="Calibri" w:cs="Calibri" w:asciiTheme="minorAscii" w:hAnsiTheme="minorAscii" w:eastAsiaTheme="minorAscii" w:cstheme="minorAscii"/>
-          <w:noProof w:val="0"/>
-          <w:sz w:val="24"/>
-          <w:szCs w:val="24"/>
-          <w:lang w:val="en-GB"/>
-        </w:rPr>
-        <w:t xml:space="preserve">and </w:t>
-      </w:r>
-      <w:r>
-        <w:rPr>
-          <w:rFonts w:ascii="Calibri" w:hAnsi="Calibri" w:eastAsia="Calibri" w:cs="Calibri" w:asciiTheme="minorAscii" w:hAnsiTheme="minorAscii" w:eastAsiaTheme="minorAscii" w:cstheme="minorAscii"/>
-          <w:noProof w:val="0"/>
-          <w:sz w:val="24"/>
-          <w:szCs w:val="24"/>
-          <w:lang w:val="en-GB"/>
-        </w:rPr>
-        <w:t>.</w:t>
-      </w:r>
-      <w:r>
-        <w:rPr>
-          <w:rFonts w:ascii="Calibri" w:hAnsi="Calibri" w:eastAsia="Calibri" w:cs="Calibri" w:asciiTheme="minorAscii" w:hAnsiTheme="minorAscii" w:eastAsiaTheme="minorAscii" w:cstheme="minorAscii"/>
-          <w:noProof w:val="0"/>
-          <w:sz w:val="24"/>
-          <w:szCs w:val="24"/>
-          <w:lang w:val="en-GB"/>
-        </w:rPr>
-        <w:t>plot.pie</w:t>
-      </w:r>
-      <w:r>
-        <w:rPr>
-          <w:rFonts w:ascii="Calibri" w:hAnsi="Calibri" w:eastAsia="Calibri" w:cs="Calibri" w:asciiTheme="minorAscii" w:hAnsiTheme="minorAscii" w:eastAsiaTheme="minorAscii" w:cstheme="minorAscii"/>
-          <w:noProof w:val="0"/>
-          <w:sz w:val="24"/>
-          <w:szCs w:val="24"/>
-          <w:lang w:val="en-GB"/>
-        </w:rPr>
-        <w:t>()</w:t>
-      </w:r>
-      <w:r>
-        <w:rPr>
-          <w:rFonts w:ascii="Calibri" w:hAnsi="Calibri" w:eastAsia="Calibri" w:cs="Calibri" w:asciiTheme="minorAscii" w:hAnsiTheme="minorAscii" w:eastAsiaTheme="minorAscii" w:cstheme="minorAscii"/>
-          <w:noProof w:val="0"/>
-          <w:sz w:val="24"/>
-          <w:szCs w:val="24"/>
-          <w:lang w:val="en-GB"/>
-        </w:rPr>
-        <w:t xml:space="preserve"> on the “Income Level” column. The chart helped confirm the dataset's coverage and ensured income levels were adequately represented.</w:t>
-      </w:r>
-    </w:p>
-    <w:p>
-      <w:pPr>
-        <w:rPr>
-          <w:rFonts w:ascii="Calibri" w:hAnsi="Calibri" w:eastAsia="Calibri" w:cs="Calibri" w:asciiTheme="minorAscii" w:hAnsiTheme="minorAscii" w:eastAsiaTheme="minorAscii" w:cstheme="minorAscii"/>
-        </w:rPr>
-      </w:pPr>
-    </w:p>
-    <w:p>
-      <w:pPr>
-        <w:pStyle w:val="Heading3"/>
-        <w:spacing w:before="281" w:beforeAutospacing="off" w:after="281" w:afterAutospacing="off"/>
-        <w:rPr>
-          <w:rFonts w:ascii="Calibri" w:hAnsi="Calibri" w:eastAsia="Calibri" w:cs="Calibri" w:asciiTheme="minorAscii" w:hAnsiTheme="minorAscii" w:eastAsiaTheme="minorAscii" w:cstheme="minorAscii"/>
-          <w:b w:val="1"/>
-          <w:bCs w:val="1"/>
-          <w:noProof w:val="0"/>
-          <w:color w:val="auto"/>
-          <w:sz w:val="28"/>
-          <w:szCs w:val="28"/>
-          <w:lang w:val="en-GB"/>
-        </w:rPr>
-      </w:pPr>
-      <w:r>
-        <w:rPr>
-          <w:rFonts w:ascii="Calibri" w:hAnsi="Calibri" w:eastAsia="Calibri" w:cs="Calibri" w:asciiTheme="minorAscii" w:hAnsiTheme="minorAscii" w:eastAsiaTheme="minorAscii" w:cstheme="minorAscii"/>
-          <w:b w:val="1"/>
-          <w:bCs w:val="1"/>
-          <w:noProof w:val="0"/>
-          <w:color w:val="auto"/>
-          <w:sz w:val="28"/>
-          <w:szCs w:val="28"/>
-          <w:lang w:val="en-GB"/>
-        </w:rPr>
-        <w:t>Analyzing</w:t>
-      </w:r>
-      <w:r>
-        <w:rPr>
-          <w:rFonts w:ascii="Calibri" w:hAnsi="Calibri" w:eastAsia="Calibri" w:cs="Calibri" w:asciiTheme="minorAscii" w:hAnsiTheme="minorAscii" w:eastAsiaTheme="minorAscii" w:cstheme="minorAscii"/>
-          <w:b w:val="1"/>
-          <w:bCs w:val="1"/>
-          <w:noProof w:val="0"/>
-          <w:color w:val="auto"/>
-          <w:sz w:val="28"/>
-          <w:szCs w:val="28"/>
-          <w:lang w:val="en-GB"/>
-        </w:rPr>
-        <w:t xml:space="preserve"> 2023 Indicator Values Across Income Levels</w:t>
-      </w:r>
-    </w:p>
-    <w:p>
-      <w:pPr>
-        <w:spacing w:before="240" w:beforeAutospacing="off" w:after="240" w:afterAutospacing="off"/>
-        <w:rPr>
-          <w:rFonts w:ascii="Calibri" w:hAnsi="Calibri" w:eastAsia="Calibri" w:cs="Calibri" w:asciiTheme="minorAscii" w:hAnsiTheme="minorAscii" w:eastAsiaTheme="minorAscii" w:cstheme="minorAscii"/>
-          <w:noProof w:val="0"/>
-          <w:sz w:val="24"/>
-          <w:szCs w:val="24"/>
-          <w:lang w:val="en-GB"/>
-        </w:rPr>
-      </w:pPr>
-      <w:r>
-        <w:rPr>
-          <w:rFonts w:ascii="Calibri" w:hAnsi="Calibri" w:eastAsia="Calibri" w:cs="Calibri" w:asciiTheme="minorAscii" w:hAnsiTheme="minorAscii" w:eastAsiaTheme="minorAscii" w:cstheme="minorAscii"/>
-          <w:noProof w:val="0"/>
-          <w:sz w:val="24"/>
-          <w:szCs w:val="24"/>
-          <w:lang w:val="en-GB"/>
-        </w:rPr>
-        <w:t xml:space="preserve">Next, I </w:t>
-      </w:r>
-      <w:r>
-        <w:rPr>
-          <w:rFonts w:ascii="Calibri" w:hAnsi="Calibri" w:eastAsia="Calibri" w:cs="Calibri" w:asciiTheme="minorAscii" w:hAnsiTheme="minorAscii" w:eastAsiaTheme="minorAscii" w:cstheme="minorAscii"/>
-          <w:noProof w:val="0"/>
-          <w:sz w:val="24"/>
-          <w:szCs w:val="24"/>
-          <w:lang w:val="en-GB"/>
-        </w:rPr>
-        <w:t>analyzed</w:t>
-      </w:r>
-      <w:r>
-        <w:rPr>
-          <w:rFonts w:ascii="Calibri" w:hAnsi="Calibri" w:eastAsia="Calibri" w:cs="Calibri" w:asciiTheme="minorAscii" w:hAnsiTheme="minorAscii" w:eastAsiaTheme="minorAscii" w:cstheme="minorAscii"/>
-          <w:noProof w:val="0"/>
-          <w:sz w:val="24"/>
-          <w:szCs w:val="24"/>
-          <w:lang w:val="en-GB"/>
-        </w:rPr>
-        <w:t xml:space="preserve"> the distribution of 2023 values (across all indicators) for each income level. Using </w:t>
-      </w:r>
-      <w:r>
-        <w:rPr>
-          <w:rFonts w:ascii="Calibri" w:hAnsi="Calibri" w:eastAsia="Calibri" w:cs="Calibri" w:asciiTheme="minorAscii" w:hAnsiTheme="minorAscii" w:eastAsiaTheme="minorAscii" w:cstheme="minorAscii"/>
-          <w:noProof w:val="0"/>
-          <w:sz w:val="24"/>
-          <w:szCs w:val="24"/>
-          <w:lang w:val="en-GB"/>
-        </w:rPr>
-        <w:t>sns.boxplot</w:t>
-      </w:r>
-      <w:r>
-        <w:rPr>
-          <w:rFonts w:ascii="Calibri" w:hAnsi="Calibri" w:eastAsia="Calibri" w:cs="Calibri" w:asciiTheme="minorAscii" w:hAnsiTheme="minorAscii" w:eastAsiaTheme="minorAscii" w:cstheme="minorAscii"/>
-          <w:noProof w:val="0"/>
-          <w:sz w:val="24"/>
-          <w:szCs w:val="24"/>
-          <w:lang w:val="en-GB"/>
-        </w:rPr>
-        <w:t>()</w:t>
-      </w:r>
-      <w:r>
-        <w:rPr>
-          <w:rFonts w:ascii="Calibri" w:hAnsi="Calibri" w:eastAsia="Calibri" w:cs="Calibri" w:asciiTheme="minorAscii" w:hAnsiTheme="minorAscii" w:eastAsiaTheme="minorAscii" w:cstheme="minorAscii"/>
-          <w:noProof w:val="0"/>
-          <w:sz w:val="24"/>
-          <w:szCs w:val="24"/>
-          <w:lang w:val="en-GB"/>
-        </w:rPr>
-        <w:t xml:space="preserve"> and </w:t>
-      </w:r>
-      <w:r>
-        <w:rPr>
-          <w:rFonts w:ascii="Calibri" w:hAnsi="Calibri" w:eastAsia="Calibri" w:cs="Calibri" w:asciiTheme="minorAscii" w:hAnsiTheme="minorAscii" w:eastAsiaTheme="minorAscii" w:cstheme="minorAscii"/>
-          <w:noProof w:val="0"/>
-          <w:sz w:val="24"/>
-          <w:szCs w:val="24"/>
-          <w:lang w:val="en-GB"/>
-        </w:rPr>
-        <w:t>sns.violinplot</w:t>
-      </w:r>
-      <w:r>
-        <w:rPr>
-          <w:rFonts w:ascii="Calibri" w:hAnsi="Calibri" w:eastAsia="Calibri" w:cs="Calibri" w:asciiTheme="minorAscii" w:hAnsiTheme="minorAscii" w:eastAsiaTheme="minorAscii" w:cstheme="minorAscii"/>
-          <w:noProof w:val="0"/>
-          <w:sz w:val="24"/>
-          <w:szCs w:val="24"/>
-          <w:lang w:val="en-GB"/>
-        </w:rPr>
-        <w:t>()</w:t>
-      </w:r>
-      <w:r>
-        <w:rPr>
-          <w:rFonts w:ascii="Calibri" w:hAnsi="Calibri" w:eastAsia="Calibri" w:cs="Calibri" w:asciiTheme="minorAscii" w:hAnsiTheme="minorAscii" w:eastAsiaTheme="minorAscii" w:cstheme="minorAscii"/>
-          <w:noProof w:val="0"/>
-          <w:sz w:val="24"/>
-          <w:szCs w:val="24"/>
-          <w:lang w:val="en-GB"/>
-        </w:rPr>
-        <w:t xml:space="preserve">, I explored both central tendencies and dispersion patterns. These </w:t>
-      </w:r>
-      <w:r>
-        <w:rPr>
-          <w:rFonts w:ascii="Calibri" w:hAnsi="Calibri" w:eastAsia="Calibri" w:cs="Calibri" w:asciiTheme="minorAscii" w:hAnsiTheme="minorAscii" w:eastAsiaTheme="minorAscii" w:cstheme="minorAscii"/>
-          <w:b w:val="1"/>
-          <w:bCs w:val="1"/>
-          <w:noProof w:val="0"/>
-          <w:sz w:val="24"/>
-          <w:szCs w:val="24"/>
-          <w:lang w:val="en-GB"/>
-        </w:rPr>
-        <w:t>box plots</w:t>
-      </w:r>
-      <w:r>
-        <w:rPr>
-          <w:rFonts w:ascii="Calibri" w:hAnsi="Calibri" w:eastAsia="Calibri" w:cs="Calibri" w:asciiTheme="minorAscii" w:hAnsiTheme="minorAscii" w:eastAsiaTheme="minorAscii" w:cstheme="minorAscii"/>
-          <w:noProof w:val="0"/>
-          <w:sz w:val="24"/>
-          <w:szCs w:val="24"/>
-          <w:lang w:val="en-GB"/>
-        </w:rPr>
-        <w:t xml:space="preserve"> and </w:t>
-      </w:r>
-      <w:r>
-        <w:rPr>
-          <w:rFonts w:ascii="Calibri" w:hAnsi="Calibri" w:eastAsia="Calibri" w:cs="Calibri" w:asciiTheme="minorAscii" w:hAnsiTheme="minorAscii" w:eastAsiaTheme="minorAscii" w:cstheme="minorAscii"/>
-          <w:b w:val="1"/>
-          <w:bCs w:val="1"/>
-          <w:noProof w:val="0"/>
-          <w:sz w:val="24"/>
-          <w:szCs w:val="24"/>
-          <w:lang w:val="en-GB"/>
-        </w:rPr>
-        <w:t>violin plots</w:t>
-      </w:r>
-      <w:r>
-        <w:rPr>
-          <w:rFonts w:ascii="Calibri" w:hAnsi="Calibri" w:eastAsia="Calibri" w:cs="Calibri" w:asciiTheme="minorAscii" w:hAnsiTheme="minorAscii" w:eastAsiaTheme="minorAscii" w:cstheme="minorAscii"/>
-          <w:noProof w:val="0"/>
-          <w:sz w:val="24"/>
-          <w:szCs w:val="24"/>
-          <w:lang w:val="en-GB"/>
-        </w:rPr>
-        <w:t xml:space="preserve"> provided insights into data spread, skewness, and outliers in each income group. In addition to this, I created </w:t>
-      </w:r>
-      <w:r>
-        <w:rPr>
-          <w:rFonts w:ascii="Calibri" w:hAnsi="Calibri" w:eastAsia="Calibri" w:cs="Calibri" w:asciiTheme="minorAscii" w:hAnsiTheme="minorAscii" w:eastAsiaTheme="minorAscii" w:cstheme="minorAscii"/>
-          <w:b w:val="1"/>
-          <w:bCs w:val="1"/>
-          <w:noProof w:val="0"/>
-          <w:sz w:val="24"/>
-          <w:szCs w:val="24"/>
-          <w:lang w:val="en-GB"/>
-        </w:rPr>
-        <w:t>income-specific histograms</w:t>
-      </w:r>
-      <w:r>
-        <w:rPr>
-          <w:rFonts w:ascii="Calibri" w:hAnsi="Calibri" w:eastAsia="Calibri" w:cs="Calibri" w:asciiTheme="minorAscii" w:hAnsiTheme="minorAscii" w:eastAsiaTheme="minorAscii" w:cstheme="minorAscii"/>
-          <w:noProof w:val="0"/>
-          <w:sz w:val="24"/>
-          <w:szCs w:val="24"/>
-          <w:lang w:val="en-GB"/>
-        </w:rPr>
-        <w:t xml:space="preserve"> using </w:t>
-      </w:r>
-      <w:r>
-        <w:rPr>
-          <w:rFonts w:ascii="Calibri" w:hAnsi="Calibri" w:eastAsia="Calibri" w:cs="Calibri" w:asciiTheme="minorAscii" w:hAnsiTheme="minorAscii" w:eastAsiaTheme="minorAscii" w:cstheme="minorAscii"/>
-          <w:noProof w:val="0"/>
-          <w:sz w:val="24"/>
-          <w:szCs w:val="24"/>
-          <w:lang w:val="en-GB"/>
-        </w:rPr>
-        <w:t>sns.histplot</w:t>
-      </w:r>
-      <w:r>
-        <w:rPr>
-          <w:rFonts w:ascii="Calibri" w:hAnsi="Calibri" w:eastAsia="Calibri" w:cs="Calibri" w:asciiTheme="minorAscii" w:hAnsiTheme="minorAscii" w:eastAsiaTheme="minorAscii" w:cstheme="minorAscii"/>
-          <w:noProof w:val="0"/>
-          <w:sz w:val="24"/>
-          <w:szCs w:val="24"/>
-          <w:lang w:val="en-GB"/>
-        </w:rPr>
-        <w:t>()</w:t>
-      </w:r>
-      <w:r>
-        <w:rPr>
-          <w:rFonts w:ascii="Calibri" w:hAnsi="Calibri" w:eastAsia="Calibri" w:cs="Calibri" w:asciiTheme="minorAscii" w:hAnsiTheme="minorAscii" w:eastAsiaTheme="minorAscii" w:cstheme="minorAscii"/>
-          <w:noProof w:val="0"/>
-          <w:sz w:val="24"/>
-          <w:szCs w:val="24"/>
-          <w:lang w:val="en-GB"/>
-        </w:rPr>
-        <w:t xml:space="preserve"> (with KDE enabled) to visualize the </w:t>
-      </w:r>
-      <w:r>
-        <w:rPr>
-          <w:rFonts w:ascii="Calibri" w:hAnsi="Calibri" w:eastAsia="Calibri" w:cs="Calibri" w:asciiTheme="minorAscii" w:hAnsiTheme="minorAscii" w:eastAsiaTheme="minorAscii" w:cstheme="minorAscii"/>
-          <w:b w:val="1"/>
-          <w:bCs w:val="1"/>
-          <w:noProof w:val="0"/>
-          <w:sz w:val="24"/>
-          <w:szCs w:val="24"/>
-          <w:lang w:val="en-GB"/>
-        </w:rPr>
-        <w:t>frequency distribution</w:t>
-      </w:r>
-      <w:r>
-        <w:rPr>
-          <w:rFonts w:ascii="Calibri" w:hAnsi="Calibri" w:eastAsia="Calibri" w:cs="Calibri" w:asciiTheme="minorAscii" w:hAnsiTheme="minorAscii" w:eastAsiaTheme="minorAscii" w:cstheme="minorAscii"/>
-          <w:noProof w:val="0"/>
-          <w:sz w:val="24"/>
-          <w:szCs w:val="24"/>
-          <w:lang w:val="en-GB"/>
-        </w:rPr>
-        <w:t xml:space="preserve"> of 2023 values. This allowed me to detect which income groups had more consistent versus volatile performances.</w:t>
-      </w:r>
-    </w:p>
-    <w:p>
-      <w:pPr>
-        <w:rPr>
-          <w:rFonts w:ascii="Calibri" w:hAnsi="Calibri" w:eastAsia="Calibri" w:cs="Calibri" w:asciiTheme="minorAscii" w:hAnsiTheme="minorAscii" w:eastAsiaTheme="minorAscii" w:cstheme="minorAscii"/>
-        </w:rPr>
-      </w:pPr>
-    </w:p>
-    <w:p>
-      <w:pPr>
-        <w:pStyle w:val="Heading3"/>
-        <w:spacing w:before="281" w:beforeAutospacing="off" w:after="281" w:afterAutospacing="off"/>
-        <w:rPr>
-          <w:rFonts w:ascii="Calibri" w:hAnsi="Calibri" w:eastAsia="Calibri" w:cs="Calibri" w:asciiTheme="minorAscii" w:hAnsiTheme="minorAscii" w:eastAsiaTheme="minorAscii" w:cstheme="minorAscii"/>
-          <w:b w:val="1"/>
-          <w:bCs w:val="1"/>
-          <w:noProof w:val="0"/>
-          <w:color w:val="auto"/>
-          <w:sz w:val="28"/>
-          <w:szCs w:val="28"/>
-          <w:lang w:val="en-GB"/>
-        </w:rPr>
-      </w:pPr>
-      <w:r>
-        <w:rPr>
-          <w:rFonts w:ascii="Calibri" w:hAnsi="Calibri" w:eastAsia="Calibri" w:cs="Calibri" w:asciiTheme="minorAscii" w:hAnsiTheme="minorAscii" w:eastAsiaTheme="minorAscii" w:cstheme="minorAscii"/>
-          <w:b w:val="1"/>
-          <w:bCs w:val="1"/>
-          <w:noProof w:val="0"/>
-          <w:color w:val="auto"/>
-          <w:sz w:val="28"/>
-          <w:szCs w:val="28"/>
-          <w:lang w:val="en-GB"/>
-        </w:rPr>
-        <w:t>Global GDP Growth Trend Analysis</w:t>
-      </w:r>
-    </w:p>
-    <w:p>
-      <w:pPr>
-        <w:spacing w:before="240" w:beforeAutospacing="off" w:after="240" w:afterAutospacing="off"/>
-        <w:rPr>
-          <w:rFonts w:ascii="Calibri" w:hAnsi="Calibri" w:eastAsia="Calibri" w:cs="Calibri" w:asciiTheme="minorAscii" w:hAnsiTheme="minorAscii" w:eastAsiaTheme="minorAscii" w:cstheme="minorAscii"/>
-          <w:noProof w:val="0"/>
-          <w:sz w:val="24"/>
-          <w:szCs w:val="24"/>
-          <w:lang w:val="en-GB"/>
-        </w:rPr>
-      </w:pPr>
-      <w:r>
-        <w:rPr>
-          <w:rFonts w:ascii="Calibri" w:hAnsi="Calibri" w:eastAsia="Calibri" w:cs="Calibri" w:asciiTheme="minorAscii" w:hAnsiTheme="minorAscii" w:eastAsiaTheme="minorAscii" w:cstheme="minorAscii"/>
-          <w:noProof w:val="0"/>
-          <w:sz w:val="24"/>
-          <w:szCs w:val="24"/>
-          <w:lang w:val="en-GB"/>
-        </w:rPr>
-        <w:t xml:space="preserve">To understand macroeconomic </w:t>
-      </w:r>
-      <w:r>
-        <w:rPr>
-          <w:rFonts w:ascii="Calibri" w:hAnsi="Calibri" w:eastAsia="Calibri" w:cs="Calibri" w:asciiTheme="minorAscii" w:hAnsiTheme="minorAscii" w:eastAsiaTheme="minorAscii" w:cstheme="minorAscii"/>
-          <w:noProof w:val="0"/>
-          <w:sz w:val="24"/>
-          <w:szCs w:val="24"/>
-          <w:lang w:val="en-GB"/>
-        </w:rPr>
-        <w:t>behavior</w:t>
-      </w:r>
-      <w:r>
-        <w:rPr>
-          <w:rFonts w:ascii="Calibri" w:hAnsi="Calibri" w:eastAsia="Calibri" w:cs="Calibri" w:asciiTheme="minorAscii" w:hAnsiTheme="minorAscii" w:eastAsiaTheme="minorAscii" w:cstheme="minorAscii"/>
-          <w:noProof w:val="0"/>
-          <w:sz w:val="24"/>
-          <w:szCs w:val="24"/>
-          <w:lang w:val="en-GB"/>
-        </w:rPr>
-        <w:t xml:space="preserve">, I isolated the series </w:t>
-      </w:r>
-      <w:r>
-        <w:rPr>
-          <w:rFonts w:ascii="Calibri" w:hAnsi="Calibri" w:eastAsia="Calibri" w:cs="Calibri" w:asciiTheme="minorAscii" w:hAnsiTheme="minorAscii" w:eastAsiaTheme="minorAscii" w:cstheme="minorAscii"/>
-          <w:b w:val="1"/>
-          <w:bCs w:val="1"/>
-          <w:noProof w:val="0"/>
-          <w:sz w:val="24"/>
-          <w:szCs w:val="24"/>
-          <w:lang w:val="en-GB"/>
-        </w:rPr>
-        <w:t>“GDP growth (annual %)”</w:t>
-      </w:r>
-      <w:r>
-        <w:rPr>
-          <w:rFonts w:ascii="Calibri" w:hAnsi="Calibri" w:eastAsia="Calibri" w:cs="Calibri" w:asciiTheme="minorAscii" w:hAnsiTheme="minorAscii" w:eastAsiaTheme="minorAscii" w:cstheme="minorAscii"/>
-          <w:noProof w:val="0"/>
-          <w:sz w:val="24"/>
-          <w:szCs w:val="24"/>
-          <w:lang w:val="en-GB"/>
-        </w:rPr>
-        <w:t xml:space="preserve"> from the dataset. I dropped the income level column temporarily to focus on global averages. Then, I calculated the </w:t>
-      </w:r>
-      <w:r>
-        <w:rPr>
-          <w:rFonts w:ascii="Calibri" w:hAnsi="Calibri" w:eastAsia="Calibri" w:cs="Calibri" w:asciiTheme="minorAscii" w:hAnsiTheme="minorAscii" w:eastAsiaTheme="minorAscii" w:cstheme="minorAscii"/>
-          <w:b w:val="1"/>
-          <w:bCs w:val="1"/>
-          <w:noProof w:val="0"/>
-          <w:sz w:val="24"/>
-          <w:szCs w:val="24"/>
-          <w:lang w:val="en-GB"/>
-        </w:rPr>
-        <w:t>mean GDP growth across all countries</w:t>
-      </w:r>
-      <w:r>
-        <w:rPr>
-          <w:rFonts w:ascii="Calibri" w:hAnsi="Calibri" w:eastAsia="Calibri" w:cs="Calibri" w:asciiTheme="minorAscii" w:hAnsiTheme="minorAscii" w:eastAsiaTheme="minorAscii" w:cstheme="minorAscii"/>
-          <w:noProof w:val="0"/>
-          <w:sz w:val="24"/>
-          <w:szCs w:val="24"/>
-          <w:lang w:val="en-GB"/>
-        </w:rPr>
-        <w:t xml:space="preserve"> for each year using </w:t>
-      </w:r>
-      <w:r>
-        <w:rPr>
-          <w:rFonts w:ascii="Calibri" w:hAnsi="Calibri" w:eastAsia="Calibri" w:cs="Calibri" w:asciiTheme="minorAscii" w:hAnsiTheme="minorAscii" w:eastAsiaTheme="minorAscii" w:cstheme="minorAscii"/>
-          <w:noProof w:val="0"/>
-          <w:sz w:val="24"/>
-          <w:szCs w:val="24"/>
-          <w:lang w:val="en-GB"/>
-        </w:rPr>
-        <w:t>mean(</w:t>
-      </w:r>
-      <w:r>
-        <w:rPr>
-          <w:rFonts w:ascii="Calibri" w:hAnsi="Calibri" w:eastAsia="Calibri" w:cs="Calibri" w:asciiTheme="minorAscii" w:hAnsiTheme="minorAscii" w:eastAsiaTheme="minorAscii" w:cstheme="minorAscii"/>
-          <w:noProof w:val="0"/>
-          <w:sz w:val="24"/>
-          <w:szCs w:val="24"/>
-          <w:lang w:val="en-GB"/>
-        </w:rPr>
-        <w:t>)</w:t>
-      </w:r>
-      <w:r>
-        <w:rPr>
-          <w:rFonts w:ascii="Calibri" w:hAnsi="Calibri" w:eastAsia="Calibri" w:cs="Calibri" w:asciiTheme="minorAscii" w:hAnsiTheme="minorAscii" w:eastAsiaTheme="minorAscii" w:cstheme="minorAscii"/>
-          <w:noProof w:val="0"/>
-          <w:sz w:val="24"/>
-          <w:szCs w:val="24"/>
-          <w:lang w:val="en-GB"/>
-        </w:rPr>
-        <w:t xml:space="preserve"> on the subset’s year columns. I visualized this trend using a </w:t>
-      </w:r>
-      <w:r>
-        <w:rPr>
-          <w:rFonts w:ascii="Calibri" w:hAnsi="Calibri" w:eastAsia="Calibri" w:cs="Calibri" w:asciiTheme="minorAscii" w:hAnsiTheme="minorAscii" w:eastAsiaTheme="minorAscii" w:cstheme="minorAscii"/>
-          <w:b w:val="1"/>
-          <w:bCs w:val="1"/>
-          <w:noProof w:val="0"/>
-          <w:sz w:val="24"/>
-          <w:szCs w:val="24"/>
-          <w:lang w:val="en-GB"/>
-        </w:rPr>
-        <w:t>line plot</w:t>
-      </w:r>
-      <w:r>
-        <w:rPr>
-          <w:rFonts w:ascii="Calibri" w:hAnsi="Calibri" w:eastAsia="Calibri" w:cs="Calibri" w:asciiTheme="minorAscii" w:hAnsiTheme="minorAscii" w:eastAsiaTheme="minorAscii" w:cstheme="minorAscii"/>
-          <w:noProof w:val="0"/>
-          <w:sz w:val="24"/>
-          <w:szCs w:val="24"/>
-          <w:lang w:val="en-GB"/>
-        </w:rPr>
-        <w:t xml:space="preserve">, adding markers and gridlines for readability. The resulting plot clearly revealed fluctuations in global GDP growth over time and </w:t>
-      </w:r>
-      <w:r>
-        <w:rPr>
-          <w:rFonts w:ascii="Calibri" w:hAnsi="Calibri" w:eastAsia="Calibri" w:cs="Calibri" w:asciiTheme="minorAscii" w:hAnsiTheme="minorAscii" w:eastAsiaTheme="minorAscii" w:cstheme="minorAscii"/>
-          <w:noProof w:val="0"/>
-          <w:sz w:val="24"/>
-          <w:szCs w:val="24"/>
-          <w:lang w:val="en-GB"/>
-        </w:rPr>
-        <w:t>established</w:t>
-      </w:r>
-      <w:r>
-        <w:rPr>
-          <w:rFonts w:ascii="Calibri" w:hAnsi="Calibri" w:eastAsia="Calibri" w:cs="Calibri" w:asciiTheme="minorAscii" w:hAnsiTheme="minorAscii" w:eastAsiaTheme="minorAscii" w:cstheme="minorAscii"/>
-          <w:noProof w:val="0"/>
-          <w:sz w:val="24"/>
-          <w:szCs w:val="24"/>
-          <w:lang w:val="en-GB"/>
-        </w:rPr>
-        <w:t xml:space="preserve"> a macroeconomic timeline against which I could compare emissions and energy use.</w:t>
-      </w:r>
-    </w:p>
-    <w:p>
-      <w:pPr>
-        <w:rPr>
-          <w:rFonts w:ascii="Calibri" w:hAnsi="Calibri" w:eastAsia="Calibri" w:cs="Calibri" w:asciiTheme="minorAscii" w:hAnsiTheme="minorAscii" w:eastAsiaTheme="minorAscii" w:cstheme="minorAscii"/>
-        </w:rPr>
-      </w:pPr>
-    </w:p>
-    <w:p>
-      <w:pPr>
-        <w:pStyle w:val="Heading3"/>
-        <w:spacing w:before="281" w:beforeAutospacing="off" w:after="281" w:afterAutospacing="off"/>
-        <w:rPr>
-          <w:rFonts w:ascii="Calibri" w:hAnsi="Calibri" w:eastAsia="Calibri" w:cs="Calibri" w:asciiTheme="minorAscii" w:hAnsiTheme="minorAscii" w:eastAsiaTheme="minorAscii" w:cstheme="minorAscii"/>
-          <w:b w:val="1"/>
-          <w:bCs w:val="1"/>
-          <w:noProof w:val="0"/>
-          <w:color w:val="auto"/>
-          <w:sz w:val="28"/>
-          <w:szCs w:val="28"/>
-          <w:lang w:val="en-GB"/>
-        </w:rPr>
-      </w:pPr>
-      <w:r>
-        <w:rPr>
-          <w:rFonts w:ascii="Calibri" w:hAnsi="Calibri" w:eastAsia="Calibri" w:cs="Calibri" w:asciiTheme="minorAscii" w:hAnsiTheme="minorAscii" w:eastAsiaTheme="minorAscii" w:cstheme="minorAscii"/>
-          <w:b w:val="1"/>
-          <w:bCs w:val="1"/>
-          <w:noProof w:val="0"/>
-          <w:color w:val="auto"/>
-          <w:sz w:val="28"/>
-          <w:szCs w:val="28"/>
-          <w:lang w:val="en-GB"/>
-        </w:rPr>
-        <w:t>Trend Analysis of CO₂ Emissions Indicators Across Income Levels</w:t>
-      </w:r>
-    </w:p>
-    <w:p>
-      <w:pPr>
-        <w:spacing w:before="240" w:beforeAutospacing="off" w:after="240" w:afterAutospacing="off"/>
-        <w:rPr>
-          <w:rFonts w:ascii="Calibri" w:hAnsi="Calibri" w:eastAsia="Calibri" w:cs="Calibri" w:asciiTheme="minorAscii" w:hAnsiTheme="minorAscii" w:eastAsiaTheme="minorAscii" w:cstheme="minorAscii"/>
-          <w:noProof w:val="0"/>
-          <w:sz w:val="24"/>
-          <w:szCs w:val="24"/>
-          <w:lang w:val="en-GB"/>
-        </w:rPr>
-      </w:pPr>
-      <w:r>
-        <w:rPr>
-          <w:rFonts w:ascii="Calibri" w:hAnsi="Calibri" w:eastAsia="Calibri" w:cs="Calibri" w:asciiTheme="minorAscii" w:hAnsiTheme="minorAscii" w:eastAsiaTheme="minorAscii" w:cstheme="minorAscii"/>
-          <w:noProof w:val="0"/>
-          <w:sz w:val="24"/>
-          <w:szCs w:val="24"/>
-          <w:lang w:val="en-GB"/>
-        </w:rPr>
-        <w:t xml:space="preserve">The next phase involved a deep dive into </w:t>
-      </w:r>
-      <w:r>
-        <w:rPr>
-          <w:rFonts w:ascii="Calibri" w:hAnsi="Calibri" w:eastAsia="Calibri" w:cs="Calibri" w:asciiTheme="minorAscii" w:hAnsiTheme="minorAscii" w:eastAsiaTheme="minorAscii" w:cstheme="minorAscii"/>
-          <w:b w:val="1"/>
-          <w:bCs w:val="1"/>
-          <w:noProof w:val="0"/>
-          <w:sz w:val="24"/>
-          <w:szCs w:val="24"/>
-          <w:lang w:val="en-GB"/>
-        </w:rPr>
-        <w:t>CO₂ emissions indicators</w:t>
-      </w:r>
-      <w:r>
-        <w:rPr>
-          <w:rFonts w:ascii="Calibri" w:hAnsi="Calibri" w:eastAsia="Calibri" w:cs="Calibri" w:asciiTheme="minorAscii" w:hAnsiTheme="minorAscii" w:eastAsiaTheme="minorAscii" w:cstheme="minorAscii"/>
-          <w:noProof w:val="0"/>
-          <w:sz w:val="24"/>
-          <w:szCs w:val="24"/>
-          <w:lang w:val="en-GB"/>
-        </w:rPr>
-        <w:t xml:space="preserve">. I created three custom visualization functions — </w:t>
-      </w:r>
-      <w:r>
-        <w:rPr>
-          <w:rFonts w:ascii="Calibri" w:hAnsi="Calibri" w:eastAsia="Calibri" w:cs="Calibri" w:asciiTheme="minorAscii" w:hAnsiTheme="minorAscii" w:eastAsiaTheme="minorAscii" w:cstheme="minorAscii"/>
-          <w:noProof w:val="0"/>
-          <w:sz w:val="24"/>
-          <w:szCs w:val="24"/>
-          <w:lang w:val="en-GB"/>
-        </w:rPr>
-        <w:t>plot_emission_line</w:t>
-      </w:r>
-      <w:r>
-        <w:rPr>
-          <w:rFonts w:ascii="Calibri" w:hAnsi="Calibri" w:eastAsia="Calibri" w:cs="Calibri" w:asciiTheme="minorAscii" w:hAnsiTheme="minorAscii" w:eastAsiaTheme="minorAscii" w:cstheme="minorAscii"/>
-          <w:noProof w:val="0"/>
-          <w:sz w:val="24"/>
-          <w:szCs w:val="24"/>
-          <w:lang w:val="en-GB"/>
-        </w:rPr>
-        <w:t>()</w:t>
-      </w:r>
-      <w:r>
-        <w:rPr>
-          <w:rFonts w:ascii="Calibri" w:hAnsi="Calibri" w:eastAsia="Calibri" w:cs="Calibri" w:asciiTheme="minorAscii" w:hAnsiTheme="minorAscii" w:eastAsiaTheme="minorAscii" w:cstheme="minorAscii"/>
-          <w:noProof w:val="0"/>
-          <w:sz w:val="24"/>
-          <w:szCs w:val="24"/>
-          <w:lang w:val="en-GB"/>
-        </w:rPr>
-        <w:t xml:space="preserve">, </w:t>
-      </w:r>
-      <w:r>
-        <w:rPr>
-          <w:rFonts w:ascii="Calibri" w:hAnsi="Calibri" w:eastAsia="Calibri" w:cs="Calibri" w:asciiTheme="minorAscii" w:hAnsiTheme="minorAscii" w:eastAsiaTheme="minorAscii" w:cstheme="minorAscii"/>
-          <w:noProof w:val="0"/>
-          <w:sz w:val="24"/>
-          <w:szCs w:val="24"/>
-          <w:lang w:val="en-GB"/>
-        </w:rPr>
-        <w:t>plot_emission_bar</w:t>
-      </w:r>
-      <w:r>
-        <w:rPr>
-          <w:rFonts w:ascii="Calibri" w:hAnsi="Calibri" w:eastAsia="Calibri" w:cs="Calibri" w:asciiTheme="minorAscii" w:hAnsiTheme="minorAscii" w:eastAsiaTheme="minorAscii" w:cstheme="minorAscii"/>
-          <w:noProof w:val="0"/>
-          <w:sz w:val="24"/>
-          <w:szCs w:val="24"/>
-          <w:lang w:val="en-GB"/>
-        </w:rPr>
-        <w:t>()</w:t>
-      </w:r>
-      <w:r>
-        <w:rPr>
-          <w:rFonts w:ascii="Calibri" w:hAnsi="Calibri" w:eastAsia="Calibri" w:cs="Calibri" w:asciiTheme="minorAscii" w:hAnsiTheme="minorAscii" w:eastAsiaTheme="minorAscii" w:cstheme="minorAscii"/>
-          <w:noProof w:val="0"/>
-          <w:sz w:val="24"/>
-          <w:szCs w:val="24"/>
-          <w:lang w:val="en-GB"/>
-        </w:rPr>
-        <w:t xml:space="preserve">, and </w:t>
-      </w:r>
-      <w:r>
-        <w:rPr>
-          <w:rFonts w:ascii="Calibri" w:hAnsi="Calibri" w:eastAsia="Calibri" w:cs="Calibri" w:asciiTheme="minorAscii" w:hAnsiTheme="minorAscii" w:eastAsiaTheme="minorAscii" w:cstheme="minorAscii"/>
-          <w:noProof w:val="0"/>
-          <w:sz w:val="24"/>
-          <w:szCs w:val="24"/>
-          <w:lang w:val="en-GB"/>
-        </w:rPr>
-        <w:t>plot_emission_box</w:t>
-      </w:r>
-      <w:r>
-        <w:rPr>
-          <w:rFonts w:ascii="Calibri" w:hAnsi="Calibri" w:eastAsia="Calibri" w:cs="Calibri" w:asciiTheme="minorAscii" w:hAnsiTheme="minorAscii" w:eastAsiaTheme="minorAscii" w:cstheme="minorAscii"/>
-          <w:noProof w:val="0"/>
-          <w:sz w:val="24"/>
-          <w:szCs w:val="24"/>
-          <w:lang w:val="en-GB"/>
-        </w:rPr>
-        <w:t>()</w:t>
-      </w:r>
-      <w:r>
-        <w:rPr>
-          <w:rFonts w:ascii="Calibri" w:hAnsi="Calibri" w:eastAsia="Calibri" w:cs="Calibri" w:asciiTheme="minorAscii" w:hAnsiTheme="minorAscii" w:eastAsiaTheme="minorAscii" w:cstheme="minorAscii"/>
-          <w:noProof w:val="0"/>
-          <w:sz w:val="24"/>
-          <w:szCs w:val="24"/>
-          <w:lang w:val="en-GB"/>
-        </w:rPr>
-        <w:t xml:space="preserve"> — to automate time-series, aggregated, and distributional </w:t>
-      </w:r>
-      <w:r>
-        <w:rPr>
-          <w:rFonts w:ascii="Calibri" w:hAnsi="Calibri" w:eastAsia="Calibri" w:cs="Calibri" w:asciiTheme="minorAscii" w:hAnsiTheme="minorAscii" w:eastAsiaTheme="minorAscii" w:cstheme="minorAscii"/>
-          <w:noProof w:val="0"/>
-          <w:sz w:val="24"/>
-          <w:szCs w:val="24"/>
-          <w:lang w:val="en-GB"/>
-        </w:rPr>
-        <w:t>plots</w:t>
-      </w:r>
-      <w:r>
-        <w:rPr>
-          <w:rFonts w:ascii="Calibri" w:hAnsi="Calibri" w:eastAsia="Calibri" w:cs="Calibri" w:asciiTheme="minorAscii" w:hAnsiTheme="minorAscii" w:eastAsiaTheme="minorAscii" w:cstheme="minorAscii"/>
-          <w:noProof w:val="0"/>
-          <w:sz w:val="24"/>
-          <w:szCs w:val="24"/>
-          <w:lang w:val="en-GB"/>
-        </w:rPr>
-        <w:t xml:space="preserve"> respectively.</w:t>
-      </w:r>
-    </w:p>
-    <w:p>
-      <w:pPr>
-        <w:spacing w:before="240" w:beforeAutospacing="off" w:after="240" w:afterAutospacing="off"/>
-        <w:rPr>
-          <w:rFonts w:ascii="Calibri" w:hAnsi="Calibri" w:eastAsia="Calibri" w:cs="Calibri" w:asciiTheme="minorAscii" w:hAnsiTheme="minorAscii" w:eastAsiaTheme="minorAscii" w:cstheme="minorAscii"/>
-          <w:noProof w:val="0"/>
-          <w:sz w:val="24"/>
-          <w:szCs w:val="24"/>
-          <w:lang w:val="en-GB"/>
-        </w:rPr>
-      </w:pPr>
-      <w:r>
-        <w:rPr>
-          <w:rFonts w:ascii="Calibri" w:hAnsi="Calibri" w:eastAsia="Calibri" w:cs="Calibri" w:asciiTheme="minorAscii" w:hAnsiTheme="minorAscii" w:eastAsiaTheme="minorAscii" w:cstheme="minorAscii"/>
-          <w:noProof w:val="0"/>
-          <w:sz w:val="24"/>
-          <w:szCs w:val="24"/>
-          <w:lang w:val="en-GB"/>
-        </w:rPr>
-        <w:t>I supplied these functions with:</w:t>
-      </w:r>
-    </w:p>
-    <w:p>
-      <w:pPr>
-        <w:pStyle w:val="ListParagraph"/>
-        <w:numPr>
-          <w:ilvl w:val="0"/>
-          <w:numId w:val="2"/>
-        </w:numPr>
-        <w:spacing w:before="0" w:beforeAutospacing="off" w:after="0" w:afterAutospacing="off"/>
-        <w:rPr>
-          <w:rFonts w:ascii="Calibri" w:hAnsi="Calibri" w:eastAsia="Calibri" w:cs="Calibri" w:asciiTheme="minorAscii" w:hAnsiTheme="minorAscii" w:eastAsiaTheme="minorAscii" w:cstheme="minorAscii"/>
-          <w:noProof w:val="0"/>
-          <w:sz w:val="24"/>
-          <w:szCs w:val="24"/>
-          <w:lang w:val="en-GB"/>
-        </w:rPr>
-      </w:pPr>
-      <w:r>
-        <w:rPr>
-          <w:rFonts w:ascii="Calibri" w:hAnsi="Calibri" w:eastAsia="Calibri" w:cs="Calibri" w:asciiTheme="minorAscii" w:hAnsiTheme="minorAscii" w:eastAsiaTheme="minorAscii" w:cstheme="minorAscii"/>
-          <w:noProof w:val="0"/>
-          <w:sz w:val="24"/>
-          <w:szCs w:val="24"/>
-          <w:lang w:val="en-GB"/>
-        </w:rPr>
-        <w:t xml:space="preserve">A </w:t>
-      </w:r>
-      <w:r>
-        <w:rPr>
-          <w:rFonts w:ascii="Calibri" w:hAnsi="Calibri" w:eastAsia="Calibri" w:cs="Calibri" w:asciiTheme="minorAscii" w:hAnsiTheme="minorAscii" w:eastAsiaTheme="minorAscii" w:cstheme="minorAscii"/>
-          <w:noProof w:val="0"/>
-          <w:sz w:val="24"/>
-          <w:szCs w:val="24"/>
-          <w:lang w:val="en-GB"/>
-        </w:rPr>
-        <w:t>series_name</w:t>
-      </w:r>
-      <w:r>
-        <w:rPr>
-          <w:rFonts w:ascii="Calibri" w:hAnsi="Calibri" w:eastAsia="Calibri" w:cs="Calibri" w:asciiTheme="minorAscii" w:hAnsiTheme="minorAscii" w:eastAsiaTheme="minorAscii" w:cstheme="minorAscii"/>
-          <w:noProof w:val="0"/>
-          <w:sz w:val="24"/>
-          <w:szCs w:val="24"/>
-          <w:lang w:val="en-GB"/>
-        </w:rPr>
-        <w:t xml:space="preserve"> (e.g., </w:t>
-      </w:r>
-      <w:r>
-        <w:rPr>
-          <w:rFonts w:ascii="Calibri" w:hAnsi="Calibri" w:eastAsia="Calibri" w:cs="Calibri" w:asciiTheme="minorAscii" w:hAnsiTheme="minorAscii" w:eastAsiaTheme="minorAscii" w:cstheme="minorAscii"/>
-          <w:i w:val="1"/>
-          <w:iCs w:val="1"/>
-          <w:noProof w:val="0"/>
-          <w:sz w:val="24"/>
-          <w:szCs w:val="24"/>
-          <w:lang w:val="en-GB"/>
-        </w:rPr>
-        <w:t>Carbon dioxide (CO₂) emissions from Power Industry</w:t>
-      </w:r>
-      <w:r>
-        <w:rPr>
-          <w:rFonts w:ascii="Calibri" w:hAnsi="Calibri" w:eastAsia="Calibri" w:cs="Calibri" w:asciiTheme="minorAscii" w:hAnsiTheme="minorAscii" w:eastAsiaTheme="minorAscii" w:cstheme="minorAscii"/>
-          <w:noProof w:val="0"/>
-          <w:sz w:val="24"/>
-          <w:szCs w:val="24"/>
-          <w:lang w:val="en-GB"/>
-        </w:rPr>
-        <w:t>)</w:t>
-      </w:r>
-    </w:p>
-    <w:p>
-      <w:pPr>
-        <w:pStyle w:val="ListParagraph"/>
-        <w:numPr>
-          <w:ilvl w:val="0"/>
-          <w:numId w:val="2"/>
-        </w:numPr>
-        <w:spacing w:before="0" w:beforeAutospacing="off" w:after="0" w:afterAutospacing="off"/>
-        <w:rPr>
-          <w:rFonts w:ascii="Calibri" w:hAnsi="Calibri" w:eastAsia="Calibri" w:cs="Calibri" w:asciiTheme="minorAscii" w:hAnsiTheme="minorAscii" w:eastAsiaTheme="minorAscii" w:cstheme="minorAscii"/>
-          <w:noProof w:val="0"/>
-          <w:sz w:val="24"/>
-          <w:szCs w:val="24"/>
-          <w:lang w:val="en-GB"/>
-        </w:rPr>
-      </w:pPr>
-      <w:r>
-        <w:rPr>
-          <w:rFonts w:ascii="Calibri" w:hAnsi="Calibri" w:eastAsia="Calibri" w:cs="Calibri" w:asciiTheme="minorAscii" w:hAnsiTheme="minorAscii" w:eastAsiaTheme="minorAscii" w:cstheme="minorAscii"/>
-          <w:noProof w:val="0"/>
-          <w:sz w:val="24"/>
-          <w:szCs w:val="24"/>
-          <w:lang w:val="en-GB"/>
-        </w:rPr>
-        <w:t xml:space="preserve">An </w:t>
-      </w:r>
-      <w:r>
-        <w:rPr>
-          <w:rFonts w:ascii="Calibri" w:hAnsi="Calibri" w:eastAsia="Calibri" w:cs="Calibri" w:asciiTheme="minorAscii" w:hAnsiTheme="minorAscii" w:eastAsiaTheme="minorAscii" w:cstheme="minorAscii"/>
-          <w:noProof w:val="0"/>
-          <w:sz w:val="24"/>
-          <w:szCs w:val="24"/>
-          <w:lang w:val="en-GB"/>
-        </w:rPr>
-        <w:t>income_level</w:t>
-      </w:r>
-      <w:r>
-        <w:rPr>
-          <w:rFonts w:ascii="Calibri" w:hAnsi="Calibri" w:eastAsia="Calibri" w:cs="Calibri" w:asciiTheme="minorAscii" w:hAnsiTheme="minorAscii" w:eastAsiaTheme="minorAscii" w:cstheme="minorAscii"/>
-          <w:noProof w:val="0"/>
-          <w:sz w:val="24"/>
-          <w:szCs w:val="24"/>
-          <w:lang w:val="en-GB"/>
-        </w:rPr>
-        <w:t xml:space="preserve"> (e.g., </w:t>
-      </w:r>
-      <w:r>
-        <w:rPr>
-          <w:rFonts w:ascii="Calibri" w:hAnsi="Calibri" w:eastAsia="Calibri" w:cs="Calibri" w:asciiTheme="minorAscii" w:hAnsiTheme="minorAscii" w:eastAsiaTheme="minorAscii" w:cstheme="minorAscii"/>
-          <w:i w:val="1"/>
-          <w:iCs w:val="1"/>
-          <w:noProof w:val="0"/>
-          <w:sz w:val="24"/>
-          <w:szCs w:val="24"/>
-          <w:lang w:val="en-GB"/>
-        </w:rPr>
-        <w:t>Low income</w:t>
-      </w:r>
-      <w:r>
-        <w:rPr>
-          <w:rFonts w:ascii="Calibri" w:hAnsi="Calibri" w:eastAsia="Calibri" w:cs="Calibri" w:asciiTheme="minorAscii" w:hAnsiTheme="minorAscii" w:eastAsiaTheme="minorAscii" w:cstheme="minorAscii"/>
-          <w:noProof w:val="0"/>
-          <w:sz w:val="24"/>
-          <w:szCs w:val="24"/>
-          <w:lang w:val="en-GB"/>
-        </w:rPr>
-        <w:t>)</w:t>
-      </w:r>
-    </w:p>
-    <w:p>
-      <w:pPr>
-        <w:spacing w:before="240" w:beforeAutospacing="off" w:after="240" w:afterAutospacing="off"/>
-        <w:rPr>
-          <w:rFonts w:ascii="Calibri" w:hAnsi="Calibri" w:eastAsia="Calibri" w:cs="Calibri" w:asciiTheme="minorAscii" w:hAnsiTheme="minorAscii" w:eastAsiaTheme="minorAscii" w:cstheme="minorAscii"/>
-          <w:noProof w:val="0"/>
-          <w:sz w:val="24"/>
-          <w:szCs w:val="24"/>
-          <w:lang w:val="en-GB"/>
-        </w:rPr>
-      </w:pPr>
-      <w:r>
-        <w:rPr>
-          <w:rFonts w:ascii="Calibri" w:hAnsi="Calibri" w:eastAsia="Calibri" w:cs="Calibri" w:asciiTheme="minorAscii" w:hAnsiTheme="minorAscii" w:eastAsiaTheme="minorAscii" w:cstheme="minorAscii"/>
-          <w:noProof w:val="0"/>
-          <w:sz w:val="24"/>
-          <w:szCs w:val="24"/>
-          <w:lang w:val="en-GB"/>
-        </w:rPr>
-        <w:t>Inside each function:</w:t>
-      </w:r>
-    </w:p>
-    <w:p>
-      <w:pPr>
-        <w:pStyle w:val="ListParagraph"/>
-        <w:numPr>
-          <w:ilvl w:val="0"/>
-          <w:numId w:val="3"/>
-        </w:numPr>
-        <w:spacing w:before="0" w:beforeAutospacing="off" w:after="0" w:afterAutospacing="off"/>
-        <w:rPr>
-          <w:rFonts w:ascii="Calibri" w:hAnsi="Calibri" w:eastAsia="Calibri" w:cs="Calibri" w:asciiTheme="minorAscii" w:hAnsiTheme="minorAscii" w:eastAsiaTheme="minorAscii" w:cstheme="minorAscii"/>
-          <w:noProof w:val="0"/>
-          <w:sz w:val="24"/>
-          <w:szCs w:val="24"/>
-          <w:lang w:val="en-GB"/>
-        </w:rPr>
-      </w:pPr>
-      <w:r>
-        <w:rPr>
-          <w:rFonts w:ascii="Calibri" w:hAnsi="Calibri" w:eastAsia="Calibri" w:cs="Calibri" w:asciiTheme="minorAscii" w:hAnsiTheme="minorAscii" w:eastAsiaTheme="minorAscii" w:cstheme="minorAscii"/>
-          <w:noProof w:val="0"/>
-          <w:sz w:val="24"/>
-          <w:szCs w:val="24"/>
-          <w:lang w:val="en-GB"/>
-        </w:rPr>
-        <w:t xml:space="preserve">I </w:t>
-      </w:r>
-      <w:r>
-        <w:rPr>
-          <w:rFonts w:ascii="Calibri" w:hAnsi="Calibri" w:eastAsia="Calibri" w:cs="Calibri" w:asciiTheme="minorAscii" w:hAnsiTheme="minorAscii" w:eastAsiaTheme="minorAscii" w:cstheme="minorAscii"/>
-          <w:b w:val="1"/>
-          <w:bCs w:val="1"/>
-          <w:noProof w:val="0"/>
-          <w:sz w:val="24"/>
-          <w:szCs w:val="24"/>
-          <w:lang w:val="en-GB"/>
-        </w:rPr>
-        <w:t>filtered</w:t>
-      </w:r>
-      <w:r>
-        <w:rPr>
-          <w:rFonts w:ascii="Calibri" w:hAnsi="Calibri" w:eastAsia="Calibri" w:cs="Calibri" w:asciiTheme="minorAscii" w:hAnsiTheme="minorAscii" w:eastAsiaTheme="minorAscii" w:cstheme="minorAscii"/>
-          <w:noProof w:val="0"/>
-          <w:sz w:val="24"/>
-          <w:szCs w:val="24"/>
-          <w:lang w:val="en-GB"/>
-        </w:rPr>
-        <w:t xml:space="preserve"> the dataset using </w:t>
-      </w:r>
-      <w:r>
-        <w:rPr>
-          <w:rFonts w:ascii="Calibri" w:hAnsi="Calibri" w:eastAsia="Calibri" w:cs="Calibri" w:asciiTheme="minorAscii" w:hAnsiTheme="minorAscii" w:eastAsiaTheme="minorAscii" w:cstheme="minorAscii"/>
-          <w:noProof w:val="0"/>
-          <w:sz w:val="24"/>
-          <w:szCs w:val="24"/>
-          <w:lang w:val="en-GB"/>
-        </w:rPr>
-        <w:t>boolean</w:t>
-      </w:r>
-      <w:r>
-        <w:rPr>
-          <w:rFonts w:ascii="Calibri" w:hAnsi="Calibri" w:eastAsia="Calibri" w:cs="Calibri" w:asciiTheme="minorAscii" w:hAnsiTheme="minorAscii" w:eastAsiaTheme="minorAscii" w:cstheme="minorAscii"/>
-          <w:noProof w:val="0"/>
-          <w:sz w:val="24"/>
-          <w:szCs w:val="24"/>
-          <w:lang w:val="en-GB"/>
-        </w:rPr>
-        <w:t xml:space="preserve"> masking</w:t>
-      </w:r>
-    </w:p>
-    <w:p>
-      <w:pPr>
-        <w:pStyle w:val="ListParagraph"/>
-        <w:numPr>
-          <w:ilvl w:val="0"/>
-          <w:numId w:val="3"/>
-        </w:numPr>
-        <w:spacing w:before="0" w:beforeAutospacing="off" w:after="0" w:afterAutospacing="off"/>
-        <w:rPr>
-          <w:rFonts w:ascii="Calibri" w:hAnsi="Calibri" w:eastAsia="Calibri" w:cs="Calibri" w:asciiTheme="minorAscii" w:hAnsiTheme="minorAscii" w:eastAsiaTheme="minorAscii" w:cstheme="minorAscii"/>
-          <w:noProof w:val="0"/>
-          <w:sz w:val="24"/>
-          <w:szCs w:val="24"/>
-          <w:lang w:val="en-GB"/>
-        </w:rPr>
-      </w:pPr>
-      <w:r>
-        <w:rPr>
-          <w:rFonts w:ascii="Calibri" w:hAnsi="Calibri" w:eastAsia="Calibri" w:cs="Calibri" w:asciiTheme="minorAscii" w:hAnsiTheme="minorAscii" w:eastAsiaTheme="minorAscii" w:cstheme="minorAscii"/>
-          <w:noProof w:val="0"/>
-          <w:sz w:val="24"/>
-          <w:szCs w:val="24"/>
-          <w:lang w:val="en-GB"/>
-        </w:rPr>
-        <w:t xml:space="preserve">I </w:t>
-      </w:r>
-      <w:r>
-        <w:rPr>
-          <w:rFonts w:ascii="Calibri" w:hAnsi="Calibri" w:eastAsia="Calibri" w:cs="Calibri" w:asciiTheme="minorAscii" w:hAnsiTheme="minorAscii" w:eastAsiaTheme="minorAscii" w:cstheme="minorAscii"/>
-          <w:b w:val="1"/>
-          <w:bCs w:val="1"/>
-          <w:noProof w:val="0"/>
-          <w:sz w:val="24"/>
-          <w:szCs w:val="24"/>
-          <w:lang w:val="en-GB"/>
-        </w:rPr>
-        <w:t>converted year columns to numeric</w:t>
-      </w:r>
-      <w:r>
-        <w:rPr>
-          <w:rFonts w:ascii="Calibri" w:hAnsi="Calibri" w:eastAsia="Calibri" w:cs="Calibri" w:asciiTheme="minorAscii" w:hAnsiTheme="minorAscii" w:eastAsiaTheme="minorAscii" w:cstheme="minorAscii"/>
-          <w:noProof w:val="0"/>
-          <w:sz w:val="24"/>
-          <w:szCs w:val="24"/>
-          <w:lang w:val="en-GB"/>
-        </w:rPr>
-        <w:t xml:space="preserve"> using </w:t>
-      </w:r>
-      <w:r>
-        <w:rPr>
-          <w:rFonts w:ascii="Calibri" w:hAnsi="Calibri" w:eastAsia="Calibri" w:cs="Calibri" w:asciiTheme="minorAscii" w:hAnsiTheme="minorAscii" w:eastAsiaTheme="minorAscii" w:cstheme="minorAscii"/>
-          <w:noProof w:val="0"/>
-          <w:sz w:val="24"/>
-          <w:szCs w:val="24"/>
-          <w:lang w:val="en-GB"/>
-        </w:rPr>
-        <w:t>pd.to_numeric</w:t>
-      </w:r>
-      <w:r>
-        <w:rPr>
-          <w:rFonts w:ascii="Calibri" w:hAnsi="Calibri" w:eastAsia="Calibri" w:cs="Calibri" w:asciiTheme="minorAscii" w:hAnsiTheme="minorAscii" w:eastAsiaTheme="minorAscii" w:cstheme="minorAscii"/>
-          <w:noProof w:val="0"/>
-          <w:sz w:val="24"/>
-          <w:szCs w:val="24"/>
-          <w:lang w:val="en-GB"/>
-        </w:rPr>
-        <w:t>(errors="coerce")</w:t>
-      </w:r>
-    </w:p>
-    <w:p>
-      <w:pPr>
-        <w:pStyle w:val="ListParagraph"/>
-        <w:numPr>
-          <w:ilvl w:val="0"/>
-          <w:numId w:val="3"/>
-        </w:numPr>
-        <w:spacing w:before="0" w:beforeAutospacing="off" w:after="0" w:afterAutospacing="off"/>
-        <w:rPr>
-          <w:rFonts w:ascii="Calibri" w:hAnsi="Calibri" w:eastAsia="Calibri" w:cs="Calibri" w:asciiTheme="minorAscii" w:hAnsiTheme="minorAscii" w:eastAsiaTheme="minorAscii" w:cstheme="minorAscii"/>
-          <w:noProof w:val="0"/>
-          <w:sz w:val="24"/>
-          <w:szCs w:val="24"/>
-          <w:lang w:val="en-GB"/>
-        </w:rPr>
-      </w:pPr>
-      <w:r>
-        <w:rPr>
-          <w:rFonts w:ascii="Calibri" w:hAnsi="Calibri" w:eastAsia="Calibri" w:cs="Calibri" w:asciiTheme="minorAscii" w:hAnsiTheme="minorAscii" w:eastAsiaTheme="minorAscii" w:cstheme="minorAscii"/>
-          <w:noProof w:val="0"/>
-          <w:sz w:val="24"/>
-          <w:szCs w:val="24"/>
-          <w:lang w:val="en-GB"/>
-        </w:rPr>
-        <w:t xml:space="preserve">In line plots, I iterated over each country’s row and plotted all countries’ trends using a loop with </w:t>
-      </w:r>
-      <w:r>
-        <w:rPr>
-          <w:rFonts w:ascii="Calibri" w:hAnsi="Calibri" w:eastAsia="Calibri" w:cs="Calibri" w:asciiTheme="minorAscii" w:hAnsiTheme="minorAscii" w:eastAsiaTheme="minorAscii" w:cstheme="minorAscii"/>
-          <w:noProof w:val="0"/>
-          <w:sz w:val="24"/>
-          <w:szCs w:val="24"/>
-          <w:lang w:val="en-GB"/>
-        </w:rPr>
-        <w:t>plt.plot</w:t>
-      </w:r>
-      <w:r>
-        <w:rPr>
-          <w:rFonts w:ascii="Calibri" w:hAnsi="Calibri" w:eastAsia="Calibri" w:cs="Calibri" w:asciiTheme="minorAscii" w:hAnsiTheme="minorAscii" w:eastAsiaTheme="minorAscii" w:cstheme="minorAscii"/>
-          <w:noProof w:val="0"/>
-          <w:sz w:val="24"/>
-          <w:szCs w:val="24"/>
-          <w:lang w:val="en-GB"/>
-        </w:rPr>
-        <w:t>()</w:t>
-      </w:r>
-    </w:p>
-    <w:p>
-      <w:pPr>
-        <w:pStyle w:val="ListParagraph"/>
-        <w:numPr>
-          <w:ilvl w:val="0"/>
-          <w:numId w:val="3"/>
-        </w:numPr>
-        <w:spacing w:before="0" w:beforeAutospacing="off" w:after="0" w:afterAutospacing="off"/>
-        <w:rPr>
-          <w:rFonts w:ascii="Calibri" w:hAnsi="Calibri" w:eastAsia="Calibri" w:cs="Calibri" w:asciiTheme="minorAscii" w:hAnsiTheme="minorAscii" w:eastAsiaTheme="minorAscii" w:cstheme="minorAscii"/>
-          <w:noProof w:val="0"/>
-          <w:sz w:val="24"/>
-          <w:szCs w:val="24"/>
-          <w:lang w:val="en-GB"/>
-        </w:rPr>
-      </w:pPr>
-      <w:r>
-        <w:rPr>
-          <w:rFonts w:ascii="Calibri" w:hAnsi="Calibri" w:eastAsia="Calibri" w:cs="Calibri" w:asciiTheme="minorAscii" w:hAnsiTheme="minorAscii" w:eastAsiaTheme="minorAscii" w:cstheme="minorAscii"/>
-          <w:noProof w:val="0"/>
-          <w:sz w:val="24"/>
-          <w:szCs w:val="24"/>
-          <w:lang w:val="en-GB"/>
-        </w:rPr>
-        <w:t xml:space="preserve">In bar plots, I aggregated yearly means using </w:t>
-      </w:r>
-      <w:r>
-        <w:rPr>
-          <w:rFonts w:ascii="Calibri" w:hAnsi="Calibri" w:eastAsia="Calibri" w:cs="Calibri" w:asciiTheme="minorAscii" w:hAnsiTheme="minorAscii" w:eastAsiaTheme="minorAscii" w:cstheme="minorAscii"/>
-          <w:noProof w:val="0"/>
-          <w:sz w:val="24"/>
-          <w:szCs w:val="24"/>
-          <w:lang w:val="en-GB"/>
-        </w:rPr>
-        <w:t>mean().</w:t>
-      </w:r>
-      <w:r>
-        <w:rPr>
-          <w:rFonts w:ascii="Calibri" w:hAnsi="Calibri" w:eastAsia="Calibri" w:cs="Calibri" w:asciiTheme="minorAscii" w:hAnsiTheme="minorAscii" w:eastAsiaTheme="minorAscii" w:cstheme="minorAscii"/>
-          <w:noProof w:val="0"/>
-          <w:sz w:val="24"/>
-          <w:szCs w:val="24"/>
-          <w:lang w:val="en-GB"/>
-        </w:rPr>
-        <w:t>reset_index</w:t>
-      </w:r>
-      <w:r>
-        <w:rPr>
-          <w:rFonts w:ascii="Calibri" w:hAnsi="Calibri" w:eastAsia="Calibri" w:cs="Calibri" w:asciiTheme="minorAscii" w:hAnsiTheme="minorAscii" w:eastAsiaTheme="minorAscii" w:cstheme="minorAscii"/>
-          <w:noProof w:val="0"/>
-          <w:sz w:val="24"/>
-          <w:szCs w:val="24"/>
-          <w:lang w:val="en-GB"/>
-        </w:rPr>
-        <w:t>()</w:t>
-      </w:r>
-      <w:r>
-        <w:rPr>
-          <w:rFonts w:ascii="Calibri" w:hAnsi="Calibri" w:eastAsia="Calibri" w:cs="Calibri" w:asciiTheme="minorAscii" w:hAnsiTheme="minorAscii" w:eastAsiaTheme="minorAscii" w:cstheme="minorAscii"/>
-          <w:noProof w:val="0"/>
-          <w:sz w:val="24"/>
-          <w:szCs w:val="24"/>
-          <w:lang w:val="en-GB"/>
-        </w:rPr>
-        <w:t xml:space="preserve"> and visualized them using </w:t>
-      </w:r>
-      <w:r>
-        <w:rPr>
-          <w:rFonts w:ascii="Calibri" w:hAnsi="Calibri" w:eastAsia="Calibri" w:cs="Calibri" w:asciiTheme="minorAscii" w:hAnsiTheme="minorAscii" w:eastAsiaTheme="minorAscii" w:cstheme="minorAscii"/>
-          <w:noProof w:val="0"/>
-          <w:sz w:val="24"/>
-          <w:szCs w:val="24"/>
-          <w:lang w:val="en-GB"/>
-        </w:rPr>
-        <w:t>sns.barplot</w:t>
-      </w:r>
-      <w:r>
-        <w:rPr>
-          <w:rFonts w:ascii="Calibri" w:hAnsi="Calibri" w:eastAsia="Calibri" w:cs="Calibri" w:asciiTheme="minorAscii" w:hAnsiTheme="minorAscii" w:eastAsiaTheme="minorAscii" w:cstheme="minorAscii"/>
-          <w:noProof w:val="0"/>
-          <w:sz w:val="24"/>
-          <w:szCs w:val="24"/>
-          <w:lang w:val="en-GB"/>
-        </w:rPr>
-        <w:t>()</w:t>
-      </w:r>
-      <w:r>
-        <w:rPr>
-          <w:rFonts w:ascii="Calibri" w:hAnsi="Calibri" w:eastAsia="Calibri" w:cs="Calibri" w:asciiTheme="minorAscii" w:hAnsiTheme="minorAscii" w:eastAsiaTheme="minorAscii" w:cstheme="minorAscii"/>
-          <w:noProof w:val="0"/>
-          <w:sz w:val="24"/>
-          <w:szCs w:val="24"/>
-          <w:lang w:val="en-GB"/>
-        </w:rPr>
-        <w:t xml:space="preserve"> with </w:t>
-      </w:r>
-      <w:r>
-        <w:rPr>
-          <w:rFonts w:ascii="Calibri" w:hAnsi="Calibri" w:eastAsia="Calibri" w:cs="Calibri" w:asciiTheme="minorAscii" w:hAnsiTheme="minorAscii" w:eastAsiaTheme="minorAscii" w:cstheme="minorAscii"/>
-          <w:noProof w:val="0"/>
-          <w:sz w:val="24"/>
-          <w:szCs w:val="24"/>
-          <w:lang w:val="en-GB"/>
-        </w:rPr>
-        <w:t>color</w:t>
-      </w:r>
-      <w:r>
-        <w:rPr>
-          <w:rFonts w:ascii="Calibri" w:hAnsi="Calibri" w:eastAsia="Calibri" w:cs="Calibri" w:asciiTheme="minorAscii" w:hAnsiTheme="minorAscii" w:eastAsiaTheme="minorAscii" w:cstheme="minorAscii"/>
-          <w:noProof w:val="0"/>
-          <w:sz w:val="24"/>
-          <w:szCs w:val="24"/>
-          <w:lang w:val="en-GB"/>
-        </w:rPr>
-        <w:t xml:space="preserve"> palettes and legends</w:t>
-      </w:r>
-    </w:p>
-    <w:p>
-      <w:pPr>
-        <w:pStyle w:val="ListParagraph"/>
-        <w:numPr>
-          <w:ilvl w:val="0"/>
-          <w:numId w:val="3"/>
-        </w:numPr>
-        <w:spacing w:before="0" w:beforeAutospacing="off" w:after="0" w:afterAutospacing="off"/>
-        <w:rPr>
-          <w:rFonts w:ascii="Calibri" w:hAnsi="Calibri" w:eastAsia="Calibri" w:cs="Calibri" w:asciiTheme="minorAscii" w:hAnsiTheme="minorAscii" w:eastAsiaTheme="minorAscii" w:cstheme="minorAscii"/>
-          <w:noProof w:val="0"/>
-          <w:sz w:val="24"/>
-          <w:szCs w:val="24"/>
-          <w:lang w:val="en-GB"/>
-        </w:rPr>
-      </w:pPr>
-      <w:r>
-        <w:rPr>
-          <w:rFonts w:ascii="Calibri" w:hAnsi="Calibri" w:eastAsia="Calibri" w:cs="Calibri" w:asciiTheme="minorAscii" w:hAnsiTheme="minorAscii" w:eastAsiaTheme="minorAscii" w:cstheme="minorAscii"/>
-          <w:noProof w:val="0"/>
-          <w:sz w:val="24"/>
-          <w:szCs w:val="24"/>
-          <w:lang w:val="en-GB"/>
-        </w:rPr>
-        <w:t xml:space="preserve">In box plots, I transposed the </w:t>
-      </w:r>
-      <w:r>
-        <w:rPr>
-          <w:rFonts w:ascii="Calibri" w:hAnsi="Calibri" w:eastAsia="Calibri" w:cs="Calibri" w:asciiTheme="minorAscii" w:hAnsiTheme="minorAscii" w:eastAsiaTheme="minorAscii" w:cstheme="minorAscii"/>
-          <w:noProof w:val="0"/>
-          <w:sz w:val="24"/>
-          <w:szCs w:val="24"/>
-          <w:lang w:val="en-GB"/>
-        </w:rPr>
-        <w:t>dataframe</w:t>
-      </w:r>
-      <w:r>
-        <w:rPr>
-          <w:rFonts w:ascii="Calibri" w:hAnsi="Calibri" w:eastAsia="Calibri" w:cs="Calibri" w:asciiTheme="minorAscii" w:hAnsiTheme="minorAscii" w:eastAsiaTheme="minorAscii" w:cstheme="minorAscii"/>
-          <w:noProof w:val="0"/>
-          <w:sz w:val="24"/>
-          <w:szCs w:val="24"/>
-          <w:lang w:val="en-GB"/>
-        </w:rPr>
-        <w:t xml:space="preserve"> to visualize distributions per year using </w:t>
-      </w:r>
-      <w:r>
-        <w:rPr>
-          <w:rFonts w:ascii="Calibri" w:hAnsi="Calibri" w:eastAsia="Calibri" w:cs="Calibri" w:asciiTheme="minorAscii" w:hAnsiTheme="minorAscii" w:eastAsiaTheme="minorAscii" w:cstheme="minorAscii"/>
-          <w:noProof w:val="0"/>
-          <w:sz w:val="24"/>
-          <w:szCs w:val="24"/>
-          <w:lang w:val="en-GB"/>
-        </w:rPr>
-        <w:t>sns.boxplot</w:t>
-      </w:r>
-      <w:r>
-        <w:rPr>
-          <w:rFonts w:ascii="Calibri" w:hAnsi="Calibri" w:eastAsia="Calibri" w:cs="Calibri" w:asciiTheme="minorAscii" w:hAnsiTheme="minorAscii" w:eastAsiaTheme="minorAscii" w:cstheme="minorAscii"/>
-          <w:noProof w:val="0"/>
-          <w:sz w:val="24"/>
-          <w:szCs w:val="24"/>
-          <w:lang w:val="en-GB"/>
-        </w:rPr>
-        <w:t>()</w:t>
-      </w:r>
-    </w:p>
-    <w:p>
-      <w:pPr>
-        <w:spacing w:before="240" w:beforeAutospacing="off" w:after="240" w:afterAutospacing="off"/>
-        <w:rPr>
-          <w:rFonts w:ascii="Calibri" w:hAnsi="Calibri" w:eastAsia="Calibri" w:cs="Calibri" w:asciiTheme="minorAscii" w:hAnsiTheme="minorAscii" w:eastAsiaTheme="minorAscii" w:cstheme="minorAscii"/>
-          <w:noProof w:val="0"/>
-          <w:sz w:val="24"/>
-          <w:szCs w:val="24"/>
-          <w:lang w:val="en-GB"/>
-        </w:rPr>
-      </w:pPr>
-      <w:r>
-        <w:rPr>
-          <w:rFonts w:ascii="Calibri" w:hAnsi="Calibri" w:eastAsia="Calibri" w:cs="Calibri" w:asciiTheme="minorAscii" w:hAnsiTheme="minorAscii" w:eastAsiaTheme="minorAscii" w:cstheme="minorAscii"/>
-          <w:noProof w:val="0"/>
-          <w:sz w:val="24"/>
-          <w:szCs w:val="24"/>
-          <w:lang w:val="en-GB"/>
-        </w:rPr>
-        <w:t xml:space="preserve">I looped through </w:t>
-      </w:r>
-      <w:r>
-        <w:rPr>
-          <w:rFonts w:ascii="Calibri" w:hAnsi="Calibri" w:eastAsia="Calibri" w:cs="Calibri" w:asciiTheme="minorAscii" w:hAnsiTheme="minorAscii" w:eastAsiaTheme="minorAscii" w:cstheme="minorAscii"/>
-          <w:b w:val="1"/>
-          <w:bCs w:val="1"/>
-          <w:noProof w:val="0"/>
-          <w:sz w:val="24"/>
-          <w:szCs w:val="24"/>
-          <w:lang w:val="en-GB"/>
-        </w:rPr>
-        <w:t>9 carefully selected CO₂ emissions series</w:t>
-      </w:r>
-      <w:r>
-        <w:rPr>
-          <w:rFonts w:ascii="Calibri" w:hAnsi="Calibri" w:eastAsia="Calibri" w:cs="Calibri" w:asciiTheme="minorAscii" w:hAnsiTheme="minorAscii" w:eastAsiaTheme="minorAscii" w:cstheme="minorAscii"/>
-          <w:noProof w:val="0"/>
-          <w:sz w:val="24"/>
-          <w:szCs w:val="24"/>
-          <w:lang w:val="en-GB"/>
-        </w:rPr>
-        <w:t xml:space="preserve"> (e.g., total emissions, per capita emissions, sector-specific emissions, carbon intensity of GDP, etc.) for </w:t>
-      </w:r>
-      <w:r>
-        <w:rPr>
-          <w:rFonts w:ascii="Calibri" w:hAnsi="Calibri" w:eastAsia="Calibri" w:cs="Calibri" w:asciiTheme="minorAscii" w:hAnsiTheme="minorAscii" w:eastAsiaTheme="minorAscii" w:cstheme="minorAscii"/>
-          <w:b w:val="1"/>
-          <w:bCs w:val="1"/>
-          <w:noProof w:val="0"/>
-          <w:sz w:val="24"/>
-          <w:szCs w:val="24"/>
-          <w:lang w:val="en-GB"/>
-        </w:rPr>
-        <w:t>each of the three income groups</w:t>
-      </w:r>
-      <w:r>
-        <w:rPr>
-          <w:rFonts w:ascii="Calibri" w:hAnsi="Calibri" w:eastAsia="Calibri" w:cs="Calibri" w:asciiTheme="minorAscii" w:hAnsiTheme="minorAscii" w:eastAsiaTheme="minorAscii" w:cstheme="minorAscii"/>
-          <w:noProof w:val="0"/>
-          <w:sz w:val="24"/>
-          <w:szCs w:val="24"/>
-          <w:lang w:val="en-GB"/>
-        </w:rPr>
-        <w:t>. This gave me 81 plots in total and a rich set of visual trends to interpret.</w:t>
-      </w:r>
-    </w:p>
-    <w:p>
-      <w:pPr>
-        <w:rPr>
-          <w:rFonts w:ascii="Calibri" w:hAnsi="Calibri" w:eastAsia="Calibri" w:cs="Calibri" w:asciiTheme="minorAscii" w:hAnsiTheme="minorAscii" w:eastAsiaTheme="minorAscii" w:cstheme="minorAscii"/>
-        </w:rPr>
-      </w:pPr>
-    </w:p>
-    <w:p>
-      <w:pPr>
         <w:pStyle w:val="Heading3"/>
         <w:spacing w:before="281" w:beforeAutospacing="off" w:after="281" w:afterAutospacing="off"/>
         <w:rPr>
@@ -7004,832 +5505,6 @@
     </w:p>
     <w:p>
       <w:pPr>
-        <w:rPr>
-          <w:rFonts w:ascii="Calibri" w:hAnsi="Calibri" w:eastAsia="Calibri" w:cs="Calibri" w:asciiTheme="minorAscii" w:hAnsiTheme="minorAscii" w:eastAsiaTheme="minorAscii" w:cstheme="minorAscii"/>
-        </w:rPr>
-      </w:pPr>
-    </w:p>
-    <w:p>
-      <w:pPr>
-        <w:pStyle w:val="Heading3"/>
-        <w:spacing w:before="281" w:beforeAutospacing="off" w:after="281" w:afterAutospacing="off"/>
-        <w:rPr>
-          <w:rFonts w:ascii="Calibri" w:hAnsi="Calibri" w:eastAsia="Calibri" w:cs="Calibri"/>
-          <w:b w:val="1"/>
-          <w:bCs w:val="1"/>
-          <w:noProof w:val="0"/>
-          <w:color w:val="auto"/>
-          <w:sz w:val="28"/>
-          <w:szCs w:val="28"/>
-          <w:lang w:val="en-GB"/>
-        </w:rPr>
-      </w:pPr>
-      <w:r>
-        <w:rPr>
-          <w:rFonts w:ascii="Calibri" w:hAnsi="Calibri" w:eastAsia="Calibri" w:cs="Calibri"/>
-          <w:b w:val="1"/>
-          <w:bCs w:val="1"/>
-          <w:noProof w:val="0"/>
-          <w:color w:val="auto"/>
-          <w:sz w:val="28"/>
-          <w:szCs w:val="28"/>
-          <w:lang w:val="en-GB"/>
-        </w:rPr>
-        <w:t>Income-Based Correlation Analysis</w:t>
-      </w:r>
-    </w:p>
-    <w:p>
-      <w:pPr>
-        <w:spacing w:before="240" w:beforeAutospacing="off" w:after="240" w:afterAutospacing="off"/>
-      </w:pPr>
-      <w:r>
-        <w:rPr>
-          <w:rFonts w:ascii="Calibri" w:hAnsi="Calibri" w:eastAsia="Calibri" w:cs="Calibri"/>
-          <w:noProof w:val="0"/>
-          <w:sz w:val="24"/>
-          <w:szCs w:val="24"/>
-          <w:lang w:val="en-GB"/>
-        </w:rPr>
-        <w:t xml:space="preserve">Using the series from the research blocks, I built a function </w:t>
-      </w:r>
-      <w:r>
-        <w:rPr>
-          <w:rFonts w:ascii="Consolas" w:hAnsi="Consolas" w:eastAsia="Consolas" w:cs="Consolas"/>
-          <w:noProof w:val="0"/>
-          <w:sz w:val="24"/>
-          <w:szCs w:val="24"/>
-          <w:lang w:val="en-GB"/>
-        </w:rPr>
-        <w:t>plot_correlation_by_income()</w:t>
-      </w:r>
-      <w:r>
-        <w:rPr>
-          <w:rFonts w:ascii="Calibri" w:hAnsi="Calibri" w:eastAsia="Calibri" w:cs="Calibri"/>
-          <w:noProof w:val="0"/>
-          <w:sz w:val="24"/>
-          <w:szCs w:val="24"/>
-          <w:lang w:val="en-GB"/>
-        </w:rPr>
-        <w:t xml:space="preserve"> that:</w:t>
-      </w:r>
-    </w:p>
-    <w:p>
-      <w:pPr>
-        <w:pStyle w:val="ListParagraph"/>
-        <w:numPr>
-          <w:ilvl w:val="0"/>
-          <w:numId w:val="19"/>
-        </w:numPr>
-        <w:spacing w:before="240" w:beforeAutospacing="off" w:after="240" w:afterAutospacing="off"/>
-        <w:rPr>
-          <w:rFonts w:ascii="Calibri" w:hAnsi="Calibri" w:eastAsia="Calibri" w:cs="Calibri"/>
-          <w:noProof w:val="0"/>
-          <w:sz w:val="24"/>
-          <w:szCs w:val="24"/>
-          <w:lang w:val="en-GB"/>
-        </w:rPr>
-      </w:pPr>
-      <w:r>
-        <w:rPr>
-          <w:rFonts w:ascii="Calibri" w:hAnsi="Calibri" w:eastAsia="Calibri" w:cs="Calibri"/>
-          <w:noProof w:val="0"/>
-          <w:sz w:val="24"/>
-          <w:szCs w:val="24"/>
-          <w:lang w:val="en-GB"/>
-        </w:rPr>
-        <w:t>Filtered rows based on income level and relevant series</w:t>
-      </w:r>
-    </w:p>
-    <w:p>
-      <w:pPr>
-        <w:pStyle w:val="ListParagraph"/>
-        <w:numPr>
-          <w:ilvl w:val="0"/>
-          <w:numId w:val="19"/>
-        </w:numPr>
-        <w:spacing w:before="240" w:beforeAutospacing="off" w:after="240" w:afterAutospacing="off"/>
-        <w:rPr>
-          <w:rFonts w:ascii="Calibri" w:hAnsi="Calibri" w:eastAsia="Calibri" w:cs="Calibri"/>
-          <w:noProof w:val="0"/>
-          <w:sz w:val="24"/>
-          <w:szCs w:val="24"/>
-          <w:lang w:val="en-GB"/>
-        </w:rPr>
-      </w:pPr>
-      <w:r>
-        <w:rPr>
-          <w:rFonts w:ascii="Calibri" w:hAnsi="Calibri" w:eastAsia="Calibri" w:cs="Calibri"/>
-          <w:noProof w:val="0"/>
-          <w:sz w:val="24"/>
-          <w:szCs w:val="24"/>
-          <w:lang w:val="en-GB"/>
-        </w:rPr>
-        <w:t>Converted year columns to numeric</w:t>
-      </w:r>
-    </w:p>
-    <w:p>
-      <w:pPr>
-        <w:pStyle w:val="ListParagraph"/>
-        <w:numPr>
-          <w:ilvl w:val="0"/>
-          <w:numId w:val="19"/>
-        </w:numPr>
-        <w:spacing w:before="240" w:beforeAutospacing="off" w:after="240" w:afterAutospacing="off"/>
-        <w:rPr>
-          <w:rFonts w:ascii="Calibri" w:hAnsi="Calibri" w:eastAsia="Calibri" w:cs="Calibri"/>
-          <w:noProof w:val="0"/>
-          <w:sz w:val="24"/>
-          <w:szCs w:val="24"/>
-          <w:lang w:val="en-GB"/>
-        </w:rPr>
-      </w:pPr>
-      <w:r>
-        <w:rPr>
-          <w:rFonts w:ascii="Calibri" w:hAnsi="Calibri" w:eastAsia="Calibri" w:cs="Calibri"/>
-          <w:noProof w:val="0"/>
-          <w:sz w:val="24"/>
-          <w:szCs w:val="24"/>
-          <w:lang w:val="en-GB"/>
-        </w:rPr>
-        <w:t>Computed a row-wise average for each indicator per country (</w:t>
-      </w:r>
-      <w:r>
-        <w:rPr>
-          <w:rFonts w:ascii="Consolas" w:hAnsi="Consolas" w:eastAsia="Consolas" w:cs="Consolas"/>
-          <w:noProof w:val="0"/>
-          <w:sz w:val="24"/>
-          <w:szCs w:val="24"/>
-          <w:lang w:val="en-GB"/>
-        </w:rPr>
-        <w:t>Series Avg</w:t>
-      </w:r>
-      <w:r>
-        <w:rPr>
-          <w:rFonts w:ascii="Calibri" w:hAnsi="Calibri" w:eastAsia="Calibri" w:cs="Calibri"/>
-          <w:noProof w:val="0"/>
-          <w:sz w:val="24"/>
-          <w:szCs w:val="24"/>
-          <w:lang w:val="en-GB"/>
-        </w:rPr>
-        <w:t>)</w:t>
-      </w:r>
-    </w:p>
-    <w:p>
-      <w:pPr>
-        <w:pStyle w:val="ListParagraph"/>
-        <w:numPr>
-          <w:ilvl w:val="0"/>
-          <w:numId w:val="19"/>
-        </w:numPr>
-        <w:spacing w:before="240" w:beforeAutospacing="off" w:after="240" w:afterAutospacing="off"/>
-        <w:rPr>
-          <w:rFonts w:ascii="Calibri" w:hAnsi="Calibri" w:eastAsia="Calibri" w:cs="Calibri"/>
-          <w:noProof w:val="0"/>
-          <w:sz w:val="24"/>
-          <w:szCs w:val="24"/>
-          <w:lang w:val="en-GB"/>
-        </w:rPr>
-      </w:pPr>
-      <w:r>
-        <w:rPr>
-          <w:rFonts w:ascii="Calibri" w:hAnsi="Calibri" w:eastAsia="Calibri" w:cs="Calibri"/>
-          <w:noProof w:val="0"/>
-          <w:sz w:val="24"/>
-          <w:szCs w:val="24"/>
-          <w:lang w:val="en-GB"/>
-        </w:rPr>
-        <w:t xml:space="preserve">Pivoted the dataframe using </w:t>
-      </w:r>
-      <w:r>
-        <w:rPr>
-          <w:rFonts w:ascii="Consolas" w:hAnsi="Consolas" w:eastAsia="Consolas" w:cs="Consolas"/>
-          <w:noProof w:val="0"/>
-          <w:sz w:val="24"/>
-          <w:szCs w:val="24"/>
-          <w:lang w:val="en-GB"/>
-        </w:rPr>
-        <w:t>pivot_table()</w:t>
-      </w:r>
-      <w:r>
-        <w:rPr>
-          <w:rFonts w:ascii="Calibri" w:hAnsi="Calibri" w:eastAsia="Calibri" w:cs="Calibri"/>
-          <w:noProof w:val="0"/>
-          <w:sz w:val="24"/>
-          <w:szCs w:val="24"/>
-          <w:lang w:val="en-GB"/>
-        </w:rPr>
-        <w:t xml:space="preserve"> so each row represented a country, and each column an indicator</w:t>
-      </w:r>
-    </w:p>
-    <w:p>
-      <w:pPr>
-        <w:spacing w:before="240" w:beforeAutospacing="off" w:after="240" w:afterAutospacing="off"/>
-      </w:pPr>
-      <w:r>
-        <w:rPr>
-          <w:rFonts w:ascii="Calibri" w:hAnsi="Calibri" w:eastAsia="Calibri" w:cs="Calibri"/>
-          <w:noProof w:val="0"/>
-          <w:sz w:val="24"/>
-          <w:szCs w:val="24"/>
-          <w:lang w:val="en-GB"/>
-        </w:rPr>
-        <w:t>For each income level (</w:t>
-      </w:r>
-      <w:r>
-        <w:rPr>
-          <w:rFonts w:ascii="Calibri" w:hAnsi="Calibri" w:eastAsia="Calibri" w:cs="Calibri"/>
-          <w:b w:val="1"/>
-          <w:bCs w:val="1"/>
-          <w:noProof w:val="0"/>
-          <w:sz w:val="24"/>
-          <w:szCs w:val="24"/>
-          <w:lang w:val="en-GB"/>
-        </w:rPr>
-        <w:t>Low</w:t>
-      </w:r>
-      <w:r>
-        <w:rPr>
-          <w:rFonts w:ascii="Calibri" w:hAnsi="Calibri" w:eastAsia="Calibri" w:cs="Calibri"/>
-          <w:noProof w:val="0"/>
-          <w:sz w:val="24"/>
-          <w:szCs w:val="24"/>
-          <w:lang w:val="en-GB"/>
-        </w:rPr>
-        <w:t xml:space="preserve">, </w:t>
-      </w:r>
-      <w:r>
-        <w:rPr>
-          <w:rFonts w:ascii="Calibri" w:hAnsi="Calibri" w:eastAsia="Calibri" w:cs="Calibri"/>
-          <w:b w:val="1"/>
-          <w:bCs w:val="1"/>
-          <w:noProof w:val="0"/>
-          <w:sz w:val="24"/>
-          <w:szCs w:val="24"/>
-          <w:lang w:val="en-GB"/>
-        </w:rPr>
-        <w:t>Lower-middle</w:t>
-      </w:r>
-      <w:r>
-        <w:rPr>
-          <w:rFonts w:ascii="Calibri" w:hAnsi="Calibri" w:eastAsia="Calibri" w:cs="Calibri"/>
-          <w:noProof w:val="0"/>
-          <w:sz w:val="24"/>
-          <w:szCs w:val="24"/>
-          <w:lang w:val="en-GB"/>
-        </w:rPr>
-        <w:t xml:space="preserve">, and </w:t>
-      </w:r>
-      <w:r>
-        <w:rPr>
-          <w:rFonts w:ascii="Calibri" w:hAnsi="Calibri" w:eastAsia="Calibri" w:cs="Calibri"/>
-          <w:b w:val="1"/>
-          <w:bCs w:val="1"/>
-          <w:noProof w:val="0"/>
-          <w:sz w:val="24"/>
-          <w:szCs w:val="24"/>
-          <w:lang w:val="en-GB"/>
-        </w:rPr>
-        <w:t>Upper-middle</w:t>
-      </w:r>
-      <w:r>
-        <w:rPr>
-          <w:rFonts w:ascii="Calibri" w:hAnsi="Calibri" w:eastAsia="Calibri" w:cs="Calibri"/>
-          <w:noProof w:val="0"/>
-          <w:sz w:val="24"/>
-          <w:szCs w:val="24"/>
-          <w:lang w:val="en-GB"/>
-        </w:rPr>
-        <w:t xml:space="preserve">), I computed </w:t>
-      </w:r>
-      <w:r>
-        <w:rPr>
-          <w:rFonts w:ascii="Calibri" w:hAnsi="Calibri" w:eastAsia="Calibri" w:cs="Calibri"/>
-          <w:b w:val="1"/>
-          <w:bCs w:val="1"/>
-          <w:noProof w:val="0"/>
-          <w:sz w:val="24"/>
-          <w:szCs w:val="24"/>
-          <w:lang w:val="en-GB"/>
-        </w:rPr>
-        <w:t>three types of correlation matrices</w:t>
-      </w:r>
-      <w:r>
-        <w:rPr>
-          <w:rFonts w:ascii="Calibri" w:hAnsi="Calibri" w:eastAsia="Calibri" w:cs="Calibri"/>
-          <w:noProof w:val="0"/>
-          <w:sz w:val="24"/>
-          <w:szCs w:val="24"/>
-          <w:lang w:val="en-GB"/>
-        </w:rPr>
-        <w:t>:</w:t>
-      </w:r>
-    </w:p>
-    <w:p>
-      <w:pPr>
-        <w:pStyle w:val="ListParagraph"/>
-        <w:numPr>
-          <w:ilvl w:val="0"/>
-          <w:numId w:val="20"/>
-        </w:numPr>
-        <w:spacing w:before="240" w:beforeAutospacing="off" w:after="240" w:afterAutospacing="off"/>
-        <w:rPr>
-          <w:rFonts w:ascii="Calibri" w:hAnsi="Calibri" w:eastAsia="Calibri" w:cs="Calibri"/>
-          <w:noProof w:val="0"/>
-          <w:sz w:val="24"/>
-          <w:szCs w:val="24"/>
-          <w:lang w:val="en-GB"/>
-        </w:rPr>
-      </w:pPr>
-      <w:r>
-        <w:rPr>
-          <w:rFonts w:ascii="Calibri" w:hAnsi="Calibri" w:eastAsia="Calibri" w:cs="Calibri"/>
-          <w:b w:val="1"/>
-          <w:bCs w:val="1"/>
-          <w:noProof w:val="0"/>
-          <w:sz w:val="24"/>
-          <w:szCs w:val="24"/>
-          <w:lang w:val="en-GB"/>
-        </w:rPr>
-        <w:t>Pearson correlation</w:t>
-      </w:r>
-      <w:r>
-        <w:rPr>
-          <w:rFonts w:ascii="Calibri" w:hAnsi="Calibri" w:eastAsia="Calibri" w:cs="Calibri"/>
-          <w:noProof w:val="0"/>
-          <w:sz w:val="24"/>
-          <w:szCs w:val="24"/>
-          <w:lang w:val="en-GB"/>
-        </w:rPr>
-        <w:t xml:space="preserve"> (</w:t>
-      </w:r>
-      <w:r>
-        <w:rPr>
-          <w:rFonts w:ascii="Consolas" w:hAnsi="Consolas" w:eastAsia="Consolas" w:cs="Consolas"/>
-          <w:noProof w:val="0"/>
-          <w:sz w:val="24"/>
-          <w:szCs w:val="24"/>
-          <w:lang w:val="en-GB"/>
-        </w:rPr>
-        <w:t>.corr(method='pearson')</w:t>
-      </w:r>
-      <w:r>
-        <w:rPr>
-          <w:rFonts w:ascii="Calibri" w:hAnsi="Calibri" w:eastAsia="Calibri" w:cs="Calibri"/>
-          <w:noProof w:val="0"/>
-          <w:sz w:val="24"/>
-          <w:szCs w:val="24"/>
-          <w:lang w:val="en-GB"/>
-        </w:rPr>
-        <w:t>) – capturing linear relationships</w:t>
-      </w:r>
-    </w:p>
-    <w:p>
-      <w:pPr>
-        <w:pStyle w:val="ListParagraph"/>
-        <w:numPr>
-          <w:ilvl w:val="0"/>
-          <w:numId w:val="20"/>
-        </w:numPr>
-        <w:spacing w:before="240" w:beforeAutospacing="off" w:after="240" w:afterAutospacing="off"/>
-        <w:rPr>
-          <w:rFonts w:ascii="Calibri" w:hAnsi="Calibri" w:eastAsia="Calibri" w:cs="Calibri"/>
-          <w:noProof w:val="0"/>
-          <w:sz w:val="24"/>
-          <w:szCs w:val="24"/>
-          <w:lang w:val="en-GB"/>
-        </w:rPr>
-      </w:pPr>
-      <w:r>
-        <w:rPr>
-          <w:rFonts w:ascii="Calibri" w:hAnsi="Calibri" w:eastAsia="Calibri" w:cs="Calibri"/>
-          <w:b w:val="1"/>
-          <w:bCs w:val="1"/>
-          <w:noProof w:val="0"/>
-          <w:sz w:val="24"/>
-          <w:szCs w:val="24"/>
-          <w:lang w:val="en-GB"/>
-        </w:rPr>
-        <w:t>Spearman correlation</w:t>
-      </w:r>
-      <w:r>
-        <w:rPr>
-          <w:rFonts w:ascii="Calibri" w:hAnsi="Calibri" w:eastAsia="Calibri" w:cs="Calibri"/>
-          <w:noProof w:val="0"/>
-          <w:sz w:val="24"/>
-          <w:szCs w:val="24"/>
-          <w:lang w:val="en-GB"/>
-        </w:rPr>
-        <w:t xml:space="preserve"> (</w:t>
-      </w:r>
-      <w:r>
-        <w:rPr>
-          <w:rFonts w:ascii="Consolas" w:hAnsi="Consolas" w:eastAsia="Consolas" w:cs="Consolas"/>
-          <w:noProof w:val="0"/>
-          <w:sz w:val="24"/>
-          <w:szCs w:val="24"/>
-          <w:lang w:val="en-GB"/>
-        </w:rPr>
-        <w:t>.corr(method='spearman')</w:t>
-      </w:r>
-      <w:r>
-        <w:rPr>
-          <w:rFonts w:ascii="Calibri" w:hAnsi="Calibri" w:eastAsia="Calibri" w:cs="Calibri"/>
-          <w:noProof w:val="0"/>
-          <w:sz w:val="24"/>
-          <w:szCs w:val="24"/>
-          <w:lang w:val="en-GB"/>
-        </w:rPr>
-        <w:t>) – capturing monotonic (rank-based) relationships</w:t>
-      </w:r>
-    </w:p>
-    <w:p>
-      <w:pPr>
-        <w:pStyle w:val="ListParagraph"/>
-        <w:numPr>
-          <w:ilvl w:val="0"/>
-          <w:numId w:val="20"/>
-        </w:numPr>
-        <w:spacing w:before="240" w:beforeAutospacing="off" w:after="240" w:afterAutospacing="off"/>
-        <w:rPr>
-          <w:rFonts w:ascii="Calibri" w:hAnsi="Calibri" w:eastAsia="Calibri" w:cs="Calibri"/>
-          <w:noProof w:val="0"/>
-          <w:sz w:val="24"/>
-          <w:szCs w:val="24"/>
-          <w:lang w:val="en-GB"/>
-        </w:rPr>
-      </w:pPr>
-      <w:r>
-        <w:rPr>
-          <w:rFonts w:ascii="Calibri" w:hAnsi="Calibri" w:eastAsia="Calibri" w:cs="Calibri"/>
-          <w:b w:val="1"/>
-          <w:bCs w:val="1"/>
-          <w:noProof w:val="0"/>
-          <w:sz w:val="24"/>
-          <w:szCs w:val="24"/>
-          <w:lang w:val="en-GB"/>
-        </w:rPr>
-        <w:t>Kendall correlation</w:t>
-      </w:r>
-      <w:r>
-        <w:rPr>
-          <w:rFonts w:ascii="Calibri" w:hAnsi="Calibri" w:eastAsia="Calibri" w:cs="Calibri"/>
-          <w:noProof w:val="0"/>
-          <w:sz w:val="24"/>
-          <w:szCs w:val="24"/>
-          <w:lang w:val="en-GB"/>
-        </w:rPr>
-        <w:t xml:space="preserve"> (</w:t>
-      </w:r>
-      <w:r>
-        <w:rPr>
-          <w:rFonts w:ascii="Consolas" w:hAnsi="Consolas" w:eastAsia="Consolas" w:cs="Consolas"/>
-          <w:noProof w:val="0"/>
-          <w:sz w:val="24"/>
-          <w:szCs w:val="24"/>
-          <w:lang w:val="en-GB"/>
-        </w:rPr>
-        <w:t>.corr(method='kendall')</w:t>
-      </w:r>
-      <w:r>
-        <w:rPr>
-          <w:rFonts w:ascii="Calibri" w:hAnsi="Calibri" w:eastAsia="Calibri" w:cs="Calibri"/>
-          <w:noProof w:val="0"/>
-          <w:sz w:val="24"/>
-          <w:szCs w:val="24"/>
-          <w:lang w:val="en-GB"/>
-        </w:rPr>
-        <w:t>) – capturing ordinal concordance relationships</w:t>
-      </w:r>
-    </w:p>
-    <w:p>
-      <w:pPr>
-        <w:spacing w:before="240" w:beforeAutospacing="off" w:after="240" w:afterAutospacing="off"/>
-      </w:pPr>
-      <w:r>
-        <w:rPr>
-          <w:rFonts w:ascii="Calibri" w:hAnsi="Calibri" w:eastAsia="Calibri" w:cs="Calibri"/>
-          <w:noProof w:val="0"/>
-          <w:sz w:val="24"/>
-          <w:szCs w:val="24"/>
-          <w:lang w:val="en-GB"/>
-        </w:rPr>
-        <w:t xml:space="preserve">I visualized these using </w:t>
-      </w:r>
-      <w:r>
-        <w:rPr>
-          <w:rFonts w:ascii="Consolas" w:hAnsi="Consolas" w:eastAsia="Consolas" w:cs="Consolas"/>
-          <w:noProof w:val="0"/>
-          <w:sz w:val="24"/>
-          <w:szCs w:val="24"/>
-          <w:lang w:val="en-GB"/>
-        </w:rPr>
-        <w:t>sns.heatmap()</w:t>
-      </w:r>
-      <w:r>
-        <w:rPr>
-          <w:rFonts w:ascii="Calibri" w:hAnsi="Calibri" w:eastAsia="Calibri" w:cs="Calibri"/>
-          <w:noProof w:val="0"/>
-          <w:sz w:val="24"/>
-          <w:szCs w:val="24"/>
-          <w:lang w:val="en-GB"/>
-        </w:rPr>
-        <w:t xml:space="preserve"> with annotations and styling, yielding </w:t>
-      </w:r>
-      <w:r>
-        <w:rPr>
-          <w:rFonts w:ascii="Calibri" w:hAnsi="Calibri" w:eastAsia="Calibri" w:cs="Calibri"/>
-          <w:b w:val="1"/>
-          <w:bCs w:val="1"/>
-          <w:noProof w:val="0"/>
-          <w:sz w:val="24"/>
-          <w:szCs w:val="24"/>
-          <w:lang w:val="en-GB"/>
-        </w:rPr>
-        <w:t>three separate heatmaps per income level</w:t>
-      </w:r>
-      <w:r>
-        <w:rPr>
-          <w:rFonts w:ascii="Calibri" w:hAnsi="Calibri" w:eastAsia="Calibri" w:cs="Calibri"/>
-          <w:noProof w:val="0"/>
-          <w:sz w:val="24"/>
-          <w:szCs w:val="24"/>
-          <w:lang w:val="en-GB"/>
-        </w:rPr>
-        <w:t>. These plots allowed me to evaluate how energy use, emissions, and economic growth indicators co-varied under different assumptions about their relationships. Comparing results across methods revealed both linear and nonlinear dynamics, enhancing analytical robustness.</w:t>
-      </w:r>
-    </w:p>
-    <w:p/>
-    <w:p>
-      <w:pPr>
-        <w:pStyle w:val="Heading3"/>
-        <w:spacing w:before="281" w:beforeAutospacing="off" w:after="281" w:afterAutospacing="off"/>
-        <w:rPr>
-          <w:rFonts w:ascii="Calibri" w:hAnsi="Calibri" w:eastAsia="Calibri" w:cs="Calibri"/>
-          <w:b w:val="1"/>
-          <w:bCs w:val="1"/>
-          <w:noProof w:val="0"/>
-          <w:color w:val="auto"/>
-          <w:sz w:val="28"/>
-          <w:szCs w:val="28"/>
-          <w:lang w:val="en-GB"/>
-        </w:rPr>
-      </w:pPr>
-      <w:r>
-        <w:rPr>
-          <w:rFonts w:ascii="Calibri" w:hAnsi="Calibri" w:eastAsia="Calibri" w:cs="Calibri"/>
-          <w:b w:val="1"/>
-          <w:bCs w:val="1"/>
-          <w:noProof w:val="0"/>
-          <w:color w:val="auto"/>
-          <w:sz w:val="28"/>
-          <w:szCs w:val="28"/>
-          <w:lang w:val="en-GB"/>
-        </w:rPr>
-        <w:t>Time-Based Correlation Analysis (1990–2005 vs 2006–2023)</w:t>
-      </w:r>
-    </w:p>
-    <w:p>
-      <w:pPr>
-        <w:spacing w:before="240" w:beforeAutospacing="off" w:after="240" w:afterAutospacing="off"/>
-      </w:pPr>
-      <w:r>
-        <w:rPr>
-          <w:rFonts w:ascii="Calibri" w:hAnsi="Calibri" w:eastAsia="Calibri" w:cs="Calibri"/>
-          <w:noProof w:val="0"/>
-          <w:sz w:val="24"/>
-          <w:szCs w:val="24"/>
-          <w:lang w:val="en-GB"/>
-        </w:rPr>
-        <w:t>To trace how indicator relationships evolved over time, I divided the time series into two intervals:</w:t>
-      </w:r>
-    </w:p>
-    <w:p>
-      <w:pPr>
-        <w:pStyle w:val="ListParagraph"/>
-        <w:numPr>
-          <w:ilvl w:val="0"/>
-          <w:numId w:val="21"/>
-        </w:numPr>
-        <w:spacing w:before="240" w:beforeAutospacing="off" w:after="240" w:afterAutospacing="off"/>
-        <w:rPr>
-          <w:rFonts w:ascii="Calibri" w:hAnsi="Calibri" w:eastAsia="Calibri" w:cs="Calibri"/>
-          <w:noProof w:val="0"/>
-          <w:sz w:val="24"/>
-          <w:szCs w:val="24"/>
-          <w:lang w:val="en-GB"/>
-        </w:rPr>
-      </w:pPr>
-      <w:r>
-        <w:rPr>
-          <w:rFonts w:ascii="Calibri" w:hAnsi="Calibri" w:eastAsia="Calibri" w:cs="Calibri"/>
-          <w:b w:val="1"/>
-          <w:bCs w:val="1"/>
-          <w:noProof w:val="0"/>
-          <w:sz w:val="24"/>
-          <w:szCs w:val="24"/>
-          <w:lang w:val="en-GB"/>
-        </w:rPr>
-        <w:t>Early Years</w:t>
-      </w:r>
-      <w:r>
-        <w:rPr>
-          <w:rFonts w:ascii="Calibri" w:hAnsi="Calibri" w:eastAsia="Calibri" w:cs="Calibri"/>
-          <w:noProof w:val="0"/>
-          <w:sz w:val="24"/>
-          <w:szCs w:val="24"/>
-          <w:lang w:val="en-GB"/>
-        </w:rPr>
-        <w:t>: 1990 to 2005</w:t>
-      </w:r>
-    </w:p>
-    <w:p>
-      <w:pPr>
-        <w:pStyle w:val="ListParagraph"/>
-        <w:numPr>
-          <w:ilvl w:val="0"/>
-          <w:numId w:val="21"/>
-        </w:numPr>
-        <w:spacing w:before="240" w:beforeAutospacing="off" w:after="240" w:afterAutospacing="off"/>
-        <w:rPr>
-          <w:rFonts w:ascii="Calibri" w:hAnsi="Calibri" w:eastAsia="Calibri" w:cs="Calibri"/>
-          <w:noProof w:val="0"/>
-          <w:sz w:val="24"/>
-          <w:szCs w:val="24"/>
-          <w:lang w:val="en-GB"/>
-        </w:rPr>
-      </w:pPr>
-      <w:r>
-        <w:rPr>
-          <w:rFonts w:ascii="Calibri" w:hAnsi="Calibri" w:eastAsia="Calibri" w:cs="Calibri"/>
-          <w:b w:val="1"/>
-          <w:bCs w:val="1"/>
-          <w:noProof w:val="0"/>
-          <w:sz w:val="24"/>
-          <w:szCs w:val="24"/>
-          <w:lang w:val="en-GB"/>
-        </w:rPr>
-        <w:t>Recent Years</w:t>
-      </w:r>
-      <w:r>
-        <w:rPr>
-          <w:rFonts w:ascii="Calibri" w:hAnsi="Calibri" w:eastAsia="Calibri" w:cs="Calibri"/>
-          <w:noProof w:val="0"/>
-          <w:sz w:val="24"/>
-          <w:szCs w:val="24"/>
-          <w:lang w:val="en-GB"/>
-        </w:rPr>
-        <w:t>: 2006 to 2023</w:t>
-      </w:r>
-    </w:p>
-    <w:p>
-      <w:pPr>
-        <w:spacing w:before="240" w:beforeAutospacing="off" w:after="240" w:afterAutospacing="off"/>
-      </w:pPr>
-      <w:r>
-        <w:rPr>
-          <w:rFonts w:ascii="Calibri" w:hAnsi="Calibri" w:eastAsia="Calibri" w:cs="Calibri"/>
-          <w:noProof w:val="0"/>
-          <w:sz w:val="24"/>
-          <w:szCs w:val="24"/>
-          <w:lang w:val="en-GB"/>
-        </w:rPr>
-        <w:t>Using slicing logic on column names, I calculated two new columns:</w:t>
-      </w:r>
-    </w:p>
-    <w:p>
-      <w:pPr>
-        <w:pStyle w:val="ListParagraph"/>
-        <w:numPr>
-          <w:ilvl w:val="0"/>
-          <w:numId w:val="22"/>
-        </w:numPr>
-        <w:spacing w:before="240" w:beforeAutospacing="off" w:after="240" w:afterAutospacing="off"/>
-        <w:rPr>
-          <w:rFonts w:ascii="Consolas" w:hAnsi="Consolas" w:eastAsia="Consolas" w:cs="Consolas"/>
-          <w:noProof w:val="0"/>
-          <w:sz w:val="24"/>
-          <w:szCs w:val="24"/>
-          <w:lang w:val="en-GB"/>
-        </w:rPr>
-      </w:pPr>
-      <w:r>
-        <w:rPr>
-          <w:rFonts w:ascii="Consolas" w:hAnsi="Consolas" w:eastAsia="Consolas" w:cs="Consolas"/>
-          <w:noProof w:val="0"/>
-          <w:sz w:val="24"/>
-          <w:szCs w:val="24"/>
-          <w:lang w:val="en-GB"/>
-        </w:rPr>
-        <w:t>Early Avg (1990–2005)</w:t>
-      </w:r>
-    </w:p>
-    <w:p>
-      <w:pPr>
-        <w:pStyle w:val="ListParagraph"/>
-        <w:numPr>
-          <w:ilvl w:val="0"/>
-          <w:numId w:val="22"/>
-        </w:numPr>
-        <w:spacing w:before="240" w:beforeAutospacing="off" w:after="240" w:afterAutospacing="off"/>
-        <w:rPr>
-          <w:rFonts w:ascii="Consolas" w:hAnsi="Consolas" w:eastAsia="Consolas" w:cs="Consolas"/>
-          <w:noProof w:val="0"/>
-          <w:sz w:val="24"/>
-          <w:szCs w:val="24"/>
-          <w:lang w:val="en-GB"/>
-        </w:rPr>
-      </w:pPr>
-      <w:r>
-        <w:rPr>
-          <w:rFonts w:ascii="Consolas" w:hAnsi="Consolas" w:eastAsia="Consolas" w:cs="Consolas"/>
-          <w:noProof w:val="0"/>
-          <w:sz w:val="24"/>
-          <w:szCs w:val="24"/>
-          <w:lang w:val="en-GB"/>
-        </w:rPr>
-        <w:t>Recent Avg (2006–2023)</w:t>
-      </w:r>
-    </w:p>
-    <w:p>
-      <w:pPr>
-        <w:spacing w:before="240" w:beforeAutospacing="off" w:after="240" w:afterAutospacing="off"/>
-      </w:pPr>
-      <w:r>
-        <w:rPr>
-          <w:rFonts w:ascii="Calibri" w:hAnsi="Calibri" w:eastAsia="Calibri" w:cs="Calibri"/>
-          <w:noProof w:val="0"/>
-          <w:sz w:val="24"/>
-          <w:szCs w:val="24"/>
-          <w:lang w:val="en-GB"/>
-        </w:rPr>
-        <w:t xml:space="preserve">I used </w:t>
-      </w:r>
-      <w:r>
-        <w:rPr>
-          <w:rFonts w:ascii="Consolas" w:hAnsi="Consolas" w:eastAsia="Consolas" w:cs="Consolas"/>
-          <w:noProof w:val="0"/>
-          <w:sz w:val="24"/>
-          <w:szCs w:val="24"/>
-          <w:lang w:val="en-GB"/>
-        </w:rPr>
-        <w:t>pivot()</w:t>
-      </w:r>
-      <w:r>
-        <w:rPr>
-          <w:rFonts w:ascii="Calibri" w:hAnsi="Calibri" w:eastAsia="Calibri" w:cs="Calibri"/>
-          <w:noProof w:val="0"/>
-          <w:sz w:val="24"/>
-          <w:szCs w:val="24"/>
-          <w:lang w:val="en-GB"/>
-        </w:rPr>
-        <w:t xml:space="preserve"> to generate wide-format tables for each income level and time period. On each of these, I computed three separate correlation matrices using Pearson, Spearman, and Kendall methods. I visualized them using </w:t>
-      </w:r>
-      <w:r>
-        <w:rPr>
-          <w:rFonts w:ascii="Consolas" w:hAnsi="Consolas" w:eastAsia="Consolas" w:cs="Consolas"/>
-          <w:noProof w:val="0"/>
-          <w:sz w:val="24"/>
-          <w:szCs w:val="24"/>
-          <w:lang w:val="en-GB"/>
-        </w:rPr>
-        <w:t>plot_correlation_heatmap()</w:t>
-      </w:r>
-      <w:r>
-        <w:rPr>
-          <w:rFonts w:ascii="Calibri" w:hAnsi="Calibri" w:eastAsia="Calibri" w:cs="Calibri"/>
-          <w:noProof w:val="0"/>
-          <w:sz w:val="24"/>
-          <w:szCs w:val="24"/>
-          <w:lang w:val="en-GB"/>
-        </w:rPr>
-        <w:t xml:space="preserve"> for a total of </w:t>
-      </w:r>
-      <w:r>
-        <w:rPr>
-          <w:rFonts w:ascii="Calibri" w:hAnsi="Calibri" w:eastAsia="Calibri" w:cs="Calibri"/>
-          <w:b w:val="1"/>
-          <w:bCs w:val="1"/>
-          <w:noProof w:val="0"/>
-          <w:sz w:val="24"/>
-          <w:szCs w:val="24"/>
-          <w:lang w:val="en-GB"/>
-        </w:rPr>
-        <w:t>six heatmaps per income level</w:t>
-      </w:r>
-      <w:r>
-        <w:rPr>
-          <w:rFonts w:ascii="Calibri" w:hAnsi="Calibri" w:eastAsia="Calibri" w:cs="Calibri"/>
-          <w:noProof w:val="0"/>
-          <w:sz w:val="24"/>
-          <w:szCs w:val="24"/>
-          <w:lang w:val="en-GB"/>
-        </w:rPr>
-        <w:t xml:space="preserve"> — enabling historical comparison of not just correlation strength, but also changes in the nature (linear, monotonic, ordinal) of those relationships over decades.</w:t>
-      </w:r>
-    </w:p>
-    <w:p/>
-    <w:p>
-      <w:pPr>
         <w:pStyle w:val="Heading3"/>
         <w:spacing w:before="281" w:beforeAutospacing="off" w:after="281" w:afterAutospacing="off"/>
         <w:rPr>
@@ -12809,8 +10484,158 @@
       </w:r>
     </w:p>
     <w:p>
-      <w:r>
-        <w:br w:type="page"/>
+      <w:pPr>
+        <w:spacing w:before="240" w:beforeAutospacing="off" w:after="240" w:afterAutospacing="off"/>
+      </w:pPr>
+      <w:r>
+        <w:rPr>
+          <w:rFonts w:ascii="Calibri" w:hAnsi="Calibri" w:eastAsia="Calibri" w:cs="Calibri"/>
+          <w:noProof w:val="0"/>
+          <w:sz w:val="24"/>
+          <w:szCs w:val="24"/>
+          <w:lang w:val="en-GB"/>
+        </w:rPr>
+        <w:t>I examined the relationships between agriculture sector growth and environmental-energy indicators across low-income countries using Pearson, Spearman, and Kendall correlation methods. Across all approaches, there was a consistent negative correlation between agricultural value added and CO₂ emissions per capita (Pearson: -0.55, Spearman: -0.39, Kendall: -0.43), suggesting that higher emissions may be linked to reduced agricultural growth. Renewable electricity output also showed a strong negative association (Pearson: -0.56, Spearman: -0.61, Kendall: -0.33). In contrast, electricity production from renewable sources (excluding hydro) exhibited positive correlations, particularly under Spearman (0.48), indicating a potential supportive role of renewables. Combustible renewables and waste displayed a modest positive relationship across all methods.</w:t>
+      </w:r>
+    </w:p>
+    <w:p>
+      <w:pPr>
+        <w:spacing w:before="240" w:beforeAutospacing="off" w:after="240" w:afterAutospacing="off"/>
+      </w:pPr>
+      <w:r>
+        <w:rPr>
+          <w:rFonts w:ascii="Calibri" w:hAnsi="Calibri" w:eastAsia="Calibri" w:cs="Calibri"/>
+          <w:noProof w:val="0"/>
+          <w:sz w:val="24"/>
+          <w:szCs w:val="24"/>
+          <w:lang w:val="en-GB"/>
+        </w:rPr>
+        <w:t>For the industry sector in the same income group, industry growth was strongly and positively correlated with energy use per $1,000 GDP (Pearson: 0.81), carbon intensity of GDP (0.42), and total greenhouse gas emissions (0.46), suggesting that energy-intensive and emission-heavy activities might be driving industrial output. The Spearman and Kendall results reinforced these associations, particularly in relation to energy use and carbon indicators. At the same time, GDP per unit of energy use had consistently negative correlations across Pearson (-0.54), Spearman (-0.46), and Kendall (-0.24), indicating lower energy efficiency in rapidly growing industries. The relationship between manufacturing growth and overall industry growth was also strong (Pearson: 0.74, Spearman: 0.96, Kendall: 0.90), reinforcing their interdependence.</w:t>
+      </w:r>
+    </w:p>
+    <w:p>
+      <w:pPr>
+        <w:spacing w:before="240" w:beforeAutospacing="off" w:after="240" w:afterAutospacing="off"/>
+      </w:pPr>
+      <w:r>
+        <w:rPr>
+          <w:rFonts w:ascii="Calibri" w:hAnsi="Calibri" w:eastAsia="Calibri" w:cs="Calibri"/>
+          <w:noProof w:val="0"/>
+          <w:sz w:val="24"/>
+          <w:szCs w:val="24"/>
+          <w:lang w:val="en-GB"/>
+        </w:rPr>
+        <w:t>In the services sector, energy use per $1,000 GDP maintained a strong positive correlation with growth (Pearson: 0.82, Spearman: 0.68, Kendall: 0.52), while GDP per unit of energy use displayed a strong negative relationship (Pearson: -0.72, Spearman: -0.68, Kendall: -0.52). This indicated that higher energy intensity may be contributing to services expansion. Additionally, renewable energy consumption and renewable electricity output showed moderate positive correlations across all methods. On the other hand, fossil fuel energy consumption was negatively associated with services growth (Pearson: -0.63), particularly under Spearman (-0.64) and Kendall (-0.62), highlighting the influence of cleaner energy sources on sectoral development.</w:t>
+      </w:r>
+    </w:p>
+    <w:p>
+      <w:pPr>
+        <w:spacing w:before="240" w:beforeAutospacing="off" w:after="240" w:afterAutospacing="off"/>
+      </w:pPr>
+      <w:r>
+        <w:rPr>
+          <w:rFonts w:ascii="Calibri" w:hAnsi="Calibri" w:eastAsia="Calibri" w:cs="Calibri"/>
+          <w:noProof w:val="0"/>
+          <w:sz w:val="24"/>
+          <w:szCs w:val="24"/>
+          <w:lang w:val="en-GB"/>
+        </w:rPr>
+        <w:t>Shifting to lower middle-income countries, the correlations for the agriculture sector were generally weaker. Electricity production from renewable sources showed a consistent negative association with agriculture (Pearson: -0.29, Spearman: -0.23, Kendall: -0.17), indicating limited integration of renewables in this area. Other indicators mostly demonstrated weak or negligible correlations. Energy use per $1,000 GDP and energy intensity had weak negative relationships, while GDP per unit of energy use showed a small positive correlation (Pearson: 0.08, Kendall: 0.12). Greenhouse gas emissions, however, had slight positive correlations in Spearman (0.25) and Kendall (0.18), though not strongly influential.</w:t>
+      </w:r>
+    </w:p>
+    <w:p>
+      <w:pPr>
+        <w:spacing w:before="240" w:beforeAutospacing="off" w:after="240" w:afterAutospacing="off"/>
+      </w:pPr>
+      <w:r>
+        <w:rPr>
+          <w:rFonts w:ascii="Calibri" w:hAnsi="Calibri" w:eastAsia="Calibri" w:cs="Calibri"/>
+          <w:noProof w:val="0"/>
+          <w:sz w:val="24"/>
+          <w:szCs w:val="24"/>
+          <w:lang w:val="en-GB"/>
+        </w:rPr>
+        <w:t>In the industry sector, the results were mixed. CO₂ emissions excluding LULUCF consistently had a moderate negative correlation with industrial growth (Pearson: -0.46, Spearman: -0.44, Kendall: -0.31), suggesting that emissions may hinder expansion. Carbon intensity and fossil fuel energy use followed similar weak to moderate negative trends. Notably, combustible renewables and renewable energy consumption had positive correlations (Pearson: 0.38 and 0.35), pointing to a potentially supportive role for renewables. The connection between manufacturing and industry growth remained moderately strong across Pearson (0.62), Spearman (0.76), and Kendall (0.60).</w:t>
+      </w:r>
+    </w:p>
+    <w:p>
+      <w:pPr>
+        <w:spacing w:before="240" w:beforeAutospacing="off" w:after="240" w:afterAutospacing="off"/>
+      </w:pPr>
+      <w:r>
+        <w:rPr>
+          <w:rFonts w:ascii="Calibri" w:hAnsi="Calibri" w:eastAsia="Calibri" w:cs="Calibri"/>
+          <w:noProof w:val="0"/>
+          <w:sz w:val="24"/>
+          <w:szCs w:val="24"/>
+          <w:lang w:val="en-GB"/>
+        </w:rPr>
+        <w:t>As for the services sector in this income group, the associations were relatively weak overall. Greenhouse gas emissions excluding LULUCF showed moderate positive correlations with services growth (Pearson: 0.27, Spearman: 0.41, Kendall: 0.30), implying that emissions might indirectly accompany sectoral expansion. Combustible renewables and renewable energy consumption showed minor positive correlations, while most energy efficiency metrics—including GDP per unit of energy use and energy intensity—exhibited weak or near-zero relationships.</w:t>
+      </w:r>
+    </w:p>
+    <w:p>
+      <w:pPr>
+        <w:spacing w:before="240" w:beforeAutospacing="off" w:after="240" w:afterAutospacing="off"/>
+      </w:pPr>
+      <w:r>
+        <w:rPr>
+          <w:rFonts w:ascii="Calibri" w:hAnsi="Calibri" w:eastAsia="Calibri" w:cs="Calibri"/>
+          <w:noProof w:val="0"/>
+          <w:sz w:val="24"/>
+          <w:szCs w:val="24"/>
+          <w:lang w:val="en-GB"/>
+        </w:rPr>
+        <w:t>Among upper middle-income countries, the agriculture sector showed a more nuanced pattern. CO₂ emissions excluding LULUCF had a consistent negative correlation with agricultural growth (Pearson: -0.31, Spearman: -0.35, Kendall: -0.23), indicating environmental pressure on productivity. On the other hand, renewable energy consumption (Pearson: 0.29) and renewable electricity output (Pearson: 0.23) had moderate positive associations, suggesting benefits from renewable adoption. Fossil fuel energy consumption was negatively correlated across all methods, while greenhouse gas emissions (excluding LULUCF) had small to moderate positive correlations (Pearson: 0.28), adding complexity to the emissions-agriculture relationship.</w:t>
+      </w:r>
+    </w:p>
+    <w:p>
+      <w:pPr>
+        <w:spacing w:before="240" w:beforeAutospacing="off" w:after="240" w:afterAutospacing="off"/>
+      </w:pPr>
+      <w:r>
+        <w:rPr>
+          <w:rFonts w:ascii="Calibri" w:hAnsi="Calibri" w:eastAsia="Calibri" w:cs="Calibri"/>
+          <w:noProof w:val="0"/>
+          <w:sz w:val="24"/>
+          <w:szCs w:val="24"/>
+          <w:lang w:val="en-GB"/>
+        </w:rPr>
+        <w:t>In the industrial sector, correlations were mostly weak. Fossil fuel energy consumption had a slight positive relationship with industry growth (Pearson: 0.21), while CO₂ emissions and greenhouse gases demonstrated weak negative associations across all methods. Renewable energy indicators—including renewable consumption and electricity output—had consistent but weak negative correlations (e.g., Pearson: -0.20 and -0.07), suggesting limited renewable integration. Meanwhile, manufacturing growth was modestly related to overall industrial growth (Pearson: 0.21, Spearman: 0.54, Kendall: 0.42).</w:t>
+      </w:r>
+    </w:p>
+    <w:p>
+      <w:pPr>
+        <w:spacing w:before="240" w:beforeAutospacing="off" w:after="240" w:afterAutospacing="off"/>
+      </w:pPr>
+      <w:r>
+        <w:rPr>
+          <w:rFonts w:ascii="Calibri" w:hAnsi="Calibri" w:eastAsia="Calibri" w:cs="Calibri"/>
+          <w:noProof w:val="0"/>
+          <w:sz w:val="24"/>
+          <w:szCs w:val="24"/>
+          <w:lang w:val="en-GB"/>
+        </w:rPr>
+        <w:t xml:space="preserve">Finally, in the services sector, relationships were </w:t>
+      </w:r>
+      <w:r>
+        <w:rPr>
+          <w:rFonts w:ascii="Calibri" w:hAnsi="Calibri" w:eastAsia="Calibri" w:cs="Calibri"/>
+          <w:noProof w:val="0"/>
+          <w:sz w:val="24"/>
+          <w:szCs w:val="24"/>
+          <w:lang w:val="en-GB"/>
+        </w:rPr>
+        <w:t>largely inconsistent</w:t>
+      </w:r>
+      <w:r>
+        <w:rPr>
+          <w:rFonts w:ascii="Calibri" w:hAnsi="Calibri" w:eastAsia="Calibri" w:cs="Calibri"/>
+          <w:noProof w:val="0"/>
+          <w:sz w:val="24"/>
+          <w:szCs w:val="24"/>
+          <w:lang w:val="en-GB"/>
+        </w:rPr>
+        <w:t xml:space="preserve"> and weak. Total CO₂ emissions showed a moderate positive Pearson correlation (0.42), but the relationship faded in Spearman and Kendall. Most energy-related indicators—such as energy intensity, GDP per unit of energy use, and renewable electricity output—had near-zero correlations. Renewable energy consumption showed almost no association with services growth (Pearson: -0.004). Greenhouse gas emissions excluding LULUCF had a moderately positive Pearson value (0.41) but turned negative in the other methods, illustrating the complex and variable nature of emissions impacts on the services sector across countries.</w:t>
       </w:r>
     </w:p>
     <w:p>
@@ -12838,6 +10663,51 @@
           <w:szCs w:val="32"/>
         </w:rPr>
         <w:t>7. Analysis &amp; Discussion</w:t>
+      </w:r>
+    </w:p>
+    <w:p>
+      <w:pPr>
+        <w:bidi w:val="0"/>
+        <w:spacing w:before="0" w:beforeAutospacing="off" w:after="0" w:afterAutospacing="off" w:line="259" w:lineRule="auto"/>
+        <w:ind w:left="0" w:right="0"/>
+        <w:jc w:val="left"/>
+        <w:rPr>
+          <w:rFonts w:ascii="Calibri" w:hAnsi="Calibri" w:eastAsia="Calibri" w:cs="Calibri"/>
+          <w:noProof w:val="0"/>
+          <w:sz w:val="24"/>
+          <w:szCs w:val="24"/>
+          <w:lang w:val="en-GB"/>
+        </w:rPr>
+      </w:pPr>
+      <w:r>
+        <w:rPr>
+          <w:rFonts w:ascii="Calibri" w:hAnsi="Calibri" w:eastAsia="Calibri" w:cs="Calibri"/>
+          <w:noProof w:val="0"/>
+          <w:sz w:val="24"/>
+          <w:szCs w:val="24"/>
+          <w:lang w:val="en-GB"/>
+        </w:rPr>
+        <w:t xml:space="preserve">Models trained on globally inclusive datasets (within income level) </w:t>
+      </w:r>
+      <w:r>
+        <w:rPr>
+          <w:rFonts w:ascii="Calibri" w:hAnsi="Calibri" w:eastAsia="Calibri" w:cs="Calibri"/>
+          <w:noProof w:val="0"/>
+          <w:sz w:val="24"/>
+          <w:szCs w:val="24"/>
+          <w:lang w:val="en-GB"/>
+        </w:rPr>
+        <w:t>demonstrate</w:t>
+      </w:r>
+      <w:r>
+        <w:rPr>
+          <w:rFonts w:ascii="Calibri" w:hAnsi="Calibri" w:eastAsia="Calibri" w:cs="Calibri"/>
+          <w:noProof w:val="0"/>
+          <w:sz w:val="24"/>
+          <w:szCs w:val="24"/>
+          <w:lang w:val="en-GB"/>
+        </w:rPr>
+        <w:t xml:space="preserve"> stronger generalizability to all member countries. However, restricting the training set to PCA-included countries leads to models that are highly tuned to those specific country patterns, often sacrificing out-of-sample performance. This trade-off must be carefully considered depending on whether interpretability or predictive accuracy across all countries is prioritized.</w:t>
       </w:r>
     </w:p>
     <w:p>
@@ -12945,6 +10815,17 @@
     </w:sectPr>
   </w:body>
 </w:document>
+</file>
+
+<file path=word/intelligence2.xml><?xml version="1.0" encoding="utf-8"?>
+<int2:intelligence xmlns:int2="http://schemas.microsoft.com/office/intelligence/2020/intelligence">
+  <int2:observations>
+    <int2:bookmark int2:bookmarkName="_Int_ZazoePSK" int2:invalidationBookmarkName="" int2:hashCode="OoMWiY/bQD2/cg" int2:id="zC2DxeYI">
+      <int2:state int2:type="WordDesignerDefaultAnnotation" int2:value="Rejected"/>
+    </int2:bookmark>
+  </int2:observations>
+  <int2:intelligenceSettings/>
+</int2:intelligence>
 </file>
 
 <file path=word/numbering.xml><?xml version="1.0" encoding="utf-8"?>

</xml_diff>

<commit_message>
PCA, distance matrix results subsection
</commit_message>
<xml_diff>
--- a/reports/FPR/FPR_23015862_NazmulHossain.docx
+++ b/reports/FPR/FPR_23015862_NazmulHossain.docx
@@ -8731,44 +8731,6 @@
     </w:p>
     <w:p>
       <w:pPr>
-        <w:spacing w:before="240" w:beforeAutospacing="off" w:after="240" w:afterAutospacing="off"/>
-      </w:pPr>
-      <w:r>
-        <w:rPr>
-          <w:rFonts w:ascii="Calibri" w:hAnsi="Calibri" w:eastAsia="Calibri" w:cs="Calibri"/>
-          <w:noProof w:val="0"/>
-          <w:sz w:val="24"/>
-          <w:szCs w:val="24"/>
-          <w:lang w:val="en-GB"/>
-        </w:rPr>
-        <w:t xml:space="preserve">Here is your full </w:t>
-      </w:r>
-      <w:r>
-        <w:rPr>
-          <w:rFonts w:ascii="Calibri" w:hAnsi="Calibri" w:eastAsia="Calibri" w:cs="Calibri"/>
-          <w:b w:val="1"/>
-          <w:bCs w:val="1"/>
-          <w:noProof w:val="0"/>
-          <w:sz w:val="24"/>
-          <w:szCs w:val="24"/>
-          <w:lang w:val="en-GB"/>
-        </w:rPr>
-        <w:t>Panel Regression Methodology</w:t>
-      </w:r>
-      <w:r>
-        <w:rPr>
-          <w:rFonts w:ascii="Calibri" w:hAnsi="Calibri" w:eastAsia="Calibri" w:cs="Calibri"/>
-          <w:noProof w:val="0"/>
-          <w:sz w:val="24"/>
-          <w:szCs w:val="24"/>
-          <w:lang w:val="en-GB"/>
-        </w:rPr>
-        <w:t xml:space="preserve"> section, written inline in the same exhaustive, technical, and personal style as your previous methodology parts:</w:t>
-      </w:r>
-    </w:p>
-    <w:p/>
-    <w:p>
-      <w:pPr>
         <w:pStyle w:val="Heading3"/>
         <w:spacing w:before="281" w:beforeAutospacing="off" w:after="281" w:afterAutospacing="off"/>
         <w:rPr>
@@ -10485,6 +10447,33 @@
     </w:p>
     <w:p>
       <w:pPr>
+        <w:pStyle w:val="Normal"/>
+        <w:suppressLineNumbers w:val="0"/>
+        <w:bidi w:val="0"/>
+        <w:spacing w:before="0" w:beforeAutospacing="off" w:after="0" w:afterAutospacing="off" w:line="259" w:lineRule="auto"/>
+        <w:ind w:left="0" w:right="0"/>
+        <w:jc w:val="left"/>
+        <w:rPr>
+          <w:rFonts w:ascii="Calibri" w:hAnsi="Calibri" w:eastAsia="Calibri" w:cs="Calibri" w:asciiTheme="minorAscii" w:hAnsiTheme="minorAscii" w:eastAsiaTheme="minorAscii" w:cstheme="minorAscii"/>
+          <w:b w:val="1"/>
+          <w:bCs w:val="1"/>
+          <w:sz w:val="28"/>
+          <w:szCs w:val="28"/>
+        </w:rPr>
+      </w:pPr>
+      <w:r>
+        <w:rPr>
+          <w:rFonts w:ascii="Calibri" w:hAnsi="Calibri" w:eastAsia="Calibri" w:cs="Calibri" w:asciiTheme="minorAscii" w:hAnsiTheme="minorAscii" w:eastAsiaTheme="minorAscii" w:cstheme="minorAscii"/>
+          <w:b w:val="1"/>
+          <w:bCs w:val="1"/>
+          <w:sz w:val="28"/>
+          <w:szCs w:val="28"/>
+        </w:rPr>
+        <w:t>6.1 Correlation Heatmap for Sectoral Economic Growth</w:t>
+      </w:r>
+    </w:p>
+    <w:p>
+      <w:pPr>
         <w:spacing w:before="240" w:beforeAutospacing="off" w:after="240" w:afterAutospacing="off"/>
       </w:pPr>
       <w:r>
@@ -10636,6 +10625,1347 @@
           <w:lang w:val="en-GB"/>
         </w:rPr>
         <w:t xml:space="preserve"> and weak. Total CO₂ emissions showed a moderate positive Pearson correlation (0.42), but the relationship faded in Spearman and Kendall. Most energy-related indicators—such as energy intensity, GDP per unit of energy use, and renewable electricity output—had near-zero correlations. Renewable energy consumption showed almost no association with services growth (Pearson: -0.004). Greenhouse gas emissions excluding LULUCF had a moderately positive Pearson value (0.41) but turned negative in the other methods, illustrating the complex and variable nature of emissions impacts on the services sector across countries.</w:t>
+      </w:r>
+    </w:p>
+    <w:p>
+      <w:pPr>
+        <w:pStyle w:val="Heading3"/>
+        <w:spacing w:before="281" w:beforeAutospacing="off" w:after="281" w:afterAutospacing="off"/>
+        <w:rPr>
+          <w:rFonts w:ascii="Calibri" w:hAnsi="Calibri" w:eastAsia="Calibri" w:cs="Calibri"/>
+          <w:b w:val="1"/>
+          <w:bCs w:val="1"/>
+          <w:noProof w:val="0"/>
+          <w:color w:val="auto"/>
+          <w:sz w:val="28"/>
+          <w:szCs w:val="28"/>
+          <w:lang w:val="en-GB"/>
+        </w:rPr>
+      </w:pPr>
+      <w:r>
+        <w:rPr>
+          <w:rFonts w:ascii="Calibri" w:hAnsi="Calibri" w:eastAsia="Calibri" w:cs="Calibri"/>
+          <w:b w:val="1"/>
+          <w:bCs w:val="1"/>
+          <w:noProof w:val="0"/>
+          <w:color w:val="auto"/>
+          <w:sz w:val="28"/>
+          <w:szCs w:val="28"/>
+          <w:lang w:val="en-GB"/>
+        </w:rPr>
+        <w:t>6.2 PCA and Euclidean Distance Analysis Across Income Groups</w:t>
+      </w:r>
+    </w:p>
+    <w:p>
+      <w:pPr>
+        <w:spacing w:before="240" w:beforeAutospacing="off" w:after="240" w:afterAutospacing="off"/>
+      </w:pPr>
+      <w:r>
+        <w:rPr>
+          <w:rFonts w:ascii="Calibri" w:hAnsi="Calibri" w:eastAsia="Calibri" w:cs="Calibri"/>
+          <w:noProof w:val="0"/>
+          <w:sz w:val="24"/>
+          <w:szCs w:val="24"/>
+          <w:lang w:val="en-GB"/>
+        </w:rPr>
+        <w:t xml:space="preserve">To explore the structural similarities among countries within each income group based on energy and environmental indicators, I applied </w:t>
+      </w:r>
+      <w:r>
+        <w:rPr>
+          <w:rFonts w:ascii="Calibri" w:hAnsi="Calibri" w:eastAsia="Calibri" w:cs="Calibri"/>
+          <w:b w:val="1"/>
+          <w:bCs w:val="1"/>
+          <w:noProof w:val="0"/>
+          <w:sz w:val="24"/>
+          <w:szCs w:val="24"/>
+          <w:lang w:val="en-GB"/>
+        </w:rPr>
+        <w:t>Principal Component Analysis (PCA)</w:t>
+      </w:r>
+      <w:r>
+        <w:rPr>
+          <w:rFonts w:ascii="Calibri" w:hAnsi="Calibri" w:eastAsia="Calibri" w:cs="Calibri"/>
+          <w:noProof w:val="0"/>
+          <w:sz w:val="24"/>
+          <w:szCs w:val="24"/>
+          <w:lang w:val="en-GB"/>
+        </w:rPr>
+        <w:t xml:space="preserve"> to reduce dimensionality and then computed </w:t>
+      </w:r>
+      <w:r>
+        <w:rPr>
+          <w:rFonts w:ascii="Calibri" w:hAnsi="Calibri" w:eastAsia="Calibri" w:cs="Calibri"/>
+          <w:b w:val="1"/>
+          <w:bCs w:val="1"/>
+          <w:noProof w:val="0"/>
+          <w:sz w:val="24"/>
+          <w:szCs w:val="24"/>
+          <w:lang w:val="en-GB"/>
+        </w:rPr>
+        <w:t>Euclidean distances</w:t>
+      </w:r>
+      <w:r>
+        <w:rPr>
+          <w:rFonts w:ascii="Calibri" w:hAnsi="Calibri" w:eastAsia="Calibri" w:cs="Calibri"/>
+          <w:noProof w:val="0"/>
+          <w:sz w:val="24"/>
+          <w:szCs w:val="24"/>
+          <w:lang w:val="en-GB"/>
+        </w:rPr>
+        <w:t xml:space="preserve"> based on the resulting coordinates. This method allowed me to assess inter-country similarity in a lower-dimensional space while preserving as much information as possible.</w:t>
+      </w:r>
+    </w:p>
+    <w:p>
+      <w:pPr>
+        <w:pStyle w:val="Heading4"/>
+        <w:spacing w:before="319" w:beforeAutospacing="off" w:after="319" w:afterAutospacing="off"/>
+        <w:rPr>
+          <w:rFonts w:ascii="Calibri" w:hAnsi="Calibri" w:eastAsia="Calibri" w:cs="Calibri"/>
+          <w:b w:val="1"/>
+          <w:bCs w:val="1"/>
+          <w:noProof w:val="0"/>
+          <w:color w:val="auto"/>
+          <w:sz w:val="24"/>
+          <w:szCs w:val="24"/>
+          <w:lang w:val="en-GB"/>
+        </w:rPr>
+      </w:pPr>
+      <w:r>
+        <w:rPr>
+          <w:rFonts w:ascii="Calibri" w:hAnsi="Calibri" w:eastAsia="Calibri" w:cs="Calibri"/>
+          <w:b w:val="1"/>
+          <w:bCs w:val="1"/>
+          <w:noProof w:val="0"/>
+          <w:color w:val="auto"/>
+          <w:sz w:val="24"/>
+          <w:szCs w:val="24"/>
+          <w:lang w:val="en-GB"/>
+        </w:rPr>
+        <w:t>Low-Income Countries</w:t>
+      </w:r>
+    </w:p>
+    <w:p>
+      <w:pPr>
+        <w:spacing w:before="240" w:beforeAutospacing="off" w:after="240" w:afterAutospacing="off"/>
+      </w:pPr>
+      <w:r>
+        <w:rPr>
+          <w:rFonts w:ascii="Calibri" w:hAnsi="Calibri" w:eastAsia="Calibri" w:cs="Calibri"/>
+          <w:noProof w:val="0"/>
+          <w:sz w:val="24"/>
+          <w:szCs w:val="24"/>
+          <w:lang w:val="en-GB"/>
+        </w:rPr>
+        <w:t xml:space="preserve">For low-income countries, the first </w:t>
+      </w:r>
+      <w:r>
+        <w:rPr>
+          <w:rFonts w:ascii="Calibri" w:hAnsi="Calibri" w:eastAsia="Calibri" w:cs="Calibri"/>
+          <w:b w:val="1"/>
+          <w:bCs w:val="1"/>
+          <w:noProof w:val="0"/>
+          <w:sz w:val="24"/>
+          <w:szCs w:val="24"/>
+          <w:lang w:val="en-GB"/>
+        </w:rPr>
+        <w:t>two principal components</w:t>
+      </w:r>
+      <w:r>
+        <w:rPr>
+          <w:rFonts w:ascii="Calibri" w:hAnsi="Calibri" w:eastAsia="Calibri" w:cs="Calibri"/>
+          <w:noProof w:val="0"/>
+          <w:sz w:val="24"/>
+          <w:szCs w:val="24"/>
+          <w:lang w:val="en-GB"/>
+        </w:rPr>
+        <w:t xml:space="preserve"> captured a substantial portion of the variance in the dataset, with the </w:t>
+      </w:r>
+      <w:r>
+        <w:rPr>
+          <w:rFonts w:ascii="Calibri" w:hAnsi="Calibri" w:eastAsia="Calibri" w:cs="Calibri"/>
+          <w:b w:val="1"/>
+          <w:bCs w:val="1"/>
+          <w:noProof w:val="0"/>
+          <w:sz w:val="24"/>
+          <w:szCs w:val="24"/>
+          <w:lang w:val="en-GB"/>
+        </w:rPr>
+        <w:t>cumulative explained variance</w:t>
+      </w:r>
+      <w:r>
+        <w:rPr>
+          <w:rFonts w:ascii="Calibri" w:hAnsi="Calibri" w:eastAsia="Calibri" w:cs="Calibri"/>
+          <w:noProof w:val="0"/>
+          <w:sz w:val="24"/>
+          <w:szCs w:val="24"/>
+          <w:lang w:val="en-GB"/>
+        </w:rPr>
+        <w:t xml:space="preserve"> reaching </w:t>
+      </w:r>
+      <w:r>
+        <w:rPr>
+          <w:rFonts w:ascii="Calibri" w:hAnsi="Calibri" w:eastAsia="Calibri" w:cs="Calibri"/>
+          <w:b w:val="1"/>
+          <w:bCs w:val="1"/>
+          <w:noProof w:val="0"/>
+          <w:sz w:val="24"/>
+          <w:szCs w:val="24"/>
+          <w:lang w:val="en-GB"/>
+        </w:rPr>
+        <w:t>92.5%</w:t>
+      </w:r>
+      <w:r>
+        <w:rPr>
+          <w:rFonts w:ascii="Calibri" w:hAnsi="Calibri" w:eastAsia="Calibri" w:cs="Calibri"/>
+          <w:noProof w:val="0"/>
+          <w:sz w:val="24"/>
+          <w:szCs w:val="24"/>
+          <w:lang w:val="en-GB"/>
+        </w:rPr>
+        <w:t xml:space="preserve"> at PC4 and exceeding </w:t>
+      </w:r>
+      <w:r>
+        <w:rPr>
+          <w:rFonts w:ascii="Calibri" w:hAnsi="Calibri" w:eastAsia="Calibri" w:cs="Calibri"/>
+          <w:b w:val="1"/>
+          <w:bCs w:val="1"/>
+          <w:noProof w:val="0"/>
+          <w:sz w:val="24"/>
+          <w:szCs w:val="24"/>
+          <w:lang w:val="en-GB"/>
+        </w:rPr>
+        <w:t>98%</w:t>
+      </w:r>
+      <w:r>
+        <w:rPr>
+          <w:rFonts w:ascii="Calibri" w:hAnsi="Calibri" w:eastAsia="Calibri" w:cs="Calibri"/>
+          <w:noProof w:val="0"/>
+          <w:sz w:val="24"/>
+          <w:szCs w:val="24"/>
+          <w:lang w:val="en-GB"/>
+        </w:rPr>
+        <w:t xml:space="preserve"> at PC5. The </w:t>
+      </w:r>
+      <w:r>
+        <w:rPr>
+          <w:rFonts w:ascii="Calibri" w:hAnsi="Calibri" w:eastAsia="Calibri" w:cs="Calibri"/>
+          <w:b w:val="1"/>
+          <w:bCs w:val="1"/>
+          <w:noProof w:val="0"/>
+          <w:sz w:val="24"/>
+          <w:szCs w:val="24"/>
+          <w:lang w:val="en-GB"/>
+        </w:rPr>
+        <w:t>PCA scatter plot</w:t>
+      </w:r>
+      <w:r>
+        <w:rPr>
+          <w:rFonts w:ascii="Calibri" w:hAnsi="Calibri" w:eastAsia="Calibri" w:cs="Calibri"/>
+          <w:noProof w:val="0"/>
+          <w:sz w:val="24"/>
+          <w:szCs w:val="24"/>
+          <w:lang w:val="en-GB"/>
+        </w:rPr>
+        <w:t xml:space="preserve"> revealed notable spatial separations. For instance, </w:t>
+      </w:r>
+      <w:r>
+        <w:rPr>
+          <w:rFonts w:ascii="Calibri" w:hAnsi="Calibri" w:eastAsia="Calibri" w:cs="Calibri"/>
+          <w:b w:val="1"/>
+          <w:bCs w:val="1"/>
+          <w:noProof w:val="0"/>
+          <w:sz w:val="24"/>
+          <w:szCs w:val="24"/>
+          <w:lang w:val="en-GB"/>
+        </w:rPr>
+        <w:t>Sudan</w:t>
+      </w:r>
+      <w:r>
+        <w:rPr>
+          <w:rFonts w:ascii="Calibri" w:hAnsi="Calibri" w:eastAsia="Calibri" w:cs="Calibri"/>
+          <w:noProof w:val="0"/>
+          <w:sz w:val="24"/>
+          <w:szCs w:val="24"/>
+          <w:lang w:val="en-GB"/>
+        </w:rPr>
+        <w:t xml:space="preserve"> (PC1 = 4.99, PC2 = -1.80) appeared as a clear outlier compared to countries like </w:t>
+      </w:r>
+      <w:r>
+        <w:rPr>
+          <w:rFonts w:ascii="Calibri" w:hAnsi="Calibri" w:eastAsia="Calibri" w:cs="Calibri"/>
+          <w:b w:val="1"/>
+          <w:bCs w:val="1"/>
+          <w:noProof w:val="0"/>
+          <w:sz w:val="24"/>
+          <w:szCs w:val="24"/>
+          <w:lang w:val="en-GB"/>
+        </w:rPr>
+        <w:t>Ethiopia</w:t>
+      </w:r>
+      <w:r>
+        <w:rPr>
+          <w:rFonts w:ascii="Calibri" w:hAnsi="Calibri" w:eastAsia="Calibri" w:cs="Calibri"/>
+          <w:noProof w:val="0"/>
+          <w:sz w:val="24"/>
+          <w:szCs w:val="24"/>
+          <w:lang w:val="en-GB"/>
+        </w:rPr>
+        <w:t xml:space="preserve"> (PC1 = -2.90, PC2 = -2.23) and </w:t>
+      </w:r>
+      <w:r>
+        <w:rPr>
+          <w:rFonts w:ascii="Calibri" w:hAnsi="Calibri" w:eastAsia="Calibri" w:cs="Calibri"/>
+          <w:b w:val="1"/>
+          <w:bCs w:val="1"/>
+          <w:noProof w:val="0"/>
+          <w:sz w:val="24"/>
+          <w:szCs w:val="24"/>
+          <w:lang w:val="en-GB"/>
+        </w:rPr>
+        <w:t>Mozambique</w:t>
+      </w:r>
+      <w:r>
+        <w:rPr>
+          <w:rFonts w:ascii="Calibri" w:hAnsi="Calibri" w:eastAsia="Calibri" w:cs="Calibri"/>
+          <w:noProof w:val="0"/>
+          <w:sz w:val="24"/>
+          <w:szCs w:val="24"/>
+          <w:lang w:val="en-GB"/>
+        </w:rPr>
+        <w:t xml:space="preserve"> (PC1 = -2.80, PC2 = -1.55), suggesting significant divergence in their energy-emission profiles.</w:t>
+      </w:r>
+    </w:p>
+    <w:p>
+      <w:pPr>
+        <w:spacing w:before="240" w:beforeAutospacing="off" w:after="240" w:afterAutospacing="off"/>
+      </w:pPr>
+      <w:r>
+        <w:rPr>
+          <w:rFonts w:ascii="Calibri" w:hAnsi="Calibri" w:eastAsia="Calibri" w:cs="Calibri"/>
+          <w:noProof w:val="0"/>
+          <w:sz w:val="24"/>
+          <w:szCs w:val="24"/>
+          <w:lang w:val="en-GB"/>
+        </w:rPr>
+        <w:t xml:space="preserve">Using the PCA-transformed coordinates, I calculated pairwise </w:t>
+      </w:r>
+      <w:r>
+        <w:rPr>
+          <w:rFonts w:ascii="Calibri" w:hAnsi="Calibri" w:eastAsia="Calibri" w:cs="Calibri"/>
+          <w:b w:val="1"/>
+          <w:bCs w:val="1"/>
+          <w:noProof w:val="0"/>
+          <w:sz w:val="24"/>
+          <w:szCs w:val="24"/>
+          <w:lang w:val="en-GB"/>
+        </w:rPr>
+        <w:t>Euclidean distances</w:t>
+      </w:r>
+      <w:r>
+        <w:rPr>
+          <w:rFonts w:ascii="Calibri" w:hAnsi="Calibri" w:eastAsia="Calibri" w:cs="Calibri"/>
+          <w:noProof w:val="0"/>
+          <w:sz w:val="24"/>
+          <w:szCs w:val="24"/>
+          <w:lang w:val="en-GB"/>
+        </w:rPr>
+        <w:t xml:space="preserve"> between countries, visualized via a heatmap. The </w:t>
+      </w:r>
+      <w:r>
+        <w:rPr>
+          <w:rFonts w:ascii="Calibri" w:hAnsi="Calibri" w:eastAsia="Calibri" w:cs="Calibri"/>
+          <w:b w:val="1"/>
+          <w:bCs w:val="1"/>
+          <w:noProof w:val="0"/>
+          <w:sz w:val="24"/>
+          <w:szCs w:val="24"/>
+          <w:lang w:val="en-GB"/>
+        </w:rPr>
+        <w:t>smallest distance</w:t>
+      </w:r>
+      <w:r>
+        <w:rPr>
+          <w:rFonts w:ascii="Calibri" w:hAnsi="Calibri" w:eastAsia="Calibri" w:cs="Calibri"/>
+          <w:noProof w:val="0"/>
+          <w:sz w:val="24"/>
+          <w:szCs w:val="24"/>
+          <w:lang w:val="en-GB"/>
+        </w:rPr>
+        <w:t xml:space="preserve"> was observed between </w:t>
+      </w:r>
+      <w:r>
+        <w:rPr>
+          <w:rFonts w:ascii="Calibri" w:hAnsi="Calibri" w:eastAsia="Calibri" w:cs="Calibri"/>
+          <w:b w:val="1"/>
+          <w:bCs w:val="1"/>
+          <w:noProof w:val="0"/>
+          <w:sz w:val="24"/>
+          <w:szCs w:val="24"/>
+          <w:lang w:val="en-GB"/>
+        </w:rPr>
+        <w:t>Congo, Dem. Rep.</w:t>
+      </w:r>
+      <w:r>
+        <w:rPr>
+          <w:rFonts w:ascii="Calibri" w:hAnsi="Calibri" w:eastAsia="Calibri" w:cs="Calibri"/>
+          <w:noProof w:val="0"/>
+          <w:sz w:val="24"/>
+          <w:szCs w:val="24"/>
+          <w:lang w:val="en-GB"/>
+        </w:rPr>
+        <w:t xml:space="preserve"> and </w:t>
+      </w:r>
+      <w:r>
+        <w:rPr>
+          <w:rFonts w:ascii="Calibri" w:hAnsi="Calibri" w:eastAsia="Calibri" w:cs="Calibri"/>
+          <w:b w:val="1"/>
+          <w:bCs w:val="1"/>
+          <w:noProof w:val="0"/>
+          <w:sz w:val="24"/>
+          <w:szCs w:val="24"/>
+          <w:lang w:val="en-GB"/>
+        </w:rPr>
+        <w:t>Zambia</w:t>
+      </w:r>
+      <w:r>
+        <w:rPr>
+          <w:rFonts w:ascii="Calibri" w:hAnsi="Calibri" w:eastAsia="Calibri" w:cs="Calibri"/>
+          <w:noProof w:val="0"/>
+          <w:sz w:val="24"/>
+          <w:szCs w:val="24"/>
+          <w:lang w:val="en-GB"/>
+        </w:rPr>
+        <w:t xml:space="preserve"> (Distance = 37), indicating strong similarity. In contrast, </w:t>
+      </w:r>
+      <w:r>
+        <w:rPr>
+          <w:rFonts w:ascii="Calibri" w:hAnsi="Calibri" w:eastAsia="Calibri" w:cs="Calibri"/>
+          <w:b w:val="1"/>
+          <w:bCs w:val="1"/>
+          <w:noProof w:val="0"/>
+          <w:sz w:val="24"/>
+          <w:szCs w:val="24"/>
+          <w:lang w:val="en-GB"/>
+        </w:rPr>
+        <w:t>Mozambique</w:t>
+      </w:r>
+      <w:r>
+        <w:rPr>
+          <w:rFonts w:ascii="Calibri" w:hAnsi="Calibri" w:eastAsia="Calibri" w:cs="Calibri"/>
+          <w:noProof w:val="0"/>
+          <w:sz w:val="24"/>
+          <w:szCs w:val="24"/>
+          <w:lang w:val="en-GB"/>
+        </w:rPr>
+        <w:t xml:space="preserve"> and </w:t>
+      </w:r>
+      <w:r>
+        <w:rPr>
+          <w:rFonts w:ascii="Calibri" w:hAnsi="Calibri" w:eastAsia="Calibri" w:cs="Calibri"/>
+          <w:b w:val="1"/>
+          <w:bCs w:val="1"/>
+          <w:noProof w:val="0"/>
+          <w:sz w:val="24"/>
+          <w:szCs w:val="24"/>
+          <w:lang w:val="en-GB"/>
+        </w:rPr>
+        <w:t>Sudan</w:t>
+      </w:r>
+      <w:r>
+        <w:rPr>
+          <w:rFonts w:ascii="Calibri" w:hAnsi="Calibri" w:eastAsia="Calibri" w:cs="Calibri"/>
+          <w:noProof w:val="0"/>
+          <w:sz w:val="24"/>
+          <w:szCs w:val="24"/>
+          <w:lang w:val="en-GB"/>
+        </w:rPr>
+        <w:t xml:space="preserve"> showed the </w:t>
+      </w:r>
+      <w:r>
+        <w:rPr>
+          <w:rFonts w:ascii="Calibri" w:hAnsi="Calibri" w:eastAsia="Calibri" w:cs="Calibri"/>
+          <w:b w:val="1"/>
+          <w:bCs w:val="1"/>
+          <w:noProof w:val="0"/>
+          <w:sz w:val="24"/>
+          <w:szCs w:val="24"/>
+          <w:lang w:val="en-GB"/>
+        </w:rPr>
+        <w:t>largest distance</w:t>
+      </w:r>
+      <w:r>
+        <w:rPr>
+          <w:rFonts w:ascii="Calibri" w:hAnsi="Calibri" w:eastAsia="Calibri" w:cs="Calibri"/>
+          <w:noProof w:val="0"/>
+          <w:sz w:val="24"/>
+          <w:szCs w:val="24"/>
+          <w:lang w:val="en-GB"/>
+        </w:rPr>
+        <w:t xml:space="preserve"> (Distance = 433), reflecting substantial dissimilarity in their underlying variables. Other closely grouped countries included </w:t>
+      </w:r>
+      <w:r>
+        <w:rPr>
+          <w:rFonts w:ascii="Calibri" w:hAnsi="Calibri" w:eastAsia="Calibri" w:cs="Calibri"/>
+          <w:b w:val="1"/>
+          <w:bCs w:val="1"/>
+          <w:noProof w:val="0"/>
+          <w:sz w:val="24"/>
+          <w:szCs w:val="24"/>
+          <w:lang w:val="en-GB"/>
+        </w:rPr>
+        <w:t>Ethiopia and Mozambique</w:t>
+      </w:r>
+      <w:r>
+        <w:rPr>
+          <w:rFonts w:ascii="Calibri" w:hAnsi="Calibri" w:eastAsia="Calibri" w:cs="Calibri"/>
+          <w:noProof w:val="0"/>
+          <w:sz w:val="24"/>
+          <w:szCs w:val="24"/>
+          <w:lang w:val="en-GB"/>
+        </w:rPr>
+        <w:t xml:space="preserve"> (Distance = 93), while </w:t>
+      </w:r>
+      <w:r>
+        <w:rPr>
+          <w:rFonts w:ascii="Calibri" w:hAnsi="Calibri" w:eastAsia="Calibri" w:cs="Calibri"/>
+          <w:b w:val="1"/>
+          <w:bCs w:val="1"/>
+          <w:noProof w:val="0"/>
+          <w:sz w:val="24"/>
+          <w:szCs w:val="24"/>
+          <w:lang w:val="en-GB"/>
+        </w:rPr>
+        <w:t>Niger and Sudan</w:t>
+      </w:r>
+      <w:r>
+        <w:rPr>
+          <w:rFonts w:ascii="Calibri" w:hAnsi="Calibri" w:eastAsia="Calibri" w:cs="Calibri"/>
+          <w:noProof w:val="0"/>
+          <w:sz w:val="24"/>
+          <w:szCs w:val="24"/>
+          <w:lang w:val="en-GB"/>
+        </w:rPr>
+        <w:t xml:space="preserve"> (Distance = 108) also appeared relatively similar.</w:t>
+      </w:r>
+    </w:p>
+    <w:p>
+      <w:pPr>
+        <w:pStyle w:val="Heading4"/>
+        <w:spacing w:before="319" w:beforeAutospacing="off" w:after="319" w:afterAutospacing="off"/>
+        <w:rPr>
+          <w:rFonts w:ascii="Calibri" w:hAnsi="Calibri" w:eastAsia="Calibri" w:cs="Calibri"/>
+          <w:b w:val="1"/>
+          <w:bCs w:val="1"/>
+          <w:noProof w:val="0"/>
+          <w:color w:val="auto"/>
+          <w:sz w:val="24"/>
+          <w:szCs w:val="24"/>
+          <w:lang w:val="en-GB"/>
+        </w:rPr>
+      </w:pPr>
+      <w:r>
+        <w:rPr>
+          <w:rFonts w:ascii="Calibri" w:hAnsi="Calibri" w:eastAsia="Calibri" w:cs="Calibri"/>
+          <w:b w:val="1"/>
+          <w:bCs w:val="1"/>
+          <w:noProof w:val="0"/>
+          <w:color w:val="auto"/>
+          <w:sz w:val="24"/>
+          <w:szCs w:val="24"/>
+          <w:lang w:val="en-GB"/>
+        </w:rPr>
+        <w:t>Lower Middle-Income Countries</w:t>
+      </w:r>
+    </w:p>
+    <w:p>
+      <w:pPr>
+        <w:spacing w:before="240" w:beforeAutospacing="off" w:after="240" w:afterAutospacing="off"/>
+      </w:pPr>
+      <w:r>
+        <w:rPr>
+          <w:rFonts w:ascii="Calibri" w:hAnsi="Calibri" w:eastAsia="Calibri" w:cs="Calibri"/>
+          <w:noProof w:val="0"/>
+          <w:sz w:val="24"/>
+          <w:szCs w:val="24"/>
+          <w:lang w:val="en-GB"/>
+        </w:rPr>
+        <w:t xml:space="preserve">In the lower middle-income group, the </w:t>
+      </w:r>
+      <w:r>
+        <w:rPr>
+          <w:rFonts w:ascii="Calibri" w:hAnsi="Calibri" w:eastAsia="Calibri" w:cs="Calibri"/>
+          <w:b w:val="1"/>
+          <w:bCs w:val="1"/>
+          <w:noProof w:val="0"/>
+          <w:sz w:val="24"/>
+          <w:szCs w:val="24"/>
+          <w:lang w:val="en-GB"/>
+        </w:rPr>
+        <w:t>first six PCA components</w:t>
+      </w:r>
+      <w:r>
+        <w:rPr>
+          <w:rFonts w:ascii="Calibri" w:hAnsi="Calibri" w:eastAsia="Calibri" w:cs="Calibri"/>
+          <w:noProof w:val="0"/>
+          <w:sz w:val="24"/>
+          <w:szCs w:val="24"/>
+          <w:lang w:val="en-GB"/>
+        </w:rPr>
+        <w:t xml:space="preserve"> explained approximately </w:t>
+      </w:r>
+      <w:r>
+        <w:rPr>
+          <w:rFonts w:ascii="Calibri" w:hAnsi="Calibri" w:eastAsia="Calibri" w:cs="Calibri"/>
+          <w:b w:val="1"/>
+          <w:bCs w:val="1"/>
+          <w:noProof w:val="0"/>
+          <w:sz w:val="24"/>
+          <w:szCs w:val="24"/>
+          <w:lang w:val="en-GB"/>
+        </w:rPr>
+        <w:t>88% of the cumulative variance</w:t>
+      </w:r>
+      <w:r>
+        <w:rPr>
+          <w:rFonts w:ascii="Calibri" w:hAnsi="Calibri" w:eastAsia="Calibri" w:cs="Calibri"/>
+          <w:noProof w:val="0"/>
+          <w:sz w:val="24"/>
+          <w:szCs w:val="24"/>
+          <w:lang w:val="en-GB"/>
+        </w:rPr>
+        <w:t xml:space="preserve">, crossing </w:t>
+      </w:r>
+      <w:r>
+        <w:rPr>
+          <w:rFonts w:ascii="Calibri" w:hAnsi="Calibri" w:eastAsia="Calibri" w:cs="Calibri"/>
+          <w:b w:val="1"/>
+          <w:bCs w:val="1"/>
+          <w:noProof w:val="0"/>
+          <w:sz w:val="24"/>
+          <w:szCs w:val="24"/>
+          <w:lang w:val="en-GB"/>
+        </w:rPr>
+        <w:t>95%</w:t>
+      </w:r>
+      <w:r>
+        <w:rPr>
+          <w:rFonts w:ascii="Calibri" w:hAnsi="Calibri" w:eastAsia="Calibri" w:cs="Calibri"/>
+          <w:noProof w:val="0"/>
+          <w:sz w:val="24"/>
+          <w:szCs w:val="24"/>
+          <w:lang w:val="en-GB"/>
+        </w:rPr>
+        <w:t xml:space="preserve"> by the eighth component. The </w:t>
+      </w:r>
+      <w:r>
+        <w:rPr>
+          <w:rFonts w:ascii="Calibri" w:hAnsi="Calibri" w:eastAsia="Calibri" w:cs="Calibri"/>
+          <w:b w:val="1"/>
+          <w:bCs w:val="1"/>
+          <w:noProof w:val="0"/>
+          <w:sz w:val="24"/>
+          <w:szCs w:val="24"/>
+          <w:lang w:val="en-GB"/>
+        </w:rPr>
+        <w:t>PCA scatter plot</w:t>
+      </w:r>
+      <w:r>
+        <w:rPr>
+          <w:rFonts w:ascii="Calibri" w:hAnsi="Calibri" w:eastAsia="Calibri" w:cs="Calibri"/>
+          <w:noProof w:val="0"/>
+          <w:sz w:val="24"/>
+          <w:szCs w:val="24"/>
+          <w:lang w:val="en-GB"/>
+        </w:rPr>
+        <w:t xml:space="preserve"> showed widespread dispersion, with </w:t>
+      </w:r>
+      <w:r>
+        <w:rPr>
+          <w:rFonts w:ascii="Calibri" w:hAnsi="Calibri" w:eastAsia="Calibri" w:cs="Calibri"/>
+          <w:b w:val="1"/>
+          <w:bCs w:val="1"/>
+          <w:noProof w:val="0"/>
+          <w:sz w:val="24"/>
+          <w:szCs w:val="24"/>
+          <w:lang w:val="en-GB"/>
+        </w:rPr>
+        <w:t>India</w:t>
+      </w:r>
+      <w:r>
+        <w:rPr>
+          <w:rFonts w:ascii="Calibri" w:hAnsi="Calibri" w:eastAsia="Calibri" w:cs="Calibri"/>
+          <w:noProof w:val="0"/>
+          <w:sz w:val="24"/>
+          <w:szCs w:val="24"/>
+          <w:lang w:val="en-GB"/>
+        </w:rPr>
+        <w:t xml:space="preserve"> (PC1 = 1.30, PC2 = 5.58) and </w:t>
+      </w:r>
+      <w:r>
+        <w:rPr>
+          <w:rFonts w:ascii="Calibri" w:hAnsi="Calibri" w:eastAsia="Calibri" w:cs="Calibri"/>
+          <w:b w:val="1"/>
+          <w:bCs w:val="1"/>
+          <w:noProof w:val="0"/>
+          <w:sz w:val="24"/>
+          <w:szCs w:val="24"/>
+          <w:lang w:val="en-GB"/>
+        </w:rPr>
+        <w:t>Ukraine</w:t>
+      </w:r>
+      <w:r>
+        <w:rPr>
+          <w:rFonts w:ascii="Calibri" w:hAnsi="Calibri" w:eastAsia="Calibri" w:cs="Calibri"/>
+          <w:noProof w:val="0"/>
+          <w:sz w:val="24"/>
+          <w:szCs w:val="24"/>
+          <w:lang w:val="en-GB"/>
+        </w:rPr>
+        <w:t xml:space="preserve"> (PC1 = 6.54, PC2 = -3.48) positioned at extremes. This highlighted significant diversity in the energy-emission characteristics across this income group.</w:t>
+      </w:r>
+    </w:p>
+    <w:p>
+      <w:pPr>
+        <w:spacing w:before="240" w:beforeAutospacing="off" w:after="240" w:afterAutospacing="off"/>
+      </w:pPr>
+      <w:r>
+        <w:rPr>
+          <w:rFonts w:ascii="Calibri" w:hAnsi="Calibri" w:eastAsia="Calibri" w:cs="Calibri"/>
+          <w:noProof w:val="0"/>
+          <w:sz w:val="24"/>
+          <w:szCs w:val="24"/>
+          <w:lang w:val="en-GB"/>
+        </w:rPr>
+        <w:t xml:space="preserve">The corresponding </w:t>
+      </w:r>
+      <w:r>
+        <w:rPr>
+          <w:rFonts w:ascii="Calibri" w:hAnsi="Calibri" w:eastAsia="Calibri" w:cs="Calibri"/>
+          <w:b w:val="1"/>
+          <w:bCs w:val="1"/>
+          <w:noProof w:val="0"/>
+          <w:sz w:val="24"/>
+          <w:szCs w:val="24"/>
+          <w:lang w:val="en-GB"/>
+        </w:rPr>
+        <w:t>Euclidean distance matrix</w:t>
+      </w:r>
+      <w:r>
+        <w:rPr>
+          <w:rFonts w:ascii="Calibri" w:hAnsi="Calibri" w:eastAsia="Calibri" w:cs="Calibri"/>
+          <w:noProof w:val="0"/>
+          <w:sz w:val="24"/>
+          <w:szCs w:val="24"/>
+          <w:lang w:val="en-GB"/>
+        </w:rPr>
+        <w:t xml:space="preserve"> revealed the </w:t>
+      </w:r>
+      <w:r>
+        <w:rPr>
+          <w:rFonts w:ascii="Calibri" w:hAnsi="Calibri" w:eastAsia="Calibri" w:cs="Calibri"/>
+          <w:b w:val="1"/>
+          <w:bCs w:val="1"/>
+          <w:noProof w:val="0"/>
+          <w:sz w:val="24"/>
+          <w:szCs w:val="24"/>
+          <w:lang w:val="en-GB"/>
+        </w:rPr>
+        <w:t>closest country pair</w:t>
+      </w:r>
+      <w:r>
+        <w:rPr>
+          <w:rFonts w:ascii="Calibri" w:hAnsi="Calibri" w:eastAsia="Calibri" w:cs="Calibri"/>
+          <w:noProof w:val="0"/>
+          <w:sz w:val="24"/>
+          <w:szCs w:val="24"/>
+          <w:lang w:val="en-GB"/>
+        </w:rPr>
+        <w:t xml:space="preserve"> to be </w:t>
+      </w:r>
+      <w:r>
+        <w:rPr>
+          <w:rFonts w:ascii="Calibri" w:hAnsi="Calibri" w:eastAsia="Calibri" w:cs="Calibri"/>
+          <w:b w:val="1"/>
+          <w:bCs w:val="1"/>
+          <w:noProof w:val="0"/>
+          <w:sz w:val="24"/>
+          <w:szCs w:val="24"/>
+          <w:lang w:val="en-GB"/>
+        </w:rPr>
+        <w:t>Sri Lanka and Angola</w:t>
+      </w:r>
+      <w:r>
+        <w:rPr>
+          <w:rFonts w:ascii="Calibri" w:hAnsi="Calibri" w:eastAsia="Calibri" w:cs="Calibri"/>
+          <w:noProof w:val="0"/>
+          <w:sz w:val="24"/>
+          <w:szCs w:val="24"/>
+          <w:lang w:val="en-GB"/>
+        </w:rPr>
+        <w:t xml:space="preserve"> (Distance = 38.81), followed closely by </w:t>
+      </w:r>
+      <w:r>
+        <w:rPr>
+          <w:rFonts w:ascii="Calibri" w:hAnsi="Calibri" w:eastAsia="Calibri" w:cs="Calibri"/>
+          <w:b w:val="1"/>
+          <w:bCs w:val="1"/>
+          <w:noProof w:val="0"/>
+          <w:sz w:val="24"/>
+          <w:szCs w:val="24"/>
+          <w:lang w:val="en-GB"/>
+        </w:rPr>
+        <w:t>Cameroon and Angola</w:t>
+      </w:r>
+      <w:r>
+        <w:rPr>
+          <w:rFonts w:ascii="Calibri" w:hAnsi="Calibri" w:eastAsia="Calibri" w:cs="Calibri"/>
+          <w:noProof w:val="0"/>
+          <w:sz w:val="24"/>
+          <w:szCs w:val="24"/>
+          <w:lang w:val="en-GB"/>
+        </w:rPr>
+        <w:t xml:space="preserve"> (Distance = 57.39), and </w:t>
+      </w:r>
+      <w:r>
+        <w:rPr>
+          <w:rFonts w:ascii="Calibri" w:hAnsi="Calibri" w:eastAsia="Calibri" w:cs="Calibri"/>
+          <w:b w:val="1"/>
+          <w:bCs w:val="1"/>
+          <w:noProof w:val="0"/>
+          <w:sz w:val="24"/>
+          <w:szCs w:val="24"/>
+          <w:lang w:val="en-GB"/>
+        </w:rPr>
+        <w:t>Nicaragua and Cote d'Ivoire</w:t>
+      </w:r>
+      <w:r>
+        <w:rPr>
+          <w:rFonts w:ascii="Calibri" w:hAnsi="Calibri" w:eastAsia="Calibri" w:cs="Calibri"/>
+          <w:noProof w:val="0"/>
+          <w:sz w:val="24"/>
+          <w:szCs w:val="24"/>
+          <w:lang w:val="en-GB"/>
+        </w:rPr>
+        <w:t xml:space="preserve"> (Distance = 33.65), suggesting these nations have nearly identical environmental-energy profiles after PCA reduction. Conversely, </w:t>
+      </w:r>
+      <w:r>
+        <w:rPr>
+          <w:rFonts w:ascii="Calibri" w:hAnsi="Calibri" w:eastAsia="Calibri" w:cs="Calibri"/>
+          <w:b w:val="1"/>
+          <w:bCs w:val="1"/>
+          <w:noProof w:val="0"/>
+          <w:sz w:val="24"/>
+          <w:szCs w:val="24"/>
+          <w:lang w:val="en-GB"/>
+        </w:rPr>
+        <w:t>India and Bangladesh</w:t>
+      </w:r>
+      <w:r>
+        <w:rPr>
+          <w:rFonts w:ascii="Calibri" w:hAnsi="Calibri" w:eastAsia="Calibri" w:cs="Calibri"/>
+          <w:noProof w:val="0"/>
+          <w:sz w:val="24"/>
+          <w:szCs w:val="24"/>
+          <w:lang w:val="en-GB"/>
+        </w:rPr>
+        <w:t xml:space="preserve"> (Distance = 2714.88), and </w:t>
+      </w:r>
+      <w:r>
+        <w:rPr>
+          <w:rFonts w:ascii="Calibri" w:hAnsi="Calibri" w:eastAsia="Calibri" w:cs="Calibri"/>
+          <w:b w:val="1"/>
+          <w:bCs w:val="1"/>
+          <w:noProof w:val="0"/>
+          <w:sz w:val="24"/>
+          <w:szCs w:val="24"/>
+          <w:lang w:val="en-GB"/>
+        </w:rPr>
+        <w:t>India and Congo, Rep.</w:t>
+      </w:r>
+      <w:r>
+        <w:rPr>
+          <w:rFonts w:ascii="Calibri" w:hAnsi="Calibri" w:eastAsia="Calibri" w:cs="Calibri"/>
+          <w:noProof w:val="0"/>
+          <w:sz w:val="24"/>
+          <w:szCs w:val="24"/>
+          <w:lang w:val="en-GB"/>
+        </w:rPr>
+        <w:t xml:space="preserve"> (Distance = 2884.27) formed some of the </w:t>
+      </w:r>
+      <w:r>
+        <w:rPr>
+          <w:rFonts w:ascii="Calibri" w:hAnsi="Calibri" w:eastAsia="Calibri" w:cs="Calibri"/>
+          <w:b w:val="1"/>
+          <w:bCs w:val="1"/>
+          <w:noProof w:val="0"/>
+          <w:sz w:val="24"/>
+          <w:szCs w:val="24"/>
+          <w:lang w:val="en-GB"/>
+        </w:rPr>
+        <w:t>most distant pairs</w:t>
+      </w:r>
+      <w:r>
+        <w:rPr>
+          <w:rFonts w:ascii="Calibri" w:hAnsi="Calibri" w:eastAsia="Calibri" w:cs="Calibri"/>
+          <w:noProof w:val="0"/>
+          <w:sz w:val="24"/>
+          <w:szCs w:val="24"/>
+          <w:lang w:val="en-GB"/>
+        </w:rPr>
+        <w:t>, pointing to distinct energy-emission behaviors and levels of industrial development. These results underscore a broad spectrum of structural patterns within this income group.</w:t>
+      </w:r>
+    </w:p>
+    <w:p>
+      <w:pPr>
+        <w:pStyle w:val="Heading4"/>
+        <w:spacing w:before="319" w:beforeAutospacing="off" w:after="319" w:afterAutospacing="off"/>
+        <w:rPr>
+          <w:rFonts w:ascii="Calibri" w:hAnsi="Calibri" w:eastAsia="Calibri" w:cs="Calibri"/>
+          <w:b w:val="1"/>
+          <w:bCs w:val="1"/>
+          <w:noProof w:val="0"/>
+          <w:color w:val="auto"/>
+          <w:sz w:val="24"/>
+          <w:szCs w:val="24"/>
+          <w:lang w:val="en-GB"/>
+        </w:rPr>
+      </w:pPr>
+      <w:r>
+        <w:rPr>
+          <w:rFonts w:ascii="Calibri" w:hAnsi="Calibri" w:eastAsia="Calibri" w:cs="Calibri"/>
+          <w:b w:val="1"/>
+          <w:bCs w:val="1"/>
+          <w:noProof w:val="0"/>
+          <w:color w:val="auto"/>
+          <w:sz w:val="24"/>
+          <w:szCs w:val="24"/>
+          <w:lang w:val="en-GB"/>
+        </w:rPr>
+        <w:t>Upper Middle-Income Countries</w:t>
+      </w:r>
+    </w:p>
+    <w:p>
+      <w:pPr>
+        <w:spacing w:before="240" w:beforeAutospacing="off" w:after="240" w:afterAutospacing="off"/>
+      </w:pPr>
+      <w:r>
+        <w:rPr>
+          <w:rFonts w:ascii="Calibri" w:hAnsi="Calibri" w:eastAsia="Calibri" w:cs="Calibri"/>
+          <w:noProof w:val="0"/>
+          <w:sz w:val="24"/>
+          <w:szCs w:val="24"/>
+          <w:lang w:val="en-GB"/>
+        </w:rPr>
+        <w:t xml:space="preserve">Among upper middle-income countries, the </w:t>
+      </w:r>
+      <w:r>
+        <w:rPr>
+          <w:rFonts w:ascii="Calibri" w:hAnsi="Calibri" w:eastAsia="Calibri" w:cs="Calibri"/>
+          <w:b w:val="1"/>
+          <w:bCs w:val="1"/>
+          <w:noProof w:val="0"/>
+          <w:sz w:val="24"/>
+          <w:szCs w:val="24"/>
+          <w:lang w:val="en-GB"/>
+        </w:rPr>
+        <w:t>first six principal components</w:t>
+      </w:r>
+      <w:r>
+        <w:rPr>
+          <w:rFonts w:ascii="Calibri" w:hAnsi="Calibri" w:eastAsia="Calibri" w:cs="Calibri"/>
+          <w:noProof w:val="0"/>
+          <w:sz w:val="24"/>
+          <w:szCs w:val="24"/>
+          <w:lang w:val="en-GB"/>
+        </w:rPr>
+        <w:t xml:space="preserve"> explained over </w:t>
+      </w:r>
+      <w:r>
+        <w:rPr>
+          <w:rFonts w:ascii="Calibri" w:hAnsi="Calibri" w:eastAsia="Calibri" w:cs="Calibri"/>
+          <w:b w:val="1"/>
+          <w:bCs w:val="1"/>
+          <w:noProof w:val="0"/>
+          <w:sz w:val="24"/>
+          <w:szCs w:val="24"/>
+          <w:lang w:val="en-GB"/>
+        </w:rPr>
+        <w:t>90% of the cumulative variance</w:t>
+      </w:r>
+      <w:r>
+        <w:rPr>
+          <w:rFonts w:ascii="Calibri" w:hAnsi="Calibri" w:eastAsia="Calibri" w:cs="Calibri"/>
+          <w:noProof w:val="0"/>
+          <w:sz w:val="24"/>
+          <w:szCs w:val="24"/>
+          <w:lang w:val="en-GB"/>
+        </w:rPr>
+        <w:t xml:space="preserve">, reaching </w:t>
+      </w:r>
+      <w:r>
+        <w:rPr>
+          <w:rFonts w:ascii="Calibri" w:hAnsi="Calibri" w:eastAsia="Calibri" w:cs="Calibri"/>
+          <w:noProof w:val="0"/>
+          <w:sz w:val="24"/>
+          <w:szCs w:val="24"/>
+          <w:lang w:val="en-GB"/>
+        </w:rPr>
+        <w:t xml:space="preserve">nearly </w:t>
+      </w:r>
+      <w:r>
+        <w:rPr>
+          <w:rFonts w:ascii="Calibri" w:hAnsi="Calibri" w:eastAsia="Calibri" w:cs="Calibri"/>
+          <w:b w:val="1"/>
+          <w:bCs w:val="1"/>
+          <w:noProof w:val="0"/>
+          <w:sz w:val="24"/>
+          <w:szCs w:val="24"/>
+          <w:lang w:val="en-GB"/>
+        </w:rPr>
+        <w:t>100%</w:t>
+      </w:r>
+      <w:r>
+        <w:rPr>
+          <w:rFonts w:ascii="Calibri" w:hAnsi="Calibri" w:eastAsia="Calibri" w:cs="Calibri"/>
+          <w:noProof w:val="0"/>
+          <w:sz w:val="24"/>
+          <w:szCs w:val="24"/>
+          <w:lang w:val="en-GB"/>
+        </w:rPr>
+        <w:t xml:space="preserve"> by the twelfth. In the </w:t>
+      </w:r>
+      <w:r>
+        <w:rPr>
+          <w:rFonts w:ascii="Calibri" w:hAnsi="Calibri" w:eastAsia="Calibri" w:cs="Calibri"/>
+          <w:b w:val="1"/>
+          <w:bCs w:val="1"/>
+          <w:noProof w:val="0"/>
+          <w:sz w:val="24"/>
+          <w:szCs w:val="24"/>
+          <w:lang w:val="en-GB"/>
+        </w:rPr>
+        <w:t>PCA scatter plot</w:t>
+      </w:r>
+      <w:r>
+        <w:rPr>
+          <w:rFonts w:ascii="Calibri" w:hAnsi="Calibri" w:eastAsia="Calibri" w:cs="Calibri"/>
+          <w:noProof w:val="0"/>
+          <w:sz w:val="24"/>
+          <w:szCs w:val="24"/>
+          <w:lang w:val="en-GB"/>
+        </w:rPr>
+        <w:t xml:space="preserve">, countries like </w:t>
+      </w:r>
+      <w:r>
+        <w:rPr>
+          <w:rFonts w:ascii="Calibri" w:hAnsi="Calibri" w:eastAsia="Calibri" w:cs="Calibri"/>
+          <w:b w:val="1"/>
+          <w:bCs w:val="1"/>
+          <w:noProof w:val="0"/>
+          <w:sz w:val="24"/>
+          <w:szCs w:val="24"/>
+          <w:lang w:val="en-GB"/>
+        </w:rPr>
+        <w:t>Kazakhstan</w:t>
+      </w:r>
+      <w:r>
+        <w:rPr>
+          <w:rFonts w:ascii="Calibri" w:hAnsi="Calibri" w:eastAsia="Calibri" w:cs="Calibri"/>
+          <w:noProof w:val="0"/>
+          <w:sz w:val="24"/>
+          <w:szCs w:val="24"/>
+          <w:lang w:val="en-GB"/>
+        </w:rPr>
+        <w:t xml:space="preserve"> (PC1 = 5.67, PC2 = 2.21), </w:t>
+      </w:r>
+      <w:r>
+        <w:rPr>
+          <w:rFonts w:ascii="Calibri" w:hAnsi="Calibri" w:eastAsia="Calibri" w:cs="Calibri"/>
+          <w:b w:val="1"/>
+          <w:bCs w:val="1"/>
+          <w:noProof w:val="0"/>
+          <w:sz w:val="24"/>
+          <w:szCs w:val="24"/>
+          <w:lang w:val="en-GB"/>
+        </w:rPr>
+        <w:t>South Africa</w:t>
+      </w:r>
+      <w:r>
+        <w:rPr>
+          <w:rFonts w:ascii="Calibri" w:hAnsi="Calibri" w:eastAsia="Calibri" w:cs="Calibri"/>
+          <w:noProof w:val="0"/>
+          <w:sz w:val="24"/>
+          <w:szCs w:val="24"/>
+          <w:lang w:val="en-GB"/>
+        </w:rPr>
+        <w:t xml:space="preserve"> (PC1 = 4.58, PC2 = 1.93), and </w:t>
+      </w:r>
+      <w:r>
+        <w:rPr>
+          <w:rFonts w:ascii="Calibri" w:hAnsi="Calibri" w:eastAsia="Calibri" w:cs="Calibri"/>
+          <w:b w:val="1"/>
+          <w:bCs w:val="1"/>
+          <w:noProof w:val="0"/>
+          <w:sz w:val="24"/>
+          <w:szCs w:val="24"/>
+          <w:lang w:val="en-GB"/>
+        </w:rPr>
+        <w:t>Paraguay</w:t>
+      </w:r>
+      <w:r>
+        <w:rPr>
+          <w:rFonts w:ascii="Calibri" w:hAnsi="Calibri" w:eastAsia="Calibri" w:cs="Calibri"/>
+          <w:noProof w:val="0"/>
+          <w:sz w:val="24"/>
+          <w:szCs w:val="24"/>
+          <w:lang w:val="en-GB"/>
+        </w:rPr>
+        <w:t xml:space="preserve"> (PC1 = -4.30, PC2 = 2.23) were visibly distant from the central cluster, revealing regional extremes in energy and emission metrics,</w:t>
+      </w:r>
+      <w:r>
+        <w:rPr>
+          <w:rFonts w:ascii="Calibri" w:hAnsi="Calibri" w:eastAsia="Calibri" w:cs="Calibri"/>
+          <w:noProof w:val="0"/>
+          <w:sz w:val="24"/>
+          <w:szCs w:val="24"/>
+          <w:lang w:val="en-GB"/>
+        </w:rPr>
+        <w:t xml:space="preserve"> with </w:t>
+      </w:r>
+      <w:r>
+        <w:rPr>
+          <w:rFonts w:ascii="Calibri" w:hAnsi="Calibri" w:eastAsia="Calibri" w:cs="Calibri"/>
+          <w:b w:val="1"/>
+          <w:bCs w:val="1"/>
+          <w:noProof w:val="0"/>
+          <w:sz w:val="24"/>
+          <w:szCs w:val="24"/>
+          <w:lang w:val="en-GB"/>
+        </w:rPr>
+        <w:t>Gabon</w:t>
+      </w:r>
+      <w:r>
+        <w:rPr>
+          <w:rFonts w:ascii="Calibri" w:hAnsi="Calibri" w:eastAsia="Calibri" w:cs="Calibri"/>
+          <w:noProof w:val="0"/>
+          <w:sz w:val="24"/>
+          <w:szCs w:val="24"/>
+          <w:lang w:val="en-GB"/>
+        </w:rPr>
+        <w:t xml:space="preserve"> (PC2 = 6.29) being a major outlier in PC2.</w:t>
+      </w:r>
+    </w:p>
+    <w:p>
+      <w:pPr>
+        <w:spacing w:before="240" w:beforeAutospacing="off" w:after="240" w:afterAutospacing="off"/>
+      </w:pPr>
+      <w:r>
+        <w:rPr>
+          <w:rFonts w:ascii="Calibri" w:hAnsi="Calibri" w:eastAsia="Calibri" w:cs="Calibri"/>
+          <w:noProof w:val="0"/>
+          <w:sz w:val="24"/>
+          <w:szCs w:val="24"/>
+          <w:lang w:val="en-GB"/>
+        </w:rPr>
+        <w:t xml:space="preserve">From the </w:t>
+      </w:r>
+      <w:r>
+        <w:rPr>
+          <w:rFonts w:ascii="Calibri" w:hAnsi="Calibri" w:eastAsia="Calibri" w:cs="Calibri"/>
+          <w:b w:val="1"/>
+          <w:bCs w:val="1"/>
+          <w:noProof w:val="0"/>
+          <w:sz w:val="24"/>
+          <w:szCs w:val="24"/>
+          <w:lang w:val="en-GB"/>
+        </w:rPr>
+        <w:t>Euclidean distance matrix</w:t>
+      </w:r>
+      <w:r>
+        <w:rPr>
+          <w:rFonts w:ascii="Calibri" w:hAnsi="Calibri" w:eastAsia="Calibri" w:cs="Calibri"/>
+          <w:noProof w:val="0"/>
+          <w:sz w:val="24"/>
+          <w:szCs w:val="24"/>
+          <w:lang w:val="en-GB"/>
+        </w:rPr>
+        <w:t xml:space="preserve">, the </w:t>
+      </w:r>
+      <w:r>
+        <w:rPr>
+          <w:rFonts w:ascii="Calibri" w:hAnsi="Calibri" w:eastAsia="Calibri" w:cs="Calibri"/>
+          <w:b w:val="1"/>
+          <w:bCs w:val="1"/>
+          <w:noProof w:val="0"/>
+          <w:sz w:val="24"/>
+          <w:szCs w:val="24"/>
+          <w:lang w:val="en-GB"/>
+        </w:rPr>
+        <w:t>closest pair</w:t>
+      </w:r>
+      <w:r>
+        <w:rPr>
+          <w:rFonts w:ascii="Calibri" w:hAnsi="Calibri" w:eastAsia="Calibri" w:cs="Calibri"/>
+          <w:noProof w:val="0"/>
+          <w:sz w:val="24"/>
+          <w:szCs w:val="24"/>
+          <w:lang w:val="en-GB"/>
+        </w:rPr>
+        <w:t xml:space="preserve"> was </w:t>
+      </w:r>
+      <w:r>
+        <w:rPr>
+          <w:rFonts w:ascii="Calibri" w:hAnsi="Calibri" w:eastAsia="Calibri" w:cs="Calibri"/>
+          <w:b w:val="1"/>
+          <w:bCs w:val="1"/>
+          <w:noProof w:val="0"/>
+          <w:sz w:val="24"/>
+          <w:szCs w:val="24"/>
+          <w:lang w:val="en-GB"/>
+        </w:rPr>
+        <w:t>Thailand and Turkiye</w:t>
+      </w:r>
+      <w:r>
+        <w:rPr>
+          <w:rFonts w:ascii="Calibri" w:hAnsi="Calibri" w:eastAsia="Calibri" w:cs="Calibri"/>
+          <w:noProof w:val="0"/>
+          <w:sz w:val="24"/>
+          <w:szCs w:val="24"/>
+          <w:lang w:val="en-GB"/>
+        </w:rPr>
+        <w:t xml:space="preserve"> (Distance = 84.63), followed by </w:t>
+      </w:r>
+      <w:r>
+        <w:rPr>
+          <w:rFonts w:ascii="Calibri" w:hAnsi="Calibri" w:eastAsia="Calibri" w:cs="Calibri"/>
+          <w:b w:val="1"/>
+          <w:bCs w:val="1"/>
+          <w:noProof w:val="0"/>
+          <w:sz w:val="24"/>
+          <w:szCs w:val="24"/>
+          <w:lang w:val="en-GB"/>
+        </w:rPr>
+        <w:t>Namibia and Suriname</w:t>
+      </w:r>
+      <w:r>
+        <w:rPr>
+          <w:rFonts w:ascii="Calibri" w:hAnsi="Calibri" w:eastAsia="Calibri" w:cs="Calibri"/>
+          <w:noProof w:val="0"/>
+          <w:sz w:val="24"/>
+          <w:szCs w:val="24"/>
+          <w:lang w:val="en-GB"/>
+        </w:rPr>
+        <w:t xml:space="preserve"> (Distance = 55.03), and </w:t>
+      </w:r>
+      <w:r>
+        <w:rPr>
+          <w:rFonts w:ascii="Calibri" w:hAnsi="Calibri" w:eastAsia="Calibri" w:cs="Calibri"/>
+          <w:b w:val="1"/>
+          <w:bCs w:val="1"/>
+          <w:noProof w:val="0"/>
+          <w:sz w:val="24"/>
+          <w:szCs w:val="24"/>
+          <w:lang w:val="en-GB"/>
+        </w:rPr>
+        <w:t>Dominican Republic and Suriname</w:t>
+      </w:r>
+      <w:r>
+        <w:rPr>
+          <w:rFonts w:ascii="Calibri" w:hAnsi="Calibri" w:eastAsia="Calibri" w:cs="Calibri"/>
+          <w:noProof w:val="0"/>
+          <w:sz w:val="24"/>
+          <w:szCs w:val="24"/>
+          <w:lang w:val="en-GB"/>
+        </w:rPr>
+        <w:t xml:space="preserve"> (Distance = 47.25), indicating shared characteristics in reduced PCA space. On the other hand, </w:t>
+      </w:r>
+      <w:r>
+        <w:rPr>
+          <w:rFonts w:ascii="Calibri" w:hAnsi="Calibri" w:eastAsia="Calibri" w:cs="Calibri"/>
+          <w:b w:val="1"/>
+          <w:bCs w:val="1"/>
+          <w:noProof w:val="0"/>
+          <w:sz w:val="24"/>
+          <w:szCs w:val="24"/>
+          <w:lang w:val="en-GB"/>
+        </w:rPr>
+        <w:t>Brazil</w:t>
+      </w:r>
+      <w:r>
+        <w:rPr>
+          <w:rFonts w:ascii="Calibri" w:hAnsi="Calibri" w:eastAsia="Calibri" w:cs="Calibri"/>
+          <w:noProof w:val="0"/>
+          <w:sz w:val="24"/>
+          <w:szCs w:val="24"/>
+          <w:lang w:val="en-GB"/>
+        </w:rPr>
+        <w:t xml:space="preserve"> showed the </w:t>
+      </w:r>
+      <w:r>
+        <w:rPr>
+          <w:rFonts w:ascii="Calibri" w:hAnsi="Calibri" w:eastAsia="Calibri" w:cs="Calibri"/>
+          <w:b w:val="1"/>
+          <w:bCs w:val="1"/>
+          <w:noProof w:val="0"/>
+          <w:sz w:val="24"/>
+          <w:szCs w:val="24"/>
+          <w:lang w:val="en-GB"/>
+        </w:rPr>
+        <w:t>largest distances</w:t>
+      </w:r>
+      <w:r>
+        <w:rPr>
+          <w:rFonts w:ascii="Calibri" w:hAnsi="Calibri" w:eastAsia="Calibri" w:cs="Calibri"/>
+          <w:noProof w:val="0"/>
+          <w:sz w:val="24"/>
+          <w:szCs w:val="24"/>
+          <w:lang w:val="en-GB"/>
+        </w:rPr>
+        <w:t xml:space="preserve"> from many countries, such as </w:t>
+      </w:r>
+      <w:r>
+        <w:rPr>
+          <w:rFonts w:ascii="Calibri" w:hAnsi="Calibri" w:eastAsia="Calibri" w:cs="Calibri"/>
+          <w:b w:val="1"/>
+          <w:bCs w:val="1"/>
+          <w:noProof w:val="0"/>
+          <w:sz w:val="24"/>
+          <w:szCs w:val="24"/>
+          <w:lang w:val="en-GB"/>
+        </w:rPr>
+        <w:t>Brazil and Albania</w:t>
+      </w:r>
+      <w:r>
+        <w:rPr>
+          <w:rFonts w:ascii="Calibri" w:hAnsi="Calibri" w:eastAsia="Calibri" w:cs="Calibri"/>
+          <w:noProof w:val="0"/>
+          <w:sz w:val="24"/>
+          <w:szCs w:val="24"/>
+          <w:lang w:val="en-GB"/>
+        </w:rPr>
+        <w:t xml:space="preserve"> (Distance = 1082.91) and </w:t>
+      </w:r>
+      <w:r>
+        <w:rPr>
+          <w:rFonts w:ascii="Calibri" w:hAnsi="Calibri" w:eastAsia="Calibri" w:cs="Calibri"/>
+          <w:b w:val="1"/>
+          <w:bCs w:val="1"/>
+          <w:noProof w:val="0"/>
+          <w:sz w:val="24"/>
+          <w:szCs w:val="24"/>
+          <w:lang w:val="en-GB"/>
+        </w:rPr>
+        <w:t>Brazil and Botswana</w:t>
+      </w:r>
+      <w:r>
+        <w:rPr>
+          <w:rFonts w:ascii="Calibri" w:hAnsi="Calibri" w:eastAsia="Calibri" w:cs="Calibri"/>
+          <w:noProof w:val="0"/>
+          <w:sz w:val="24"/>
+          <w:szCs w:val="24"/>
+          <w:lang w:val="en-GB"/>
+        </w:rPr>
+        <w:t xml:space="preserve"> (Distance = 1084.13), reflecting significant divergence in energy-related indicators. This variation highlights how regional energy policies, resource structures, and development priorities shape the clustering of nations.</w:t>
       </w:r>
     </w:p>
     <w:p>

</xml_diff>

<commit_message>
clustering based on pca coordinates, geographical cluster result subsection
</commit_message>
<xml_diff>
--- a/reports/FPR/FPR_23015862_NazmulHossain.docx
+++ b/reports/FPR/FPR_23015862_NazmulHossain.docx
@@ -11823,7 +11823,19 @@
           <w:szCs w:val="24"/>
           <w:lang w:val="en-GB"/>
         </w:rPr>
-        <w:t>Thailand and Turkiye</w:t>
+        <w:t xml:space="preserve">Thailand and </w:t>
+      </w:r>
+      <w:r>
+        <w:rPr>
+          <w:rFonts w:ascii="Calibri" w:hAnsi="Calibri" w:eastAsia="Calibri" w:cs="Calibri"/>
+          <w:b w:val="1"/>
+          <w:bCs w:val="1"/>
+          <w:noProof w:val="0"/>
+          <w:sz w:val="24"/>
+          <w:szCs w:val="24"/>
+          <w:lang w:val="en-GB"/>
+        </w:rPr>
+        <w:t>Turkiye</w:t>
       </w:r>
       <w:r>
         <w:rPr>
@@ -11877,7 +11889,27 @@
           <w:szCs w:val="24"/>
           <w:lang w:val="en-GB"/>
         </w:rPr>
-        <w:t xml:space="preserve"> (Distance = 47.25), indicating shared characteristics in reduced PCA space. On the other hand, </w:t>
+        <w:t xml:space="preserve"> (Distance = 47.25), </w:t>
+      </w:r>
+      <w:r>
+        <w:rPr>
+          <w:rFonts w:ascii="Calibri" w:hAnsi="Calibri" w:eastAsia="Calibri" w:cs="Calibri"/>
+          <w:noProof w:val="0"/>
+          <w:sz w:val="24"/>
+          <w:szCs w:val="24"/>
+          <w:lang w:val="en-GB"/>
+        </w:rPr>
+        <w:t>indicating</w:t>
+      </w:r>
+      <w:r>
+        <w:rPr>
+          <w:rFonts w:ascii="Calibri" w:hAnsi="Calibri" w:eastAsia="Calibri" w:cs="Calibri"/>
+          <w:noProof w:val="0"/>
+          <w:sz w:val="24"/>
+          <w:szCs w:val="24"/>
+          <w:lang w:val="en-GB"/>
+        </w:rPr>
+        <w:t xml:space="preserve"> shared characteristics in reduced PCA space. On the other hand, </w:t>
       </w:r>
       <w:r>
         <w:rPr>
@@ -11967,6 +11999,1239 @@
         </w:rPr>
         <w:t xml:space="preserve"> (Distance = 1084.13), reflecting significant divergence in energy-related indicators. This variation highlights how regional energy policies, resource structures, and development priorities shape the clustering of nations.</w:t>
       </w:r>
+    </w:p>
+    <w:p>
+      <w:pPr>
+        <w:spacing w:before="240" w:beforeAutospacing="off" w:after="240" w:afterAutospacing="off"/>
+        <w:rPr>
+          <w:rFonts w:ascii="Calibri" w:hAnsi="Calibri" w:eastAsia="Calibri" w:cs="Calibri"/>
+          <w:b w:val="1"/>
+          <w:bCs w:val="1"/>
+          <w:noProof w:val="0"/>
+          <w:sz w:val="28"/>
+          <w:szCs w:val="28"/>
+          <w:lang w:val="en-GB"/>
+        </w:rPr>
+      </w:pPr>
+      <w:r>
+        <w:rPr>
+          <w:rFonts w:ascii="Calibri" w:hAnsi="Calibri" w:eastAsia="Calibri" w:cs="Calibri"/>
+          <w:b w:val="1"/>
+          <w:bCs w:val="1"/>
+          <w:noProof w:val="0"/>
+          <w:sz w:val="28"/>
+          <w:szCs w:val="28"/>
+          <w:lang w:val="en-GB"/>
+        </w:rPr>
+        <w:t>6.3 Clustering and Geographic Patterns</w:t>
+      </w:r>
+    </w:p>
+    <w:p>
+      <w:pPr>
+        <w:pStyle w:val="Heading4"/>
+        <w:spacing w:before="319" w:beforeAutospacing="off" w:after="319" w:afterAutospacing="off"/>
+        <w:rPr>
+          <w:rFonts w:ascii="Calibri" w:hAnsi="Calibri" w:eastAsia="Calibri" w:cs="Calibri"/>
+          <w:b w:val="1"/>
+          <w:bCs w:val="1"/>
+          <w:noProof w:val="0"/>
+          <w:color w:val="auto"/>
+          <w:sz w:val="24"/>
+          <w:szCs w:val="24"/>
+          <w:lang w:val="en-GB"/>
+        </w:rPr>
+      </w:pPr>
+      <w:r>
+        <w:rPr>
+          <w:rFonts w:ascii="Calibri" w:hAnsi="Calibri" w:eastAsia="Calibri" w:cs="Calibri"/>
+          <w:b w:val="1"/>
+          <w:bCs w:val="1"/>
+          <w:noProof w:val="0"/>
+          <w:color w:val="auto"/>
+          <w:sz w:val="24"/>
+          <w:szCs w:val="24"/>
+          <w:lang w:val="en-GB"/>
+        </w:rPr>
+        <w:t>Low Income Countries</w:t>
+      </w:r>
+    </w:p>
+    <w:p>
+      <w:pPr>
+        <w:spacing w:before="240" w:beforeAutospacing="off" w:after="240" w:afterAutospacing="off"/>
+      </w:pPr>
+      <w:r>
+        <w:rPr>
+          <w:rFonts w:ascii="Calibri" w:hAnsi="Calibri" w:eastAsia="Calibri" w:cs="Calibri"/>
+          <w:b w:val="1"/>
+          <w:bCs w:val="1"/>
+          <w:noProof w:val="0"/>
+          <w:sz w:val="24"/>
+          <w:szCs w:val="24"/>
+          <w:lang w:val="en-GB"/>
+        </w:rPr>
+        <w:t>Optimal Number of Clusters</w:t>
+      </w:r>
+      <w:r>
+        <w:rPr>
+          <w:rFonts w:ascii="Calibri" w:hAnsi="Calibri" w:eastAsia="Calibri" w:cs="Calibri"/>
+          <w:noProof w:val="0"/>
+          <w:sz w:val="24"/>
+          <w:szCs w:val="24"/>
+          <w:lang w:val="en-GB"/>
+        </w:rPr>
+        <w:t xml:space="preserve">: The elbow plot clearly indicated an inflection at </w:t>
+      </w:r>
+      <w:r>
+        <w:rPr>
+          <w:rFonts w:ascii="Calibri" w:hAnsi="Calibri" w:eastAsia="Calibri" w:cs="Calibri"/>
+          <w:b w:val="1"/>
+          <w:bCs w:val="1"/>
+          <w:noProof w:val="0"/>
+          <w:sz w:val="24"/>
+          <w:szCs w:val="24"/>
+          <w:lang w:val="en-GB"/>
+        </w:rPr>
+        <w:t>k=5</w:t>
+      </w:r>
+      <w:r>
+        <w:rPr>
+          <w:rFonts w:ascii="Calibri" w:hAnsi="Calibri" w:eastAsia="Calibri" w:cs="Calibri"/>
+          <w:noProof w:val="0"/>
+          <w:sz w:val="24"/>
+          <w:szCs w:val="24"/>
+          <w:lang w:val="en-GB"/>
+        </w:rPr>
+        <w:t>, confirming that five clusters capture the inherent structure of low-income country data.</w:t>
+      </w:r>
+    </w:p>
+    <w:p>
+      <w:pPr>
+        <w:spacing w:before="240" w:beforeAutospacing="off" w:after="240" w:afterAutospacing="off"/>
+      </w:pPr>
+      <w:r>
+        <w:rPr>
+          <w:rFonts w:ascii="Calibri" w:hAnsi="Calibri" w:eastAsia="Calibri" w:cs="Calibri"/>
+          <w:b w:val="1"/>
+          <w:bCs w:val="1"/>
+          <w:noProof w:val="0"/>
+          <w:sz w:val="24"/>
+          <w:szCs w:val="24"/>
+          <w:lang w:val="en-GB"/>
+        </w:rPr>
+        <w:t>PCA-Based Clustering</w:t>
+      </w:r>
+      <w:r>
+        <w:rPr>
+          <w:rFonts w:ascii="Calibri" w:hAnsi="Calibri" w:eastAsia="Calibri" w:cs="Calibri"/>
+          <w:noProof w:val="0"/>
+          <w:sz w:val="24"/>
+          <w:szCs w:val="24"/>
+          <w:lang w:val="en-GB"/>
+        </w:rPr>
+        <w:t xml:space="preserve">: The scatter plot using the first two principal components revealed well-separated clusters, demonstrating a meaningful distribution of countries in the reduced feature space. Each cluster represents distinct socio-environmental trajectories, with countries like </w:t>
+      </w:r>
+      <w:r>
+        <w:rPr>
+          <w:rFonts w:ascii="Calibri" w:hAnsi="Calibri" w:eastAsia="Calibri" w:cs="Calibri"/>
+          <w:i w:val="1"/>
+          <w:iCs w:val="1"/>
+          <w:noProof w:val="0"/>
+          <w:sz w:val="24"/>
+          <w:szCs w:val="24"/>
+          <w:lang w:val="en-GB"/>
+        </w:rPr>
+        <w:t>Sudan</w:t>
+      </w:r>
+      <w:r>
+        <w:rPr>
+          <w:rFonts w:ascii="Calibri" w:hAnsi="Calibri" w:eastAsia="Calibri" w:cs="Calibri"/>
+          <w:noProof w:val="0"/>
+          <w:sz w:val="24"/>
+          <w:szCs w:val="24"/>
+          <w:lang w:val="en-GB"/>
+        </w:rPr>
+        <w:t xml:space="preserve"> and </w:t>
+      </w:r>
+      <w:r>
+        <w:rPr>
+          <w:rFonts w:ascii="Calibri" w:hAnsi="Calibri" w:eastAsia="Calibri" w:cs="Calibri"/>
+          <w:i w:val="1"/>
+          <w:iCs w:val="1"/>
+          <w:noProof w:val="0"/>
+          <w:sz w:val="24"/>
+          <w:szCs w:val="24"/>
+          <w:lang w:val="en-GB"/>
+        </w:rPr>
+        <w:t>Congo, Dem. Rep.</w:t>
+      </w:r>
+      <w:r>
+        <w:rPr>
+          <w:rFonts w:ascii="Calibri" w:hAnsi="Calibri" w:eastAsia="Calibri" w:cs="Calibri"/>
+          <w:noProof w:val="0"/>
+          <w:sz w:val="24"/>
+          <w:szCs w:val="24"/>
+          <w:lang w:val="en-GB"/>
+        </w:rPr>
+        <w:t xml:space="preserve"> occupying distant positions, indicating unique profiles.</w:t>
+      </w:r>
+    </w:p>
+    <w:p>
+      <w:pPr>
+        <w:spacing w:before="240" w:beforeAutospacing="off" w:after="240" w:afterAutospacing="off"/>
+      </w:pPr>
+      <w:r>
+        <w:rPr>
+          <w:rFonts w:ascii="Calibri" w:hAnsi="Calibri" w:eastAsia="Calibri" w:cs="Calibri"/>
+          <w:b w:val="1"/>
+          <w:bCs w:val="1"/>
+          <w:noProof w:val="0"/>
+          <w:sz w:val="24"/>
+          <w:szCs w:val="24"/>
+          <w:lang w:val="en-GB"/>
+        </w:rPr>
+        <w:t>Geographic Cluster Distribution</w:t>
+      </w:r>
+      <w:r>
+        <w:rPr>
+          <w:rFonts w:ascii="Calibri" w:hAnsi="Calibri" w:eastAsia="Calibri" w:cs="Calibri"/>
+          <w:noProof w:val="0"/>
+          <w:sz w:val="24"/>
+          <w:szCs w:val="24"/>
+          <w:lang w:val="en-GB"/>
+        </w:rPr>
+        <w:t xml:space="preserve">: The spatial plot highlighted that clustered countries were not strictly region-bound. For instance, </w:t>
+      </w:r>
+      <w:r>
+        <w:rPr>
+          <w:rFonts w:ascii="Calibri" w:hAnsi="Calibri" w:eastAsia="Calibri" w:cs="Calibri"/>
+          <w:i w:val="1"/>
+          <w:iCs w:val="1"/>
+          <w:noProof w:val="0"/>
+          <w:sz w:val="24"/>
+          <w:szCs w:val="24"/>
+          <w:lang w:val="en-GB"/>
+        </w:rPr>
+        <w:t>Zambia</w:t>
+      </w:r>
+      <w:r>
+        <w:rPr>
+          <w:rFonts w:ascii="Calibri" w:hAnsi="Calibri" w:eastAsia="Calibri" w:cs="Calibri"/>
+          <w:noProof w:val="0"/>
+          <w:sz w:val="24"/>
+          <w:szCs w:val="24"/>
+          <w:lang w:val="en-GB"/>
+        </w:rPr>
+        <w:t xml:space="preserve"> and </w:t>
+      </w:r>
+      <w:r>
+        <w:rPr>
+          <w:rFonts w:ascii="Calibri" w:hAnsi="Calibri" w:eastAsia="Calibri" w:cs="Calibri"/>
+          <w:i w:val="1"/>
+          <w:iCs w:val="1"/>
+          <w:noProof w:val="0"/>
+          <w:sz w:val="24"/>
+          <w:szCs w:val="24"/>
+          <w:lang w:val="en-GB"/>
+        </w:rPr>
+        <w:t>Togo</w:t>
+      </w:r>
+      <w:r>
+        <w:rPr>
+          <w:rFonts w:ascii="Calibri" w:hAnsi="Calibri" w:eastAsia="Calibri" w:cs="Calibri"/>
+          <w:noProof w:val="0"/>
+          <w:sz w:val="24"/>
+          <w:szCs w:val="24"/>
+          <w:lang w:val="en-GB"/>
+        </w:rPr>
+        <w:t xml:space="preserve"> belonged to the same cluster despite regional separation, reinforcing the notion that clustering was based on developmental indicators rather than geography.</w:t>
+      </w:r>
+    </w:p>
+    <w:p>
+      <w:pPr>
+        <w:spacing w:before="240" w:beforeAutospacing="off" w:after="240" w:afterAutospacing="off"/>
+      </w:pPr>
+      <w:r>
+        <w:rPr>
+          <w:rFonts w:ascii="Calibri" w:hAnsi="Calibri" w:eastAsia="Calibri" w:cs="Calibri"/>
+          <w:b w:val="1"/>
+          <w:bCs w:val="1"/>
+          <w:noProof w:val="0"/>
+          <w:sz w:val="24"/>
+          <w:szCs w:val="24"/>
+          <w:lang w:val="en-GB"/>
+        </w:rPr>
+        <w:t>Cluster Profile Trends</w:t>
+      </w:r>
+      <w:r>
+        <w:rPr>
+          <w:rFonts w:ascii="Calibri" w:hAnsi="Calibri" w:eastAsia="Calibri" w:cs="Calibri"/>
+          <w:noProof w:val="0"/>
+          <w:sz w:val="24"/>
+          <w:szCs w:val="24"/>
+          <w:lang w:val="en-GB"/>
+        </w:rPr>
+        <w:t xml:space="preserve">: The temporal indicator trend showed that </w:t>
+      </w:r>
+      <w:r>
+        <w:rPr>
+          <w:rFonts w:ascii="Calibri" w:hAnsi="Calibri" w:eastAsia="Calibri" w:cs="Calibri"/>
+          <w:b w:val="1"/>
+          <w:bCs w:val="1"/>
+          <w:noProof w:val="0"/>
+          <w:sz w:val="24"/>
+          <w:szCs w:val="24"/>
+          <w:lang w:val="en-GB"/>
+        </w:rPr>
+        <w:t>Cluster 0</w:t>
+      </w:r>
+      <w:r>
+        <w:rPr>
+          <w:rFonts w:ascii="Calibri" w:hAnsi="Calibri" w:eastAsia="Calibri" w:cs="Calibri"/>
+          <w:noProof w:val="0"/>
+          <w:sz w:val="24"/>
+          <w:szCs w:val="24"/>
+          <w:lang w:val="en-GB"/>
+        </w:rPr>
+        <w:t xml:space="preserve"> maintained the highest normalized values consistently post-2005, indicating sustained performance. Meanwhile, </w:t>
+      </w:r>
+      <w:r>
+        <w:rPr>
+          <w:rFonts w:ascii="Calibri" w:hAnsi="Calibri" w:eastAsia="Calibri" w:cs="Calibri"/>
+          <w:b w:val="1"/>
+          <w:bCs w:val="1"/>
+          <w:noProof w:val="0"/>
+          <w:sz w:val="24"/>
+          <w:szCs w:val="24"/>
+          <w:lang w:val="en-GB"/>
+        </w:rPr>
+        <w:t>Cluster 3 and 4</w:t>
+      </w:r>
+      <w:r>
+        <w:rPr>
+          <w:rFonts w:ascii="Calibri" w:hAnsi="Calibri" w:eastAsia="Calibri" w:cs="Calibri"/>
+          <w:noProof w:val="0"/>
+          <w:sz w:val="24"/>
+          <w:szCs w:val="24"/>
+          <w:lang w:val="en-GB"/>
+        </w:rPr>
+        <w:t xml:space="preserve"> exhibited earlier peaks followed by declines or stagnation, suggesting episodic improvements possibly affected by instability or policy reversals.</w:t>
+      </w:r>
+    </w:p>
+    <w:p>
+      <w:pPr>
+        <w:pStyle w:val="Heading4"/>
+        <w:spacing w:before="319" w:beforeAutospacing="off" w:after="319" w:afterAutospacing="off"/>
+        <w:rPr>
+          <w:rFonts w:ascii="Calibri" w:hAnsi="Calibri" w:eastAsia="Calibri" w:cs="Calibri"/>
+          <w:b w:val="1"/>
+          <w:bCs w:val="1"/>
+          <w:noProof w:val="0"/>
+          <w:color w:val="auto"/>
+          <w:sz w:val="24"/>
+          <w:szCs w:val="24"/>
+          <w:lang w:val="en-GB"/>
+        </w:rPr>
+      </w:pPr>
+      <w:r>
+        <w:rPr>
+          <w:rFonts w:ascii="Calibri" w:hAnsi="Calibri" w:eastAsia="Calibri" w:cs="Calibri"/>
+          <w:b w:val="1"/>
+          <w:bCs w:val="1"/>
+          <w:noProof w:val="0"/>
+          <w:color w:val="auto"/>
+          <w:sz w:val="24"/>
+          <w:szCs w:val="24"/>
+          <w:lang w:val="en-GB"/>
+        </w:rPr>
+        <w:t>Lower Middle Income Countries</w:t>
+      </w:r>
+    </w:p>
+    <w:p>
+      <w:pPr>
+        <w:spacing w:before="240" w:beforeAutospacing="off" w:after="240" w:afterAutospacing="off"/>
+      </w:pPr>
+      <w:r>
+        <w:rPr>
+          <w:rFonts w:ascii="Calibri" w:hAnsi="Calibri" w:eastAsia="Calibri" w:cs="Calibri"/>
+          <w:b w:val="1"/>
+          <w:bCs w:val="1"/>
+          <w:noProof w:val="0"/>
+          <w:sz w:val="24"/>
+          <w:szCs w:val="24"/>
+          <w:lang w:val="en-GB"/>
+        </w:rPr>
+        <w:t>Optimal Number of Clusters</w:t>
+      </w:r>
+      <w:r>
+        <w:rPr>
+          <w:rFonts w:ascii="Calibri" w:hAnsi="Calibri" w:eastAsia="Calibri" w:cs="Calibri"/>
+          <w:noProof w:val="0"/>
+          <w:sz w:val="24"/>
+          <w:szCs w:val="24"/>
+          <w:lang w:val="en-GB"/>
+        </w:rPr>
+        <w:t xml:space="preserve">: The elbow method showed a sharp drop in inertia at </w:t>
+      </w:r>
+      <w:r>
+        <w:rPr>
+          <w:rFonts w:ascii="Calibri" w:hAnsi="Calibri" w:eastAsia="Calibri" w:cs="Calibri"/>
+          <w:b w:val="1"/>
+          <w:bCs w:val="1"/>
+          <w:noProof w:val="0"/>
+          <w:sz w:val="24"/>
+          <w:szCs w:val="24"/>
+          <w:lang w:val="en-GB"/>
+        </w:rPr>
+        <w:t>k=2</w:t>
+      </w:r>
+      <w:r>
+        <w:rPr>
+          <w:rFonts w:ascii="Calibri" w:hAnsi="Calibri" w:eastAsia="Calibri" w:cs="Calibri"/>
+          <w:noProof w:val="0"/>
+          <w:sz w:val="24"/>
+          <w:szCs w:val="24"/>
+          <w:lang w:val="en-GB"/>
+        </w:rPr>
+        <w:t>, suggesting a binary structure. This split was consistent with two development pathways.</w:t>
+      </w:r>
+    </w:p>
+    <w:p>
+      <w:pPr>
+        <w:spacing w:before="240" w:beforeAutospacing="off" w:after="240" w:afterAutospacing="off"/>
+      </w:pPr>
+      <w:r>
+        <w:rPr>
+          <w:rFonts w:ascii="Calibri" w:hAnsi="Calibri" w:eastAsia="Calibri" w:cs="Calibri"/>
+          <w:b w:val="1"/>
+          <w:bCs w:val="1"/>
+          <w:noProof w:val="0"/>
+          <w:sz w:val="24"/>
+          <w:szCs w:val="24"/>
+          <w:lang w:val="en-GB"/>
+        </w:rPr>
+        <w:t>PCA-Based Clustering</w:t>
+      </w:r>
+      <w:r>
+        <w:rPr>
+          <w:rFonts w:ascii="Calibri" w:hAnsi="Calibri" w:eastAsia="Calibri" w:cs="Calibri"/>
+          <w:noProof w:val="0"/>
+          <w:sz w:val="24"/>
+          <w:szCs w:val="24"/>
+          <w:lang w:val="en-GB"/>
+        </w:rPr>
+        <w:t xml:space="preserve">: The PCA scatter plot showed a clear bifurcation. </w:t>
+      </w:r>
+      <w:r>
+        <w:rPr>
+          <w:rFonts w:ascii="Calibri" w:hAnsi="Calibri" w:eastAsia="Calibri" w:cs="Calibri"/>
+          <w:b w:val="1"/>
+          <w:bCs w:val="1"/>
+          <w:noProof w:val="0"/>
+          <w:sz w:val="24"/>
+          <w:szCs w:val="24"/>
+          <w:lang w:val="en-GB"/>
+        </w:rPr>
+        <w:t>Cluster 0</w:t>
+      </w:r>
+      <w:r>
+        <w:rPr>
+          <w:rFonts w:ascii="Calibri" w:hAnsi="Calibri" w:eastAsia="Calibri" w:cs="Calibri"/>
+          <w:noProof w:val="0"/>
+          <w:sz w:val="24"/>
+          <w:szCs w:val="24"/>
+          <w:lang w:val="en-GB"/>
+        </w:rPr>
+        <w:t xml:space="preserve"> encompassed the majority of countries, while </w:t>
+      </w:r>
+      <w:r>
+        <w:rPr>
+          <w:rFonts w:ascii="Calibri" w:hAnsi="Calibri" w:eastAsia="Calibri" w:cs="Calibri"/>
+          <w:b w:val="1"/>
+          <w:bCs w:val="1"/>
+          <w:noProof w:val="0"/>
+          <w:sz w:val="24"/>
+          <w:szCs w:val="24"/>
+          <w:lang w:val="en-GB"/>
+        </w:rPr>
+        <w:t>Cluster 1</w:t>
+      </w:r>
+      <w:r>
+        <w:rPr>
+          <w:rFonts w:ascii="Calibri" w:hAnsi="Calibri" w:eastAsia="Calibri" w:cs="Calibri"/>
+          <w:noProof w:val="0"/>
+          <w:sz w:val="24"/>
+          <w:szCs w:val="24"/>
+          <w:lang w:val="en-GB"/>
+        </w:rPr>
+        <w:t xml:space="preserve"> grouped outliers like </w:t>
+      </w:r>
+      <w:r>
+        <w:rPr>
+          <w:rFonts w:ascii="Calibri" w:hAnsi="Calibri" w:eastAsia="Calibri" w:cs="Calibri"/>
+          <w:i w:val="1"/>
+          <w:iCs w:val="1"/>
+          <w:noProof w:val="0"/>
+          <w:sz w:val="24"/>
+          <w:szCs w:val="24"/>
+          <w:lang w:val="en-GB"/>
+        </w:rPr>
+        <w:t>India</w:t>
+      </w:r>
+      <w:r>
+        <w:rPr>
+          <w:rFonts w:ascii="Calibri" w:hAnsi="Calibri" w:eastAsia="Calibri" w:cs="Calibri"/>
+          <w:noProof w:val="0"/>
+          <w:sz w:val="24"/>
+          <w:szCs w:val="24"/>
+          <w:lang w:val="en-GB"/>
+        </w:rPr>
+        <w:t xml:space="preserve">, </w:t>
+      </w:r>
+      <w:r>
+        <w:rPr>
+          <w:rFonts w:ascii="Calibri" w:hAnsi="Calibri" w:eastAsia="Calibri" w:cs="Calibri"/>
+          <w:i w:val="1"/>
+          <w:iCs w:val="1"/>
+          <w:noProof w:val="0"/>
+          <w:sz w:val="24"/>
+          <w:szCs w:val="24"/>
+          <w:lang w:val="en-GB"/>
+        </w:rPr>
+        <w:t>Iran</w:t>
+      </w:r>
+      <w:r>
+        <w:rPr>
+          <w:rFonts w:ascii="Calibri" w:hAnsi="Calibri" w:eastAsia="Calibri" w:cs="Calibri"/>
+          <w:noProof w:val="0"/>
+          <w:sz w:val="24"/>
+          <w:szCs w:val="24"/>
+          <w:lang w:val="en-GB"/>
+        </w:rPr>
+        <w:t xml:space="preserve">, </w:t>
+      </w:r>
+      <w:r>
+        <w:rPr>
+          <w:rFonts w:ascii="Calibri" w:hAnsi="Calibri" w:eastAsia="Calibri" w:cs="Calibri"/>
+          <w:i w:val="1"/>
+          <w:iCs w:val="1"/>
+          <w:noProof w:val="0"/>
+          <w:sz w:val="24"/>
+          <w:szCs w:val="24"/>
+          <w:lang w:val="en-GB"/>
+        </w:rPr>
+        <w:t>Mongolia</w:t>
+      </w:r>
+      <w:r>
+        <w:rPr>
+          <w:rFonts w:ascii="Calibri" w:hAnsi="Calibri" w:eastAsia="Calibri" w:cs="Calibri"/>
+          <w:noProof w:val="0"/>
+          <w:sz w:val="24"/>
+          <w:szCs w:val="24"/>
+          <w:lang w:val="en-GB"/>
+        </w:rPr>
+        <w:t xml:space="preserve">, </w:t>
+      </w:r>
+      <w:r>
+        <w:rPr>
+          <w:rFonts w:ascii="Calibri" w:hAnsi="Calibri" w:eastAsia="Calibri" w:cs="Calibri"/>
+          <w:i w:val="1"/>
+          <w:iCs w:val="1"/>
+          <w:noProof w:val="0"/>
+          <w:sz w:val="24"/>
+          <w:szCs w:val="24"/>
+          <w:lang w:val="en-GB"/>
+        </w:rPr>
+        <w:t>Ukraine</w:t>
+      </w:r>
+      <w:r>
+        <w:rPr>
+          <w:rFonts w:ascii="Calibri" w:hAnsi="Calibri" w:eastAsia="Calibri" w:cs="Calibri"/>
+          <w:noProof w:val="0"/>
+          <w:sz w:val="24"/>
+          <w:szCs w:val="24"/>
+          <w:lang w:val="en-GB"/>
+        </w:rPr>
+        <w:t xml:space="preserve">, and </w:t>
+      </w:r>
+      <w:r>
+        <w:rPr>
+          <w:rFonts w:ascii="Calibri" w:hAnsi="Calibri" w:eastAsia="Calibri" w:cs="Calibri"/>
+          <w:i w:val="1"/>
+          <w:iCs w:val="1"/>
+          <w:noProof w:val="0"/>
+          <w:sz w:val="24"/>
+          <w:szCs w:val="24"/>
+          <w:lang w:val="en-GB"/>
+        </w:rPr>
+        <w:t>Uzbekistan</w:t>
+      </w:r>
+      <w:r>
+        <w:rPr>
+          <w:rFonts w:ascii="Calibri" w:hAnsi="Calibri" w:eastAsia="Calibri" w:cs="Calibri"/>
+          <w:noProof w:val="0"/>
+          <w:sz w:val="24"/>
+          <w:szCs w:val="24"/>
+          <w:lang w:val="en-GB"/>
+        </w:rPr>
+        <w:t>, reflecting diverging indicator patterns — likely due to energy production or CO₂ profiles.</w:t>
+      </w:r>
+    </w:p>
+    <w:p>
+      <w:pPr>
+        <w:spacing w:before="240" w:beforeAutospacing="off" w:after="240" w:afterAutospacing="off"/>
+      </w:pPr>
+      <w:r>
+        <w:rPr>
+          <w:rFonts w:ascii="Calibri" w:hAnsi="Calibri" w:eastAsia="Calibri" w:cs="Calibri"/>
+          <w:b w:val="1"/>
+          <w:bCs w:val="1"/>
+          <w:noProof w:val="0"/>
+          <w:sz w:val="24"/>
+          <w:szCs w:val="24"/>
+          <w:lang w:val="en-GB"/>
+        </w:rPr>
+        <w:t>Geographic Patterns</w:t>
+      </w:r>
+      <w:r>
+        <w:rPr>
+          <w:rFonts w:ascii="Calibri" w:hAnsi="Calibri" w:eastAsia="Calibri" w:cs="Calibri"/>
+          <w:noProof w:val="0"/>
+          <w:sz w:val="24"/>
+          <w:szCs w:val="24"/>
+          <w:lang w:val="en-GB"/>
+        </w:rPr>
+        <w:t xml:space="preserve">: The map revealed that </w:t>
+      </w:r>
+      <w:r>
+        <w:rPr>
+          <w:rFonts w:ascii="Calibri" w:hAnsi="Calibri" w:eastAsia="Calibri" w:cs="Calibri"/>
+          <w:b w:val="1"/>
+          <w:bCs w:val="1"/>
+          <w:noProof w:val="0"/>
+          <w:sz w:val="24"/>
+          <w:szCs w:val="24"/>
+          <w:lang w:val="en-GB"/>
+        </w:rPr>
+        <w:t>Cluster 1</w:t>
+      </w:r>
+      <w:r>
+        <w:rPr>
+          <w:rFonts w:ascii="Calibri" w:hAnsi="Calibri" w:eastAsia="Calibri" w:cs="Calibri"/>
+          <w:noProof w:val="0"/>
+          <w:sz w:val="24"/>
+          <w:szCs w:val="24"/>
+          <w:lang w:val="en-GB"/>
+        </w:rPr>
+        <w:t xml:space="preserve"> countries were geographically dispersed across South Asia, Central Asia, and Eastern Europe. Despite regional variety, they shared common developmental patterns, possibly influenced by higher energy consumption, industrial output, or policy alignment.</w:t>
+      </w:r>
+    </w:p>
+    <w:p>
+      <w:pPr>
+        <w:spacing w:before="240" w:beforeAutospacing="off" w:after="240" w:afterAutospacing="off"/>
+      </w:pPr>
+      <w:r>
+        <w:rPr>
+          <w:rFonts w:ascii="Calibri" w:hAnsi="Calibri" w:eastAsia="Calibri" w:cs="Calibri"/>
+          <w:b w:val="1"/>
+          <w:bCs w:val="1"/>
+          <w:noProof w:val="0"/>
+          <w:sz w:val="24"/>
+          <w:szCs w:val="24"/>
+          <w:lang w:val="en-GB"/>
+        </w:rPr>
+        <w:t>Cluster Profile Analysis</w:t>
+      </w:r>
+      <w:r>
+        <w:rPr>
+          <w:rFonts w:ascii="Calibri" w:hAnsi="Calibri" w:eastAsia="Calibri" w:cs="Calibri"/>
+          <w:noProof w:val="0"/>
+          <w:sz w:val="24"/>
+          <w:szCs w:val="24"/>
+          <w:lang w:val="en-GB"/>
+        </w:rPr>
+        <w:t xml:space="preserve">: The cluster profile plot revealed a sharp transition around </w:t>
+      </w:r>
+      <w:r>
+        <w:rPr>
+          <w:rFonts w:ascii="Calibri" w:hAnsi="Calibri" w:eastAsia="Calibri" w:cs="Calibri"/>
+          <w:b w:val="1"/>
+          <w:bCs w:val="1"/>
+          <w:noProof w:val="0"/>
+          <w:sz w:val="24"/>
+          <w:szCs w:val="24"/>
+          <w:lang w:val="en-GB"/>
+        </w:rPr>
+        <w:t>2002–2003</w:t>
+      </w:r>
+      <w:r>
+        <w:rPr>
+          <w:rFonts w:ascii="Calibri" w:hAnsi="Calibri" w:eastAsia="Calibri" w:cs="Calibri"/>
+          <w:noProof w:val="0"/>
+          <w:sz w:val="24"/>
+          <w:szCs w:val="24"/>
+          <w:lang w:val="en-GB"/>
+        </w:rPr>
+        <w:t xml:space="preserve">, where most countries moved from </w:t>
+      </w:r>
+      <w:r>
+        <w:rPr>
+          <w:rFonts w:ascii="Calibri" w:hAnsi="Calibri" w:eastAsia="Calibri" w:cs="Calibri"/>
+          <w:b w:val="1"/>
+          <w:bCs w:val="1"/>
+          <w:noProof w:val="0"/>
+          <w:sz w:val="24"/>
+          <w:szCs w:val="24"/>
+          <w:lang w:val="en-GB"/>
+        </w:rPr>
+        <w:t>Cluster 0</w:t>
+      </w:r>
+      <w:r>
+        <w:rPr>
+          <w:rFonts w:ascii="Calibri" w:hAnsi="Calibri" w:eastAsia="Calibri" w:cs="Calibri"/>
+          <w:noProof w:val="0"/>
+          <w:sz w:val="24"/>
+          <w:szCs w:val="24"/>
+          <w:lang w:val="en-GB"/>
+        </w:rPr>
+        <w:t xml:space="preserve"> to </w:t>
+      </w:r>
+      <w:r>
+        <w:rPr>
+          <w:rFonts w:ascii="Calibri" w:hAnsi="Calibri" w:eastAsia="Calibri" w:cs="Calibri"/>
+          <w:b w:val="1"/>
+          <w:bCs w:val="1"/>
+          <w:noProof w:val="0"/>
+          <w:sz w:val="24"/>
+          <w:szCs w:val="24"/>
+          <w:lang w:val="en-GB"/>
+        </w:rPr>
+        <w:t>Cluster 1</w:t>
+      </w:r>
+      <w:r>
+        <w:rPr>
+          <w:rFonts w:ascii="Calibri" w:hAnsi="Calibri" w:eastAsia="Calibri" w:cs="Calibri"/>
+          <w:noProof w:val="0"/>
+          <w:sz w:val="24"/>
+          <w:szCs w:val="24"/>
+          <w:lang w:val="en-GB"/>
+        </w:rPr>
+        <w:t xml:space="preserve">. This aligns with global economic shifts and the impact of the </w:t>
+      </w:r>
+      <w:r>
+        <w:rPr>
+          <w:rFonts w:ascii="Calibri" w:hAnsi="Calibri" w:eastAsia="Calibri" w:cs="Calibri"/>
+          <w:b w:val="1"/>
+          <w:bCs w:val="1"/>
+          <w:noProof w:val="0"/>
+          <w:sz w:val="24"/>
+          <w:szCs w:val="24"/>
+          <w:lang w:val="en-GB"/>
+        </w:rPr>
+        <w:t>Millennium Development Goals (MDGs)</w:t>
+      </w:r>
+      <w:r>
+        <w:rPr>
+          <w:rFonts w:ascii="Calibri" w:hAnsi="Calibri" w:eastAsia="Calibri" w:cs="Calibri"/>
+          <w:noProof w:val="0"/>
+          <w:sz w:val="24"/>
+          <w:szCs w:val="24"/>
+          <w:lang w:val="en-GB"/>
+        </w:rPr>
+        <w:t>. The consistent high performance of Cluster 1 post-2003 suggests long-term gains in energy access, emissions management, or GDP-energy efficiency.</w:t>
+      </w:r>
+    </w:p>
+    <w:p>
+      <w:pPr>
+        <w:pStyle w:val="Heading4"/>
+        <w:spacing w:before="319" w:beforeAutospacing="off" w:after="319" w:afterAutospacing="off"/>
+        <w:rPr>
+          <w:rFonts w:ascii="Calibri" w:hAnsi="Calibri" w:eastAsia="Calibri" w:cs="Calibri"/>
+          <w:b w:val="1"/>
+          <w:bCs w:val="1"/>
+          <w:noProof w:val="0"/>
+          <w:color w:val="auto"/>
+          <w:sz w:val="24"/>
+          <w:szCs w:val="24"/>
+          <w:lang w:val="en-GB"/>
+        </w:rPr>
+      </w:pPr>
+      <w:r>
+        <w:rPr>
+          <w:rFonts w:ascii="Calibri" w:hAnsi="Calibri" w:eastAsia="Calibri" w:cs="Calibri"/>
+          <w:b w:val="1"/>
+          <w:bCs w:val="1"/>
+          <w:noProof w:val="0"/>
+          <w:color w:val="auto"/>
+          <w:sz w:val="24"/>
+          <w:szCs w:val="24"/>
+          <w:lang w:val="en-GB"/>
+        </w:rPr>
+        <w:t>Upper Middle Income Countries</w:t>
+      </w:r>
+    </w:p>
+    <w:p>
+      <w:pPr>
+        <w:spacing w:before="240" w:beforeAutospacing="off" w:after="240" w:afterAutospacing="off"/>
+      </w:pPr>
+      <w:r>
+        <w:rPr>
+          <w:rFonts w:ascii="Calibri" w:hAnsi="Calibri" w:eastAsia="Calibri" w:cs="Calibri"/>
+          <w:b w:val="1"/>
+          <w:bCs w:val="1"/>
+          <w:noProof w:val="0"/>
+          <w:sz w:val="24"/>
+          <w:szCs w:val="24"/>
+          <w:lang w:val="en-GB"/>
+        </w:rPr>
+        <w:t>Optimal Number of Clusters</w:t>
+      </w:r>
+      <w:r>
+        <w:rPr>
+          <w:rFonts w:ascii="Calibri" w:hAnsi="Calibri" w:eastAsia="Calibri" w:cs="Calibri"/>
+          <w:noProof w:val="0"/>
+          <w:sz w:val="24"/>
+          <w:szCs w:val="24"/>
+          <w:lang w:val="en-GB"/>
+        </w:rPr>
+        <w:t xml:space="preserve">: The elbow method suggested </w:t>
+      </w:r>
+      <w:r>
+        <w:rPr>
+          <w:rFonts w:ascii="Calibri" w:hAnsi="Calibri" w:eastAsia="Calibri" w:cs="Calibri"/>
+          <w:b w:val="1"/>
+          <w:bCs w:val="1"/>
+          <w:noProof w:val="0"/>
+          <w:sz w:val="24"/>
+          <w:szCs w:val="24"/>
+          <w:lang w:val="en-GB"/>
+        </w:rPr>
+        <w:t>k=4</w:t>
+      </w:r>
+      <w:r>
+        <w:rPr>
+          <w:rFonts w:ascii="Calibri" w:hAnsi="Calibri" w:eastAsia="Calibri" w:cs="Calibri"/>
+          <w:noProof w:val="0"/>
+          <w:sz w:val="24"/>
+          <w:szCs w:val="24"/>
+          <w:lang w:val="en-GB"/>
+        </w:rPr>
+        <w:t xml:space="preserve"> clusters as the optimal partition, capturing nuanced groupings beyond just economic output.</w:t>
+      </w:r>
+    </w:p>
+    <w:p>
+      <w:pPr>
+        <w:spacing w:before="240" w:beforeAutospacing="off" w:after="240" w:afterAutospacing="off"/>
+      </w:pPr>
+      <w:r>
+        <w:rPr>
+          <w:rFonts w:ascii="Calibri" w:hAnsi="Calibri" w:eastAsia="Calibri" w:cs="Calibri"/>
+          <w:b w:val="1"/>
+          <w:bCs w:val="1"/>
+          <w:noProof w:val="0"/>
+          <w:sz w:val="24"/>
+          <w:szCs w:val="24"/>
+          <w:lang w:val="en-GB"/>
+        </w:rPr>
+        <w:t>PCA-Based Clustering</w:t>
+      </w:r>
+      <w:r>
+        <w:rPr>
+          <w:rFonts w:ascii="Calibri" w:hAnsi="Calibri" w:eastAsia="Calibri" w:cs="Calibri"/>
+          <w:noProof w:val="0"/>
+          <w:sz w:val="24"/>
+          <w:szCs w:val="24"/>
+          <w:lang w:val="en-GB"/>
+        </w:rPr>
+        <w:t xml:space="preserve">: Countries like </w:t>
+      </w:r>
+      <w:r>
+        <w:rPr>
+          <w:rFonts w:ascii="Calibri" w:hAnsi="Calibri" w:eastAsia="Calibri" w:cs="Calibri"/>
+          <w:i w:val="1"/>
+          <w:iCs w:val="1"/>
+          <w:noProof w:val="0"/>
+          <w:sz w:val="24"/>
+          <w:szCs w:val="24"/>
+          <w:lang w:val="en-GB"/>
+        </w:rPr>
+        <w:t>Gabon</w:t>
+      </w:r>
+      <w:r>
+        <w:rPr>
+          <w:rFonts w:ascii="Calibri" w:hAnsi="Calibri" w:eastAsia="Calibri" w:cs="Calibri"/>
+          <w:noProof w:val="0"/>
+          <w:sz w:val="24"/>
+          <w:szCs w:val="24"/>
+          <w:lang w:val="en-GB"/>
+        </w:rPr>
+        <w:t xml:space="preserve">, </w:t>
+      </w:r>
+      <w:r>
+        <w:rPr>
+          <w:rFonts w:ascii="Calibri" w:hAnsi="Calibri" w:eastAsia="Calibri" w:cs="Calibri"/>
+          <w:i w:val="1"/>
+          <w:iCs w:val="1"/>
+          <w:noProof w:val="0"/>
+          <w:sz w:val="24"/>
+          <w:szCs w:val="24"/>
+          <w:lang w:val="en-GB"/>
+        </w:rPr>
+        <w:t>Paraguay</w:t>
+      </w:r>
+      <w:r>
+        <w:rPr>
+          <w:rFonts w:ascii="Calibri" w:hAnsi="Calibri" w:eastAsia="Calibri" w:cs="Calibri"/>
+          <w:noProof w:val="0"/>
+          <w:sz w:val="24"/>
+          <w:szCs w:val="24"/>
+          <w:lang w:val="en-GB"/>
+        </w:rPr>
+        <w:t xml:space="preserve">, and </w:t>
+      </w:r>
+      <w:r>
+        <w:rPr>
+          <w:rFonts w:ascii="Calibri" w:hAnsi="Calibri" w:eastAsia="Calibri" w:cs="Calibri"/>
+          <w:i w:val="1"/>
+          <w:iCs w:val="1"/>
+          <w:noProof w:val="0"/>
+          <w:sz w:val="24"/>
+          <w:szCs w:val="24"/>
+          <w:lang w:val="en-GB"/>
+        </w:rPr>
+        <w:t>Guatemala</w:t>
+      </w:r>
+      <w:r>
+        <w:rPr>
+          <w:rFonts w:ascii="Calibri" w:hAnsi="Calibri" w:eastAsia="Calibri" w:cs="Calibri"/>
+          <w:noProof w:val="0"/>
+          <w:sz w:val="24"/>
+          <w:szCs w:val="24"/>
+          <w:lang w:val="en-GB"/>
+        </w:rPr>
+        <w:t xml:space="preserve"> formed unique clusters (e.g., Cluster 3), </w:t>
+      </w:r>
+      <w:r>
+        <w:rPr>
+          <w:rFonts w:ascii="Calibri" w:hAnsi="Calibri" w:eastAsia="Calibri" w:cs="Calibri"/>
+          <w:noProof w:val="0"/>
+          <w:sz w:val="24"/>
+          <w:szCs w:val="24"/>
+          <w:lang w:val="en-GB"/>
+        </w:rPr>
+        <w:t>whereas</w:t>
+      </w:r>
+      <w:r>
+        <w:rPr>
+          <w:rFonts w:ascii="Calibri" w:hAnsi="Calibri" w:eastAsia="Calibri" w:cs="Calibri"/>
+          <w:noProof w:val="0"/>
+          <w:sz w:val="24"/>
+          <w:szCs w:val="24"/>
+          <w:lang w:val="en-GB"/>
+        </w:rPr>
+        <w:t xml:space="preserve"> others like </w:t>
+      </w:r>
+      <w:r>
+        <w:rPr>
+          <w:rFonts w:ascii="Calibri" w:hAnsi="Calibri" w:eastAsia="Calibri" w:cs="Calibri"/>
+          <w:i w:val="1"/>
+          <w:iCs w:val="1"/>
+          <w:noProof w:val="0"/>
+          <w:sz w:val="24"/>
+          <w:szCs w:val="24"/>
+          <w:lang w:val="en-GB"/>
+        </w:rPr>
+        <w:t>South Africa</w:t>
+      </w:r>
+      <w:r>
+        <w:rPr>
+          <w:rFonts w:ascii="Calibri" w:hAnsi="Calibri" w:eastAsia="Calibri" w:cs="Calibri"/>
+          <w:noProof w:val="0"/>
+          <w:sz w:val="24"/>
+          <w:szCs w:val="24"/>
+          <w:lang w:val="en-GB"/>
+        </w:rPr>
+        <w:t xml:space="preserve"> and </w:t>
+      </w:r>
+      <w:r>
+        <w:rPr>
+          <w:rFonts w:ascii="Calibri" w:hAnsi="Calibri" w:eastAsia="Calibri" w:cs="Calibri"/>
+          <w:i w:val="1"/>
+          <w:iCs w:val="1"/>
+          <w:noProof w:val="0"/>
+          <w:sz w:val="24"/>
+          <w:szCs w:val="24"/>
+          <w:lang w:val="en-GB"/>
+        </w:rPr>
+        <w:t>Kazakhstan</w:t>
+      </w:r>
+      <w:r>
+        <w:rPr>
+          <w:rFonts w:ascii="Calibri" w:hAnsi="Calibri" w:eastAsia="Calibri" w:cs="Calibri"/>
+          <w:noProof w:val="0"/>
+          <w:sz w:val="24"/>
+          <w:szCs w:val="24"/>
+          <w:lang w:val="en-GB"/>
+        </w:rPr>
+        <w:t xml:space="preserve"> grouped together (Cluster 2), </w:t>
+      </w:r>
+      <w:r>
+        <w:rPr>
+          <w:rFonts w:ascii="Calibri" w:hAnsi="Calibri" w:eastAsia="Calibri" w:cs="Calibri"/>
+          <w:noProof w:val="0"/>
+          <w:sz w:val="24"/>
+          <w:szCs w:val="24"/>
+          <w:lang w:val="en-GB"/>
+        </w:rPr>
+        <w:t>possibly due</w:t>
+      </w:r>
+      <w:r>
+        <w:rPr>
+          <w:rFonts w:ascii="Calibri" w:hAnsi="Calibri" w:eastAsia="Calibri" w:cs="Calibri"/>
+          <w:noProof w:val="0"/>
+          <w:sz w:val="24"/>
+          <w:szCs w:val="24"/>
+          <w:lang w:val="en-GB"/>
+        </w:rPr>
+        <w:t xml:space="preserve"> to industrial similarities or emissions intensities.</w:t>
+      </w:r>
+    </w:p>
+    <w:p>
+      <w:pPr>
+        <w:pStyle w:val="Normal"/>
+      </w:pPr>
+      <w:r>
+        <w:rPr>
+          <w:rFonts w:ascii="Calibri" w:hAnsi="Calibri" w:eastAsia="Calibri" w:cs="Calibri"/>
+          <w:b w:val="1"/>
+          <w:bCs w:val="1"/>
+          <w:noProof w:val="0"/>
+          <w:sz w:val="24"/>
+          <w:szCs w:val="24"/>
+          <w:lang w:val="en-GB"/>
+        </w:rPr>
+        <w:t>Geographic Cluster Mapping</w:t>
+      </w:r>
+      <w:r>
+        <w:rPr>
+          <w:rFonts w:ascii="Calibri" w:hAnsi="Calibri" w:eastAsia="Calibri" w:cs="Calibri"/>
+          <w:noProof w:val="0"/>
+          <w:sz w:val="24"/>
+          <w:szCs w:val="24"/>
+          <w:lang w:val="en-GB"/>
+        </w:rPr>
+        <w:t xml:space="preserve">: The map reflected a mix of regional clustering and outlier </w:t>
+      </w:r>
+      <w:r>
+        <w:rPr>
+          <w:rFonts w:ascii="Calibri" w:hAnsi="Calibri" w:eastAsia="Calibri" w:cs="Calibri"/>
+          <w:noProof w:val="0"/>
+          <w:sz w:val="24"/>
+          <w:szCs w:val="24"/>
+          <w:lang w:val="en-GB"/>
+        </w:rPr>
+        <w:t>behavior</w:t>
+      </w:r>
+      <w:r>
+        <w:rPr>
+          <w:rFonts w:ascii="Calibri" w:hAnsi="Calibri" w:eastAsia="Calibri" w:cs="Calibri"/>
+          <w:noProof w:val="0"/>
+          <w:sz w:val="24"/>
+          <w:szCs w:val="24"/>
+          <w:lang w:val="en-GB"/>
+        </w:rPr>
+        <w:t xml:space="preserve">. </w:t>
+      </w:r>
+      <w:r>
+        <w:rPr>
+          <w:rFonts w:ascii="Calibri" w:hAnsi="Calibri" w:eastAsia="Calibri" w:cs="Calibri"/>
+          <w:i w:val="1"/>
+          <w:iCs w:val="1"/>
+          <w:noProof w:val="0"/>
+          <w:sz w:val="24"/>
+          <w:szCs w:val="24"/>
+          <w:lang w:val="en-GB"/>
+        </w:rPr>
+        <w:t>South American countries</w:t>
+      </w:r>
+      <w:r>
+        <w:rPr>
+          <w:rFonts w:ascii="Calibri" w:hAnsi="Calibri" w:eastAsia="Calibri" w:cs="Calibri"/>
+          <w:noProof w:val="0"/>
+          <w:sz w:val="24"/>
+          <w:szCs w:val="24"/>
+          <w:lang w:val="en-GB"/>
+        </w:rPr>
+        <w:t xml:space="preserve"> </w:t>
+      </w:r>
+      <w:r>
+        <w:rPr>
+          <w:rFonts w:ascii="Calibri" w:hAnsi="Calibri" w:eastAsia="Calibri" w:cs="Calibri"/>
+          <w:noProof w:val="0"/>
+          <w:sz w:val="24"/>
+          <w:szCs w:val="24"/>
+          <w:lang w:val="en-GB"/>
+        </w:rPr>
+        <w:t>largely fell</w:t>
+      </w:r>
+      <w:r>
+        <w:rPr>
+          <w:rFonts w:ascii="Calibri" w:hAnsi="Calibri" w:eastAsia="Calibri" w:cs="Calibri"/>
+          <w:noProof w:val="0"/>
+          <w:sz w:val="24"/>
+          <w:szCs w:val="24"/>
+          <w:lang w:val="en-GB"/>
+        </w:rPr>
+        <w:t xml:space="preserve"> into </w:t>
+      </w:r>
+      <w:r>
+        <w:rPr>
+          <w:rFonts w:ascii="Calibri" w:hAnsi="Calibri" w:eastAsia="Calibri" w:cs="Calibri"/>
+          <w:b w:val="1"/>
+          <w:bCs w:val="1"/>
+          <w:noProof w:val="0"/>
+          <w:sz w:val="24"/>
+          <w:szCs w:val="24"/>
+          <w:lang w:val="en-GB"/>
+        </w:rPr>
+        <w:t>Cluster 0</w:t>
+      </w:r>
+      <w:r>
+        <w:rPr>
+          <w:rFonts w:ascii="Calibri" w:hAnsi="Calibri" w:eastAsia="Calibri" w:cs="Calibri"/>
+          <w:noProof w:val="0"/>
+          <w:sz w:val="24"/>
+          <w:szCs w:val="24"/>
+          <w:lang w:val="en-GB"/>
+        </w:rPr>
+        <w:t xml:space="preserve">, while </w:t>
+      </w:r>
+      <w:r>
+        <w:rPr>
+          <w:rFonts w:ascii="Calibri" w:hAnsi="Calibri" w:eastAsia="Calibri" w:cs="Calibri"/>
+          <w:i w:val="1"/>
+          <w:iCs w:val="1"/>
+          <w:noProof w:val="0"/>
+          <w:sz w:val="24"/>
+          <w:szCs w:val="24"/>
+          <w:lang w:val="en-GB"/>
+        </w:rPr>
+        <w:t>South Africa</w:t>
+      </w:r>
+      <w:r>
+        <w:rPr>
+          <w:rFonts w:ascii="Calibri" w:hAnsi="Calibri" w:eastAsia="Calibri" w:cs="Calibri"/>
+          <w:noProof w:val="0"/>
+          <w:sz w:val="24"/>
+          <w:szCs w:val="24"/>
+          <w:lang w:val="en-GB"/>
+        </w:rPr>
+        <w:t xml:space="preserve"> and </w:t>
+      </w:r>
+      <w:r>
+        <w:rPr>
+          <w:rFonts w:ascii="Calibri" w:hAnsi="Calibri" w:eastAsia="Calibri" w:cs="Calibri"/>
+          <w:i w:val="1"/>
+          <w:iCs w:val="1"/>
+          <w:noProof w:val="0"/>
+          <w:sz w:val="24"/>
+          <w:szCs w:val="24"/>
+          <w:lang w:val="en-GB"/>
+        </w:rPr>
+        <w:t>Kazakhstan</w:t>
+      </w:r>
+      <w:r>
+        <w:rPr>
+          <w:rFonts w:ascii="Calibri" w:hAnsi="Calibri" w:eastAsia="Calibri" w:cs="Calibri"/>
+          <w:noProof w:val="0"/>
+          <w:sz w:val="24"/>
+          <w:szCs w:val="24"/>
+          <w:lang w:val="en-GB"/>
+        </w:rPr>
+        <w:t xml:space="preserve"> clustered together in </w:t>
+      </w:r>
+      <w:r>
+        <w:rPr>
+          <w:rFonts w:ascii="Calibri" w:hAnsi="Calibri" w:eastAsia="Calibri" w:cs="Calibri"/>
+          <w:b w:val="1"/>
+          <w:bCs w:val="1"/>
+          <w:noProof w:val="0"/>
+          <w:sz w:val="24"/>
+          <w:szCs w:val="24"/>
+          <w:lang w:val="en-GB"/>
+        </w:rPr>
+        <w:t>Cluster 2</w:t>
+      </w:r>
+      <w:r>
+        <w:rPr>
+          <w:rFonts w:ascii="Calibri" w:hAnsi="Calibri" w:eastAsia="Calibri" w:cs="Calibri"/>
+          <w:noProof w:val="0"/>
+          <w:sz w:val="24"/>
+          <w:szCs w:val="24"/>
+          <w:lang w:val="en-GB"/>
+        </w:rPr>
+        <w:t>, reflecting potential alignment in energy-intense industrial sectors.</w:t>
+      </w:r>
+    </w:p>
+    <w:p>
+      <w:pPr>
+        <w:spacing w:before="240" w:beforeAutospacing="off" w:after="240" w:afterAutospacing="off"/>
+      </w:pPr>
+      <w:r>
+        <w:rPr>
+          <w:rFonts w:ascii="Calibri" w:hAnsi="Calibri" w:eastAsia="Calibri" w:cs="Calibri"/>
+          <w:b w:val="1"/>
+          <w:bCs w:val="1"/>
+          <w:noProof w:val="0"/>
+          <w:sz w:val="24"/>
+          <w:szCs w:val="24"/>
+          <w:lang w:val="en-GB"/>
+        </w:rPr>
+        <w:t>Temporal Profiles</w:t>
+      </w:r>
+      <w:r>
+        <w:rPr>
+          <w:rFonts w:ascii="Calibri" w:hAnsi="Calibri" w:eastAsia="Calibri" w:cs="Calibri"/>
+          <w:noProof w:val="0"/>
+          <w:sz w:val="24"/>
+          <w:szCs w:val="24"/>
+          <w:lang w:val="en-GB"/>
+        </w:rPr>
+        <w:t xml:space="preserve">: Cluster 0, maintaining the </w:t>
+      </w:r>
+      <w:r>
+        <w:rPr>
+          <w:rFonts w:ascii="Calibri" w:hAnsi="Calibri" w:eastAsia="Calibri" w:cs="Calibri"/>
+          <w:b w:val="1"/>
+          <w:bCs w:val="1"/>
+          <w:noProof w:val="0"/>
+          <w:sz w:val="24"/>
+          <w:szCs w:val="24"/>
+          <w:lang w:val="en-GB"/>
+        </w:rPr>
+        <w:t>highest normalized scores throughout</w:t>
+      </w:r>
+      <w:r>
+        <w:rPr>
+          <w:rFonts w:ascii="Calibri" w:hAnsi="Calibri" w:eastAsia="Calibri" w:cs="Calibri"/>
+          <w:noProof w:val="0"/>
+          <w:sz w:val="24"/>
+          <w:szCs w:val="24"/>
+          <w:lang w:val="en-GB"/>
+        </w:rPr>
+        <w:t>, indicates stable leaders in key development indicators. Cluster 1, while initially close to Cluster 0, declined steadily after 2000. Cluster 3 showed a late rise in the 2010s, suggesting policy or technological shifts. Cluster 2, although present, maintained the lowest values, likely due to specific energy or emissions inefficiencies.</w:t>
+      </w:r>
+    </w:p>
+    <w:p>
+      <w:pPr>
+        <w:spacing w:before="240" w:beforeAutospacing="off" w:after="240" w:afterAutospacing="off"/>
+        <w:rPr>
+          <w:rFonts w:ascii="Calibri" w:hAnsi="Calibri" w:eastAsia="Calibri" w:cs="Calibri"/>
+          <w:noProof w:val="0"/>
+          <w:sz w:val="24"/>
+          <w:szCs w:val="24"/>
+          <w:lang w:val="en-GB"/>
+        </w:rPr>
+      </w:pPr>
     </w:p>
     <w:p>
       <w:pPr>

</xml_diff>